<commit_message>
Viết bổ sung mục 1.1.1.2, 1.1.2.1, 1.1.2.2 bằng 18 tài liệu đã xác minh
- 1.1.1.2: luận án Phạm Minh Huyền (2024) cho hướng 1; Trần Văn Hải (2021),
  Hứa Thị Hồng (2023) cho hướng 2, bổ sung góc nhìn năng lực và phối hợp
  của bộ máy thực thi; chỉnh đoạn đánh giá hướng 2.
- 1.1.2.1: bổ sung nguồn đo lường, tài sản vô hình, vai trò Nhà nước ở nước
  đang phát triển; thêm hướng 4 về quan hệ giữa bảo hộ quyền SHTT và kinh
  tế số; cập nhật đoạn đánh giá chung.
- 1.1.2.2: bổ sung luận án Trần Thị Lan (2025), bài đo lường, các bài về thể
  chế, QLNN và tiêu chí đánh giá QLNN trong kinh tế số, chính sách SHTT.
- Cập nhật Bảng 1.1, refs.py (113 tài liệu được trích dẫn), ghi chú hoàn thiện.

Co-Authored-By: Claude Opus 5.5 <noreply@anthropic.com>
Claude-Session: https://claude.ai/code/session_01HQY2onvkZLrFqUXems6qEk
</commit_message>
<xml_diff>
--- a/ChuyenDe_TongQuan_FINAL.docx
+++ b/ChuyenDe_TongQuan_FINAL.docx
@@ -917,7 +917,7 @@
           <w:color w:val="000000"/>
           <w:sz w:val="26"/>
         </w:rPr>
-        <w:t>Trọng tâm chính sách về SHTT ở Việt Nam đang thay đổi rõ nét theo hướng này. Nghị quyết số 57-NQ/TW ngày 22/12/2024 của Bộ Chính trị về đột phá phát triển khoa học, công nghệ, đổi mới sáng tạo và chuyển đổi số quốc gia xác định đây là động lực chính để phát triển lực lượng sản xuất hiện đại [1]. Luật Khoa học, công nghệ và đổi mới sáng tạo số 93/2025/QH15 mở rộng quyền sở hữu và quyền tự chủ của tổ chức chủ trì đối với kết quả nghiên cứu, tạo điều kiện cho thương mại hóa [25]. Luật sửa đổi, bổ sung một số điều của Luật Sở hữu trí tuệ số 131/2025/QH15, có hiệu lực từ ngày 01/4/2026, lần đầu tiên bổ sung một điều luật riêng (Điều 8a) về quản lý, khai thác quyền SHTT, theo đó tài sản trí tuệ có thể được định giá, giao dịch, ghi nhận trong báo cáo tài chính, sử dụng để góp vốn và làm tài sản bảo đảm [26]. Kết luận số 51-KL/TW ngày 17/6/2026 của Bộ Chính trị về đẩy mạnh công tác sở hữu trí tuệ phục vụ phát triển kinh tế - xã hội trong tình hình mới yêu cầu hoàn thiện cơ chế định giá quyền SHTT, xây dựng thị trường công nghệ hiện đại, đẩy mạnh khai thác quyền SHTT như một loại tài sản trong huy động vốn, đầu tư, góp vốn, đồng thời chuyển mạnh từ tư duy quản lý hành chính sang kiến tạo hệ sinh thái SHTT [2]. Cụ thể hóa các yêu cầu đó, Quyết định số 1624/QĐ-TTg ngày 21/8/2026 của Thủ tướng Chính phủ sửa đổi, bổ sung Chiến lược sở hữu trí tuệ đến năm 2030 đã bổ sung mục tiêu thúc đẩy giao dịch quyền SHTT trên thị trường, trong đó có nhiệm vụ thí điểm hỗ trợ xác định giá trị của ít nhất 100 quyền SHTT của viện nghiên cứu, cơ sở giáo dục đại học và doanh nghiệp khởi nghiệp sáng tạo [33]. Cùng với Luật Chuyển đổi số số 148/2025/QH15 [27], các văn bản trên cho thấy khai thác quyền SHTT trong môi trường số đã trở thành một nội dung trọng tâm của quản lý nhà nước (QLNN) về SHTT.</w:t>
+        <w:t>Trọng tâm chính sách về SHTT ở Việt Nam đang thay đổi rõ nét theo hướng này. Nghị quyết số 57-NQ/TW ngày 22/12/2024 của Bộ Chính trị về đột phá phát triển khoa học, công nghệ, đổi mới sáng tạo và chuyển đổi số quốc gia xác định đây là động lực chính để phát triển lực lượng sản xuất hiện đại [1]. Luật Khoa học, công nghệ và đổi mới sáng tạo số 93/2025/QH15 mở rộng quyền sở hữu và quyền tự chủ của tổ chức chủ trì đối với kết quả nghiên cứu, tạo điều kiện cho thương mại hóa [31]. Luật sửa đổi, bổ sung một số điều của Luật Sở hữu trí tuệ số 131/2025/QH15, có hiệu lực từ ngày 01/4/2026, lần đầu tiên bổ sung một điều luật riêng (Điều 8a) về quản lý, khai thác quyền SHTT, theo đó tài sản trí tuệ có thể được định giá, giao dịch, ghi nhận trong báo cáo tài chính, sử dụng để góp vốn và làm tài sản bảo đảm [32]. Kết luận số 51-KL/TW ngày 17/6/2026 của Bộ Chính trị về đẩy mạnh công tác sở hữu trí tuệ phục vụ phát triển kinh tế - xã hội trong tình hình mới yêu cầu hoàn thiện cơ chế định giá quyền SHTT, xây dựng thị trường công nghệ hiện đại, đẩy mạnh khai thác quyền SHTT như một loại tài sản trong huy động vốn, đầu tư, góp vốn, đồng thời chuyển mạnh từ tư duy quản lý hành chính sang kiến tạo hệ sinh thái SHTT [2]. Cụ thể hóa các yêu cầu đó, Quyết định số 1624/QĐ-TTg ngày 21/8/2026 của Thủ tướng Chính phủ sửa đổi, bổ sung Chiến lược sở hữu trí tuệ đến năm 2030 đã bổ sung mục tiêu thúc đẩy giao dịch quyền SHTT trên thị trường, trong đó có nhiệm vụ thí điểm hỗ trợ xác định giá trị của ít nhất 100 quyền SHTT của viện nghiên cứu, cơ sở giáo dục đại học và doanh nghiệp khởi nghiệp sáng tạo [41]. Cùng với Luật Chuyển đổi số số 148/2025/QH15 [33], các văn bản trên cho thấy khai thác quyền SHTT trong môi trường số đã trở thành một nội dung trọng tâm của quản lý nhà nước (QLNN) về SHTT.</w:t>
       </w:r>
     </w:p>
     <w:p>
@@ -935,7 +935,7 @@
           <w:color w:val="000000"/>
           <w:sz w:val="26"/>
         </w:rPr>
-        <w:t>Trên thực tế, khoảng cách giữa số lượng quyền SHTT được xác lập và mức độ khai thác vẫn là một hạn chế của hệ thống SHTT Việt Nam. Năm 2024, Cục Sở hữu trí tuệ cấp hơn 53.600 văn bằng bảo hộ, trong khi số đơn đăng ký hợp đồng chuyển quyền sử dụng đối tượng sở hữu công nghiệp chỉ là 153 đơn, và trong 1.758 đơn đăng ký hợp đồng chuyển nhượng chỉ có 98 đơn liên quan đến sáng chế [6]; do pháp luật không bắt buộc mọi hợp đồng li-xăng phải đăng ký, các số liệu này chưa phản ánh đầy đủ hoạt động khai thác, nhưng cho thấy dữ liệu về khâu khai thác còn thiếu so với khâu xác lập. Việc Kết luận số 51-KL/TW và Quyết định số 1624/QĐ-TTg đặt ra yêu cầu hoàn thiện cơ chế định giá, phát triển thị trường và thúc đẩy giao dịch quyền SHTT phản ánh rằng các điều kiện thể chế và thị trường cho hoạt động khai thác chưa được hình thành đầy đủ. Các quy định về định giá, hạch toán, góp vốn và thế chấp bằng quyền SHTT đang trong quá trình được hướng dẫn chi tiết; thị trường quyền SHTT và mạng lưới dịch vụ trung gian (định giá, môi giới, tư vấn chuyển giao) còn mỏng; kết quả nghiên cứu hình thành từ ngân sách nhà nước chậm được thương mại hóa. Trên môi trường số, nguy cơ xâm phạm quyền với tính chất ẩn danh, xuyên biên giới làm giảm giá trị và động lực khai thác của chủ thể quyền; đồng thời, khi thời gian từ lúc công nghệ ra đời đến khi được ứng dụng ngày càng rút ngắn [94], độ trễ của thể chế và cơ chế giao dịch có thể làm mất cơ hội khai thác giá trị của chính các quyền đã được xác lập. Luận án sẽ làm rõ các hạn chế này bằng số liệu thống kê của cơ quan quản lý giai đoạn 2019-2025, kết quả khảo sát và ý kiến chuyên gia.</w:t>
+        <w:t>Trên thực tế, khoảng cách giữa số lượng quyền SHTT được xác lập và mức độ khai thác vẫn là một hạn chế của hệ thống SHTT Việt Nam. Năm 2024, Cục Sở hữu trí tuệ cấp hơn 53.600 văn bằng bảo hộ, trong khi số đơn đăng ký hợp đồng chuyển quyền sử dụng đối tượng sở hữu công nghiệp chỉ là 153 đơn, và trong 1.758 đơn đăng ký hợp đồng chuyển nhượng chỉ có 98 đơn liên quan đến sáng chế [6]; do pháp luật không bắt buộc mọi hợp đồng li-xăng phải đăng ký, các số liệu này chưa phản ánh đầy đủ hoạt động khai thác, nhưng cho thấy dữ liệu về khâu khai thác còn thiếu so với khâu xác lập. Việc Kết luận số 51-KL/TW và Quyết định số 1624/QĐ-TTg đặt ra yêu cầu hoàn thiện cơ chế định giá, phát triển thị trường và thúc đẩy giao dịch quyền SHTT phản ánh rằng các điều kiện thể chế và thị trường cho hoạt động khai thác chưa được hình thành đầy đủ. Các quy định về định giá, hạch toán, góp vốn và thế chấp bằng quyền SHTT đang trong quá trình được hướng dẫn chi tiết; thị trường quyền SHTT và mạng lưới dịch vụ trung gian (định giá, môi giới, tư vấn chuyển giao) còn mỏng; kết quả nghiên cứu hình thành từ ngân sách nhà nước chậm được thương mại hóa. Trên môi trường số, nguy cơ xâm phạm quyền với tính chất ẩn danh, xuyên biên giới làm giảm giá trị và động lực khai thác của chủ thể quyền; đồng thời, khi thời gian từ lúc công nghệ ra đời đến khi được ứng dụng ngày càng rút ngắn [110], độ trễ của thể chế và cơ chế giao dịch có thể làm mất cơ hội khai thác giá trị của chính các quyền đã được xác lập. Luận án sẽ làm rõ các hạn chế này bằng số liệu thống kê của cơ quan quản lý giai đoạn 2019-2025, kết quả khảo sát và ý kiến chuyên gia.</w:t>
       </w:r>
     </w:p>
     <w:p>
@@ -1454,7 +1454,7 @@
           <w:color w:val="000000"/>
           <w:sz w:val="26"/>
         </w:rPr>
-        <w:t xml:space="preserve">, Hughes (1988) vận dụng thuyết lao động và thuyết nhân cách để giải thích quyền của người sáng tạo đối với thành quả lao động trí óc của mình [61]. Việc chỉ dựa vào quyền tự nhiên chưa đủ để giải thích một hệ thống bảo hộ ngày càng phức tạp, vì vậy trong chương sách </w:t>
+        <w:t xml:space="preserve">, Hughes (1988) vận dụng thuyết lao động và thuyết nhân cách để giải thích quyền của người sáng tạo đối với thành quả lao động trí óc của mình [73]. Việc chỉ dựa vào quyền tự nhiên chưa đủ để giải thích một hệ thống bảo hộ ngày càng phức tạp, vì vậy trong chương sách </w:t>
       </w:r>
       <w:r>
         <w:rPr>
@@ -1474,7 +1474,7 @@
           <w:color w:val="000000"/>
           <w:sz w:val="26"/>
         </w:rPr>
-        <w:t xml:space="preserve">, Fisher (2001) hệ thống hóa bốn luồng lý thuyết cạnh tranh nhau gồm thuyết vị lợi, thuyết lao động, thuyết nhân cách và thuyết quy hoạch xã hội, đồng thời chỉ ra rằng mỗi luồng lý thuyết dẫn tới những gợi ý chính sách khác nhau về phạm vi và thời hạn bảo hộ [52]. Trong cuốn </w:t>
+        <w:t xml:space="preserve">, Fisher (2001) hệ thống hóa bốn luồng lý thuyết cạnh tranh nhau gồm thuyết vị lợi, thuyết lao động, thuyết nhân cách và thuyết quy hoạch xã hội, đồng thời chỉ ra rằng mỗi luồng lý thuyết dẫn tới những gợi ý chính sách khác nhau về phạm vi và thời hạn bảo hộ [64]. Trong cuốn </w:t>
       </w:r>
       <w:r>
         <w:rPr>
@@ -1494,7 +1494,7 @@
           <w:color w:val="000000"/>
           <w:sz w:val="26"/>
         </w:rPr>
-        <w:t xml:space="preserve">, Merges (2011) phát triển cách tiếp cận dựa trên các nguyên tắc tầm trung (không trùng lặp với lĩnh vực công, tương xứng, hiệu quả và phẩm giá) nhằm tạo nền tảng chung cho việc thiết kế các quy định cụ thể [73]. Ở góc độ tiếp cận chính sách, cuốn </w:t>
+        <w:t xml:space="preserve">, Merges (2011) phát triển cách tiếp cận dựa trên các nguyên tắc tầm trung (không trùng lặp với lĩnh vực công, tương xứng, hiệu quả và phẩm giá) nhằm tạo nền tảng chung cho việc thiết kế các quy định cụ thể [85]. Ở góc độ tiếp cận chính sách, cuốn </w:t>
       </w:r>
       <w:r>
         <w:rPr>
@@ -1514,7 +1514,7 @@
           <w:color w:val="000000"/>
           <w:sz w:val="26"/>
         </w:rPr>
-        <w:t xml:space="preserve"> của Sinnreich (2019) mô tả xu hướng mở rộng phạm vi bảo hộ trong hệ thống SHTT hiện đại và các hệ quả đối với lợi ích công cộng [86].</w:t>
+        <w:t xml:space="preserve"> của Sinnreich (2019) mô tả xu hướng mở rộng phạm vi bảo hộ trong hệ thống SHTT hiện đại và các hệ quả đối với lợi ích công cộng [99].</w:t>
       </w:r>
     </w:p>
     <w:p>
@@ -1588,7 +1588,7 @@
           <w:color w:val="000000"/>
           <w:sz w:val="26"/>
         </w:rPr>
-        <w:t xml:space="preserve"> của Helpman (1993) đặt nền móng lý thuyết khi chỉ ra rằng việc thắt chặt bảo hộ ở các nước đang phát triển không nhất thiết mang lại lợi ích cho chính các nước này [59]. Các nghiên cứu thực nghiệm tiếp theo cung cấp bằng chứng theo nhiều chiều: Gould và Gruben (1996) cho thấy bảo hộ quyền SHTT có tác động tích cực đến tăng trưởng, rõ hơn ở các nền kinh tế mở [57]; Thompson và Rushing (1996) cho thấy tác động của bảo hộ sáng chế đối với tăng trưởng chỉ xuất hiện khi nền kinh tế đạt tới một ngưỡng phát triển nhất định [89]; báo cáo của Mansfield (1994) cho thấy mức độ bảo hộ quyền SHTT ở nước tiếp nhận ảnh hưởng đến quyết định đầu tư và chuyển giao công nghệ của các doanh nghiệp Hoa Kỳ [70]. Ở cấp độ doanh nghiệp, bài báo </w:t>
+        <w:t xml:space="preserve"> của Helpman (1993) đặt nền móng lý thuyết khi chỉ ra rằng việc thắt chặt bảo hộ ở các nước đang phát triển không nhất thiết mang lại lợi ích cho chính các nước này [71]. Các nghiên cứu thực nghiệm tiếp theo cung cấp bằng chứng theo nhiều chiều: Gould và Gruben (1996) cho thấy bảo hộ quyền SHTT có tác động tích cực đến tăng trưởng, rõ hơn ở các nền kinh tế mở [69]; Thompson và Rushing (1996) cho thấy tác động của bảo hộ sáng chế đối với tăng trưởng chỉ xuất hiện khi nền kinh tế đạt tới một ngưỡng phát triển nhất định [102]; báo cáo của Mansfield (1994) cho thấy mức độ bảo hộ quyền SHTT ở nước tiếp nhận ảnh hưởng đến quyết định đầu tư và chuyển giao công nghệ của các doanh nghiệp Hoa Kỳ [82]. Ở cấp độ doanh nghiệp, bài báo </w:t>
       </w:r>
       <w:r>
         <w:rPr>
@@ -1608,7 +1608,7 @@
           <w:color w:val="000000"/>
           <w:sz w:val="26"/>
         </w:rPr>
-        <w:t xml:space="preserve"> của Branstetter, Fisman và Foley (2006) cho thấy sau các cải cách tăng cường bảo hộ, dòng chuyển giao công nghệ trong nội bộ các tập đoàn đa quốc gia Hoa Kỳ sang nước tiếp nhận gia tăng [42]; Yang và Maskus (2001) cho thấy bảo hộ mạnh hơn làm tăng quy mô các giao dịch li-xăng quốc tế [95].</w:t>
+        <w:t xml:space="preserve"> của Branstetter, Fisman và Foley (2006) cho thấy sau các cải cách tăng cường bảo hộ, dòng chuyển giao công nghệ trong nội bộ các tập đoàn đa quốc gia Hoa Kỳ sang nước tiếp nhận gia tăng [51]; Yang và Maskus (2001) cho thấy bảo hộ mạnh hơn làm tăng quy mô các giao dịch li-xăng quốc tế [111].</w:t>
       </w:r>
     </w:p>
     <w:p>
@@ -1646,7 +1646,7 @@
           <w:color w:val="000000"/>
           <w:sz w:val="26"/>
         </w:rPr>
-        <w:t xml:space="preserve">, Maskus (2000) cho thấy tác động của quyền SHTT phụ thuộc vào trình độ phát triển, năng lực hấp thụ công nghệ và cấu trúc thị trường của từng quốc gia [71]; công trình </w:t>
+        <w:t xml:space="preserve">, Maskus (2000) cho thấy tác động của quyền SHTT phụ thuộc vào trình độ phát triển, năng lực hấp thụ công nghệ và cấu trúc thị trường của từng quốc gia [83]; công trình </w:t>
       </w:r>
       <w:r>
         <w:rPr>
@@ -1666,7 +1666,7 @@
           <w:color w:val="000000"/>
           <w:sz w:val="26"/>
         </w:rPr>
-        <w:t xml:space="preserve"> do Fink và Maskus (2005) chủ biên tổng hợp các bằng chứng theo hướng này [51]. Chỉ số bảo hộ sáng chế quốc tế do Park (2008) xây dựng cho giai đoạn 1960-2005 tạo điều kiện cho các so sánh định lượng giữa các quốc gia [83]. Acemoglu và Akcigit (2012) cho thấy chính sách SHTT tối ưu cần phụ thuộc vào vị thế công nghệ của doanh nghiệp [39]; Williams (2013), khi phân tích quyền đối với dữ liệu gen người, cung cấp bằng chứng rằng quyền độc quyền có thể làm giảm hoạt động sáng tạo tiếp nối [92]. Phân tích tổng hợp (meta-analysis) của Neves và cộng sự (2021) kết luận rằng quyền SHTT có tác động tích cực tổng thể đến đổi mới sáng tạo và tăng trưởng, nhưng tác động này yếu hơn ở các nước đang phát triển [77].</w:t>
+        <w:t xml:space="preserve"> do Fink và Maskus (2005) chủ biên tổng hợp các bằng chứng theo hướng này [63]. Chỉ số bảo hộ sáng chế quốc tế do Park (2008) xây dựng cho giai đoạn 1960-2005 tạo điều kiện cho các so sánh định lượng giữa các quốc gia [96]. Acemoglu và Akcigit (2012) cho thấy chính sách SHTT tối ưu cần phụ thuộc vào vị thế công nghệ của doanh nghiệp [47]; Williams (2013), khi phân tích quyền đối với dữ liệu gen người, cung cấp bằng chứng rằng quyền độc quyền có thể làm giảm hoạt động sáng tạo tiếp nối [107]. Phân tích tổng hợp (meta-analysis) của Neves và cộng sự (2021) kết luận rằng quyền SHTT có tác động tích cực tổng thể đến đổi mới sáng tạo và tăng trưởng, nhưng tác động này yếu hơn ở các nước đang phát triển [89].</w:t>
       </w:r>
     </w:p>
     <w:p>
@@ -1760,7 +1760,7 @@
           <w:color w:val="000000"/>
           <w:sz w:val="26"/>
         </w:rPr>
-        <w:t xml:space="preserve"> do Nelson (1993) chủ biên xem quyền SHTT là một bộ phận của hệ thống đổi mới sáng tạo quốc gia, trong đó hiệu quả của hệ thống phụ thuộc vào sự tương tác giữa doanh nghiệp, viện nghiên cứu, trường đại học và Nhà nước [66], [76]. Trong cuốn </w:t>
+        <w:t xml:space="preserve"> do Nelson (1993) chủ biên xem quyền SHTT là một bộ phận của hệ thống đổi mới sáng tạo quốc gia, trong đó hiệu quả của hệ thống phụ thuộc vào sự tương tác giữa doanh nghiệp, viện nghiên cứu, trường đại học và Nhà nước [78], [88]. Trong cuốn </w:t>
       </w:r>
       <w:r>
         <w:rPr>
@@ -1780,7 +1780,7 @@
           <w:color w:val="000000"/>
           <w:sz w:val="26"/>
         </w:rPr>
-        <w:t xml:space="preserve">, Mazzucato (2013) lập luận rằng Nhà nước không chỉ khắc phục thất bại thị trường mà còn chủ động kiến tạo thị trường và chấp nhận rủi ro trong các lĩnh vực công nghệ mới [72]. Các nghiên cứu thực nghiệm gần đây củng cố vai trò kinh tế của quyền SHTT ở cấp độ doanh nghiệp: báo cáo chung của Cơ quan Sáng chế châu Âu (EPO) và Cơ quan Sở hữu trí tuệ Liên minh châu Âu (EUIPO) năm 2021 cho thấy các doanh nghiệp sở hữu quyền SHTT có doanh thu trên mỗi lao động cao hơn khoảng 20% so với doanh nghiệp không sở hữu, và lợi ích này thể hiện rõ ở các doanh nghiệp nhỏ và vừa [49]. Báo cáo </w:t>
+        <w:t xml:space="preserve">, Mazzucato (2013) lập luận rằng Nhà nước không chỉ khắc phục thất bại thị trường mà còn chủ động kiến tạo thị trường và chấp nhận rủi ro trong các lĩnh vực công nghệ mới [84]. Các nghiên cứu thực nghiệm gần đây củng cố vai trò kinh tế của quyền SHTT ở cấp độ doanh nghiệp: báo cáo chung của Cơ quan Sáng chế châu Âu (EPO) và Cơ quan Sở hữu trí tuệ Liên minh châu Âu (EUIPO) năm 2021 cho thấy các doanh nghiệp sở hữu quyền SHTT có doanh thu trên mỗi lao động cao hơn khoảng 20% so với doanh nghiệp không sở hữu, và lợi ích này thể hiện rõ ở các doanh nghiệp nhỏ và vừa [61]. Báo cáo </w:t>
       </w:r>
       <w:r>
         <w:rPr>
@@ -1800,7 +1800,7 @@
           <w:color w:val="000000"/>
           <w:sz w:val="26"/>
         </w:rPr>
-        <w:t xml:space="preserve"> của WIPO phân tích cách thức chính sách đổi mới sáng tạo có thể được thiết kế phù hợp với năng lực sẵn có của các nền kinh tế đang phát triển [93].</w:t>
+        <w:t xml:space="preserve"> của WIPO phân tích cách thức chính sách đổi mới sáng tạo có thể được thiết kế phù hợp với năng lực sẵn có của các nền kinh tế đang phát triển [108].</w:t>
       </w:r>
     </w:p>
     <w:p>
@@ -1925,7 +1925,27 @@
           <w:color w:val="000000"/>
           <w:sz w:val="26"/>
         </w:rPr>
-        <w:t xml:space="preserve"> của Lê Nết (2006) tiếp cận theo hướng luật học so sánh, làm rõ hệ thống khái niệm và đối chiếu pháp luật trong nước với các chuẩn mực quốc tế [19]. Đóng góp chủ yếu của hướng nghiên cứu này là chuẩn hóa hệ thống khái niệm pháp lý, tạo nền tảng nhận thức chung cho việc xây dựng và áp dụng pháp luật. Khác với dòng nghiên cứu quốc tế vốn tiếp cận quyền SHTT từ góc độ kinh tế học, các công trình nền tảng trong nước chủ yếu mô tả và diễn giải pháp luật thực định.</w:t>
+        <w:t xml:space="preserve"> của Lê Nết (2006) tiếp cận theo hướng luật học so sánh, làm rõ hệ thống khái niệm và đối chiếu pháp luật trong nước với các chuẩn mực quốc tế [24]. Đóng góp chủ yếu của hướng nghiên cứu này là chuẩn hóa hệ thống khái niệm pháp lý, tạo nền tảng nhận thức chung cho việc xây dựng và áp dụng pháp luật. Khác với dòng nghiên cứu quốc tế vốn tiếp cận quyền SHTT từ góc độ kinh tế học, các công trình nền tảng trong nước chủ yếu mô tả và diễn giải pháp luật thực định. Các công trình gần đây bắt đầu đi sâu hơn vào cơ sở biện minh và giới hạn của độc quyền. Luận án </w:t>
+      </w:r>
+      <w:r>
+        <w:rPr>
+          <w:rFonts w:ascii="Times New Roman" w:hAnsi="Times New Roman" w:eastAsia="Times New Roman" w:cs="Times New Roman"/>
+          <w:b w:val="0"/>
+          <w:i/>
+          <w:color w:val="000000"/>
+          <w:sz w:val="26"/>
+        </w:rPr>
+        <w:t>Giới hạn quyền tác giả, quyền liên quan - Những vấn đề lý luận và thực tiễn</w:t>
+      </w:r>
+      <w:r>
+        <w:rPr>
+          <w:rFonts w:ascii="Times New Roman" w:hAnsi="Times New Roman" w:eastAsia="Times New Roman" w:cs="Times New Roman"/>
+          <w:b w:val="0"/>
+          <w:i w:val="0"/>
+          <w:color w:val="000000"/>
+          <w:sz w:val="26"/>
+        </w:rPr>
+        <w:t xml:space="preserve"> của Phạm Minh Huyền (2024) xây dựng khái niệm giới hạn quyền tác giả, quyền liên quan với bốn đặc điểm về đối tượng, chủ thể bị giới hạn quyền, chủ thể được hưởng lợi và mục đích giới hạn, đồng thời phân tích cơ sở của việc giới hạn quyền từ quan điểm của Locke, Hegel, học thuyết cân bằng lợi ích, học thuyết hết quyền và học thuyết sử dụng hợp lý [14]. Công trình này cho thấy nghiên cứu trong nước đã tiếp cận vấn đề cơ sở biện minh của quyền mà dòng tài liệu quốc tế ở hướng thứ nhất của mục 1.1.1.1 đặt ra, song vẫn trong khuôn khổ khoa học pháp lý và gắn với một nhóm quyền cụ thể.</w:t>
       </w:r>
     </w:p>
     <w:p>
@@ -1961,7 +1981,47 @@
           <w:color w:val="000000"/>
           <w:sz w:val="26"/>
         </w:rPr>
-        <w:t>Đây là hướng nghiên cứu có số lượng công trình lớn nhất. Một số luận án tiến sĩ đi sâu vào cơ chế bảo hộ đối với từng đối tượng: Lê Thị Bích Thủy (2021) nghiên cứu bảo hộ sáng chế liên quan đến dược phẩm trong điều kiện hội nhập, làm rõ xung đột giữa độc quyền sáng chế và quyền tiếp cận thuốc [34]; Vũ Thị Phương Giang (2025) nghiên cứu bảo vệ quyền đối với nhãn hiệu theo pháp luật Việt Nam [9]. Một số công trình mở rộng sang môi trường số: luận án của Trần Thị Thanh Huyền (2021) phân tích quyền sở hữu công nghiệp đối với nhãn hiệu trong thương mại điện tử [11]; luận án của Hồ Thúy Ngọc (2025) nghiên cứu bảo hộ quyền SHTT đối với các sản phẩm tạo ra từ trí tuệ nhân tạo [20]. Hoàng Văn Thùy (2024) nhận diện các thách thức và biện pháp pháp lý bảo vệ quyền SHTT trong kinh tế số [31]. Lâm Xuân Hùng (2025) chỉ ra các điểm nghẽn của pháp luật SHTT hiện hành, gồm thiếu định nghĩa thống nhất về tài sản trí tuệ và tài sản số, bất cập trong cơ chế sở hữu, định giá và thương mại hóa tài sản hình thành từ ngân sách nhà nước, và khó khăn trong thực thi quyền trên môi trường số [12].</w:t>
+        <w:t xml:space="preserve">Đây là hướng nghiên cứu có số lượng công trình lớn nhất. Một số luận án tiến sĩ đi sâu vào cơ chế bảo hộ đối với từng đối tượng: Lê Thị Bích Thủy (2021) nghiên cứu bảo hộ sáng chế liên quan đến dược phẩm trong điều kiện hội nhập, làm rõ xung đột giữa độc quyền sáng chế và quyền tiếp cận thuốc [42]; Vũ Thị Phương Giang (2025) nghiên cứu bảo vệ quyền đối với nhãn hiệu theo pháp luật Việt Nam [9]. Ở khía cạnh thực thi, luận án </w:t>
+      </w:r>
+      <w:r>
+        <w:rPr>
+          <w:rFonts w:ascii="Times New Roman" w:hAnsi="Times New Roman" w:eastAsia="Times New Roman" w:cs="Times New Roman"/>
+          <w:b w:val="0"/>
+          <w:i/>
+          <w:color w:val="000000"/>
+          <w:sz w:val="26"/>
+        </w:rPr>
+        <w:t>Chính sách pháp luật hình sự Việt Nam đối với các tội xâm phạm quyền sở hữu trí tuệ</w:t>
+      </w:r>
+      <w:r>
+        <w:rPr>
+          <w:rFonts w:ascii="Times New Roman" w:hAnsi="Times New Roman" w:eastAsia="Times New Roman" w:cs="Times New Roman"/>
+          <w:b w:val="0"/>
+          <w:i w:val="0"/>
+          <w:color w:val="000000"/>
+          <w:sz w:val="26"/>
+        </w:rPr>
+        <w:t xml:space="preserve"> của Trần Văn Hải (2021) đánh giá quá trình thể hiện và thực hiện chính sách pháp luật hình sự đối với nhóm tội này qua các thời kỳ, chỉ ra rằng bên cạnh hạn chế của quy định pháp luật, năng lực chuyên môn, nghiệp vụ của chủ thể áp dụng là rào cản đối với việc thực hiện chính sách [12]. Luận án </w:t>
+      </w:r>
+      <w:r>
+        <w:rPr>
+          <w:rFonts w:ascii="Times New Roman" w:hAnsi="Times New Roman" w:eastAsia="Times New Roman" w:cs="Times New Roman"/>
+          <w:b w:val="0"/>
+          <w:i/>
+          <w:color w:val="000000"/>
+          <w:sz w:val="26"/>
+        </w:rPr>
+        <w:t>Bảo vệ quyền sở hữu trí tuệ tại biên giới thông qua kiểm soát hàng hoá giả mạo về sở hữu trí tuệ của Hải quan Việt Nam</w:t>
+      </w:r>
+      <w:r>
+        <w:rPr>
+          <w:rFonts w:ascii="Times New Roman" w:hAnsi="Times New Roman" w:eastAsia="Times New Roman" w:cs="Times New Roman"/>
+          <w:b w:val="0"/>
+          <w:i w:val="0"/>
+          <w:color w:val="000000"/>
+          <w:sz w:val="26"/>
+        </w:rPr>
+        <w:t xml:space="preserve"> của Hứa Thị Hồng (2023) xây dựng mô hình lý thuyết về hoạt động kiểm soát hàng hoá giả mạo của cơ quan hải quan và cho thấy số vụ việc do hải quan bắt giữ còn khiêm tốn, hoạt động phối hợp giữa hải quan với các cơ quan quản lý, cơ quan thực thi quyền SHTT và với chủ thể quyền chưa đạt kỳ vọng [13]. Hai công trình này bổ sung góc nhìn về năng lực và sự phối hợp của bộ máy thực thi, những vấn đề ít được đề cập trong các nghiên cứu thiên về quy phạm. Một số công trình mở rộng sang môi trường số: luận án của Trần Thị Thanh Huyền (2021) phân tích quyền sở hữu công nghiệp đối với nhãn hiệu trong thương mại điện tử [15]; luận án của Hồ Thúy Ngọc (2025) nghiên cứu bảo hộ quyền SHTT đối với các sản phẩm tạo ra từ trí tuệ nhân tạo [26]. Hoàng Văn Thùy (2024) nhận diện các thách thức và biện pháp pháp lý bảo vệ quyền SHTT trong kinh tế số [39]. Lâm Xuân Hùng (2025) chỉ ra các điểm nghẽn của pháp luật SHTT hiện hành, gồm thiếu định nghĩa thống nhất về tài sản trí tuệ và tài sản số, bất cập trong cơ chế sở hữu, định giá và thương mại hóa tài sản hình thành từ ngân sách nhà nước, và khó khăn trong thực thi quyền trên môi trường số [16].</w:t>
       </w:r>
     </w:p>
     <w:p>
@@ -1979,7 +2039,7 @@
           <w:color w:val="000000"/>
           <w:sz w:val="26"/>
         </w:rPr>
-        <w:t>Nhóm công trình này cung cấp nhiều luận cứ cho việc hoàn thiện pháp luật. Mặc dù vậy, mục tiêu của phần lớn các công trình dừng ở kiến nghị sửa đổi quy phạm; các phân tích về chi phí, hiệu quả kinh tế của cơ chế bảo hộ và vai trò của bộ máy quản lý còn ít được đề cập.</w:t>
+        <w:t>Nhóm công trình này cung cấp nhiều luận cứ cho việc hoàn thiện pháp luật. Mặc dù vậy, mục tiêu của phần lớn các công trình dừng ở kiến nghị sửa đổi quy phạm; các phân tích về chi phí, hiệu quả kinh tế của cơ chế bảo hộ còn ít; vai trò của bộ máy nhà nước mới được xem xét ở khâu thực thi quyền, chưa được xem xét ở khâu khai thác quyền.</w:t>
       </w:r>
     </w:p>
     <w:p>
@@ -2015,7 +2075,7 @@
           <w:color w:val="000000"/>
           <w:sz w:val="26"/>
         </w:rPr>
-        <w:t>Một số công trình bắt đầu tiếp cận quyền SHTT như một nguồn lực phát triển. Nguyễn Văn Kim và Nguyễn Thị Ngọc Anh (2015) phân tích vai trò của sáng chế đối với hoạt động nghiên cứu và tiềm lực khoa học, công nghệ, chỉ ra số lượng sáng chế của Việt Nam còn rất thấp so với các nước trong khu vực và đề xuất nhóm chính sách về chất lượng sáng chế, sử dụng thông tin sáng chế và hỗ trợ phát triển tài sản trí tuệ [14]. Ở cấp độ chính sách, Chiến lược sở hữu trí tuệ đến năm 2030 xác định SHTT là công cụ thúc đẩy đổi mới sáng tạo và phát triển kinh tế - xã hội [32]. Các nghiên cứu đánh giá thực hiện chính sách ở địa phương cho thấy kết quả nổi bật chủ yếu nằm ở hoạt động đăng ký, xác lập quyền; việc phát triển và khai thác tài sản trí tuệ sau bảo hộ còn là vấn đề cần được quan tâm hơn [37].</w:t>
+        <w:t>Một số công trình bắt đầu tiếp cận quyền SHTT như một nguồn lực phát triển. Nguyễn Văn Kim và Nguyễn Thị Ngọc Anh (2015) phân tích vai trò của sáng chế đối với hoạt động nghiên cứu và tiềm lực khoa học, công nghệ, chỉ ra số lượng sáng chế của Việt Nam còn rất thấp so với các nước trong khu vực và đề xuất nhóm chính sách về chất lượng sáng chế, sử dụng thông tin sáng chế và hỗ trợ phát triển tài sản trí tuệ [18]. Ở cấp độ chính sách, Chiến lược sở hữu trí tuệ đến năm 2030 xác định SHTT là công cụ thúc đẩy đổi mới sáng tạo và phát triển kinh tế - xã hội [40]. Các nghiên cứu đánh giá thực hiện chính sách ở địa phương cho thấy kết quả nổi bật chủ yếu nằm ở hoạt động đăng ký, xác lập quyền; việc phát triển và khai thác tài sản trí tuệ sau bảo hộ còn là vấn đề cần được quan tâm hơn [45].</w:t>
       </w:r>
     </w:p>
     <w:p>
@@ -2081,7 +2141,7 @@
           <w:color w:val="000000"/>
           <w:sz w:val="26"/>
         </w:rPr>
-        <w:t>Các công trình nước ngoài về kinh tế số có thể được hệ thống hóa thành ba hướng: khái niệm và đo lường kinh tế số; cơ chế kinh tế của công nghệ số và sự gia tăng vai trò của tài sản vô hình; phân phối giá trị và quyền kiểm soát trong nền kinh tế số.</w:t>
+        <w:t>Các công trình nước ngoài về kinh tế số có thể được hệ thống hóa thành bốn hướng: khái niệm và đo lường kinh tế số; cơ chế kinh tế của công nghệ số và sự gia tăng vai trò của tài sản vô hình; phân phối giá trị và quyền kiểm soát trong nền kinh tế số; quan hệ giữa bảo hộ quyền SHTT và phát triển kinh tế số.</w:t>
       </w:r>
     </w:p>
     <w:p>
@@ -2137,7 +2197,7 @@
           <w:color w:val="000000"/>
           <w:sz w:val="26"/>
         </w:rPr>
-        <w:t xml:space="preserve"> của Tapscott (1996), trong đó tác giả mô tả một nền kinh tế dựa trên mạng lưới và thông tin số hóa [87]. Cùng thời gian đó, cuốn </w:t>
+        <w:t xml:space="preserve"> của Tapscott (1996), trong đó tác giả mô tả một nền kinh tế dựa trên mạng lưới và thông tin số hóa [100]. Cùng thời gian đó, cuốn </w:t>
       </w:r>
       <w:r>
         <w:rPr>
@@ -2157,7 +2217,47 @@
           <w:color w:val="000000"/>
           <w:sz w:val="26"/>
         </w:rPr>
-        <w:t xml:space="preserve"> của Negroponte (1995) nhấn mạnh sự chuyển dịch từ xử lý vật chất sang xử lý dữ liệu số [75]. Khi kinh tế số lan rộng, yêu cầu phân định phạm vi trở nên cấp thiết. Bukht và Heeks (2017) đề xuất khung ba phạm vi gồm kinh tế số lõi, kinh tế số theo nghĩa hẹp và kinh tế số hóa theo nghĩa rộng, được nhiều nghiên cứu sau này sử dụng [45]. Các tổ chức quốc tế tiếp tục phát triển phương pháp đo lường: Quỹ Tiền tệ Quốc tế (IMF) phân tích những khó khăn khi đo lường kinh tế số trong hệ thống tài khoản quốc gia [62]; OECD đề xuất lộ trình xây dựng khung đo lường chung cho kinh tế số [81]. Các công trình này cung cấp cơ sở khái niệm cho luận án, nhưng chủ yếu phục vụ mục đích thống kê, chưa đề cập đến vị trí của quyền SHTT trong cấu trúc của nền kinh tế số.</w:t>
+        <w:t xml:space="preserve"> của Negroponte (1995) nhấn mạnh sự chuyển dịch từ xử lý vật chất sang xử lý dữ liệu số [87]. Khi kinh tế số lan rộng, yêu cầu phân định phạm vi và đo lường trở nên cấp thiết. Báo cáo </w:t>
+      </w:r>
+      <w:r>
+        <w:rPr>
+          <w:rFonts w:ascii="Times New Roman" w:hAnsi="Times New Roman" w:eastAsia="Times New Roman" w:cs="Times New Roman"/>
+          <w:b w:val="0"/>
+          <w:i/>
+          <w:color w:val="000000"/>
+          <w:sz w:val="26"/>
+        </w:rPr>
+        <w:t>Measuring the Digital Economy: A New Perspective</w:t>
+      </w:r>
+      <w:r>
+        <w:rPr>
+          <w:rFonts w:ascii="Times New Roman" w:hAnsi="Times New Roman" w:eastAsia="Times New Roman" w:cs="Times New Roman"/>
+          <w:b w:val="0"/>
+          <w:i w:val="0"/>
+          <w:color w:val="000000"/>
+          <w:sz w:val="26"/>
+        </w:rPr>
+        <w:t xml:space="preserve"> của OECD (2014) đối chiếu các chỉ báo hiện có với những vấn đề chính sách về kinh tế số, chỉ ra khoảng trống trong khung đo lường và đề xuất một chương trình đo lường quốc tế [93]. Bukht và Heeks (2017) đề xuất khung ba phạm vi gồm kinh tế số lõi, kinh tế số theo nghĩa hẹp và kinh tế số hóa theo nghĩa rộng, được nhiều nghiên cứu sau này sử dụng [54]. Trên cơ sở phân định phạm vi, các cơ quan thống kê bắt đầu đưa kinh tế số vào hệ thống tài khoản quốc gia. Tài liệu </w:t>
+      </w:r>
+      <w:r>
+        <w:rPr>
+          <w:rFonts w:ascii="Times New Roman" w:hAnsi="Times New Roman" w:eastAsia="Times New Roman" w:cs="Times New Roman"/>
+          <w:b w:val="0"/>
+          <w:i/>
+          <w:color w:val="000000"/>
+          <w:sz w:val="26"/>
+        </w:rPr>
+        <w:t>Defining and Measuring the Digital Economy</w:t>
+      </w:r>
+      <w:r>
+        <w:rPr>
+          <w:rFonts w:ascii="Times New Roman" w:hAnsi="Times New Roman" w:eastAsia="Times New Roman" w:cs="Times New Roman"/>
+          <w:b w:val="0"/>
+          <w:i w:val="0"/>
+          <w:color w:val="000000"/>
+          <w:sz w:val="26"/>
+        </w:rPr>
+        <w:t xml:space="preserve"> của Barefoot và cộng sự (2018) tại Cục Phân tích Kinh tế Hoa Kỳ xây dựng ước tính theo ba bước: xác định khái niệm kinh tế số, xác định các nhóm hàng hóa và dịch vụ số trong khung cung và sử dụng, ước tính đóng góp của kinh tế số vào GDP [50]. Quỹ Tiền tệ Quốc tế (IMF) phân tích những khó khăn khi đo lường kinh tế số trong hệ thống tài khoản quốc gia [74]; OECD đề xuất lộ trình xây dựng khung đo lường chung cho kinh tế số [94]. Các công trình này cung cấp cơ sở khái niệm cho luận án, nhưng chủ yếu phục vụ mục đích thống kê, chưa đề cập đến vị trí của quyền SHTT trong cấu trúc của nền kinh tế số.</w:t>
       </w:r>
     </w:p>
     <w:p>
@@ -2213,7 +2313,7 @@
           <w:color w:val="000000"/>
           <w:sz w:val="26"/>
         </w:rPr>
-        <w:t xml:space="preserve"> của Goldfarb và Tucker (2019) hệ thống hóa các cơ chế kinh tế cơ bản: công nghệ số làm giảm chi phí tìm kiếm, chi phí sao chép, chi phí vận chuyển, chi phí theo dõi và chi phí xác minh [56]. Chi phí sao chép gần như bằng không có hệ quả trực tiếp đối với quyền SHTT: sản phẩm trí tuệ số dễ được nhân bản và phân phối, qua đó vừa mở rộng cơ hội khai thác vừa làm tăng rủi ro bị xâm phạm. Trước đó, bài báo </w:t>
+        <w:t xml:space="preserve"> của Goldfarb và Tucker (2019) hệ thống hóa các cơ chế kinh tế cơ bản: công nghệ số làm giảm chi phí tìm kiếm, chi phí sao chép, chi phí vận chuyển, chi phí theo dõi và chi phí xác minh [68]. Chi phí sao chép gần như bằng không có hệ quả trực tiếp đối với quyền SHTT: sản phẩm trí tuệ số dễ được nhân bản và phân phối, qua đó vừa mở rộng cơ hội khai thác vừa làm tăng rủi ro bị xâm phạm. Trước đó, bài báo </w:t>
       </w:r>
       <w:r>
         <w:rPr>
@@ -2233,7 +2333,7 @@
           <w:color w:val="000000"/>
           <w:sz w:val="26"/>
         </w:rPr>
-        <w:t xml:space="preserve"> của Brynjolfsson (1993) đã chỉ ra rằng lợi ích năng suất của công nghệ thông tin chỉ xuất hiện khi doanh nghiệp đầu tư đồng bộ vào các yếu tố bổ trợ [43]. Phát triển hướng tiếp cận này, cuốn </w:t>
+        <w:t xml:space="preserve"> của Brynjolfsson (1993) đã chỉ ra rằng lợi ích năng suất của công nghệ thông tin chỉ xuất hiện khi doanh nghiệp đầu tư đồng bộ vào các yếu tố bổ trợ [52]. Phát triển hướng tiếp cận này, cuốn </w:t>
       </w:r>
       <w:r>
         <w:rPr>
@@ -2253,7 +2353,27 @@
           <w:color w:val="000000"/>
           <w:sz w:val="26"/>
         </w:rPr>
-        <w:t xml:space="preserve"> của Haskel và Westlake (2018) phân tích sự gia tăng tỷ trọng của đầu tư vào tài sản vô hình (phần mềm, dữ liệu, nghiên cứu và phát triển, thương hiệu, thiết kế) và các đặc điểm kinh tế riêng của loại tài sản này [58]. Bằng chứng thực nghiệm của Pan và cộng sự (2022) cho thấy kinh tế số thúc đẩy năng suất nhân tố tổng hợp thông qua đổi mới sáng tạo [82].</w:t>
+        <w:t xml:space="preserve"> của Haskel và Westlake (2018) phân tích sự gia tăng tỷ trọng của đầu tư vào tài sản vô hình (phần mềm, dữ liệu, nghiên cứu và phát triển, thương hiệu, thiết kế) và các đặc điểm kinh tế riêng của loại tài sản này [70]. Số liệu gần đây củng cố nhận định này: báo cáo </w:t>
+      </w:r>
+      <w:r>
+        <w:rPr>
+          <w:rFonts w:ascii="Times New Roman" w:hAnsi="Times New Roman" w:eastAsia="Times New Roman" w:cs="Times New Roman"/>
+          <w:b w:val="0"/>
+          <w:i/>
+          <w:color w:val="000000"/>
+          <w:sz w:val="26"/>
+        </w:rPr>
+        <w:t>World Intangible Investment Highlights</w:t>
+      </w:r>
+      <w:r>
+        <w:rPr>
+          <w:rFonts w:ascii="Times New Roman" w:hAnsi="Times New Roman" w:eastAsia="Times New Roman" w:cs="Times New Roman"/>
+          <w:b w:val="0"/>
+          <w:i w:val="0"/>
+          <w:color w:val="000000"/>
+          <w:sz w:val="26"/>
+        </w:rPr>
+        <w:t xml:space="preserve"> do WIPO và Luiss Business School công bố năm 2024 cho thấy đầu tư vào tài sản vô hình tăng nhanh gấp ba lần đầu tư vào tài sản hữu hình trong giai đoạn 2008-2023 [109]. Bằng chứng thực nghiệm của Pan và cộng sự (2022) cho thấy kinh tế số thúc đẩy năng suất nhân tố tổng hợp thông qua đổi mới sáng tạo [95].</w:t>
       </w:r>
     </w:p>
     <w:p>
@@ -2307,7 +2427,7 @@
           <w:color w:val="000000"/>
           <w:sz w:val="26"/>
         </w:rPr>
-        <w:t xml:space="preserve">Hướng nghiên cứu gần đây tập trung vào câu hỏi ai thu được giá trị do kinh tế số tạo ra. Báo cáo </w:t>
+        <w:t xml:space="preserve">Hướng nghiên cứu gần đây tập trung vào câu hỏi ai thu được giá trị do kinh tế số tạo ra. Báo cáo kỹ thuật </w:t>
       </w:r>
       <w:r>
         <w:rPr>
@@ -2317,6 +2437,26 @@
           <w:color w:val="000000"/>
           <w:sz w:val="26"/>
         </w:rPr>
+        <w:t>The 'New' Digital Economy and Development</w:t>
+      </w:r>
+      <w:r>
+        <w:rPr>
+          <w:rFonts w:ascii="Times New Roman" w:hAnsi="Times New Roman" w:eastAsia="Times New Roman" w:cs="Times New Roman"/>
+          <w:b w:val="0"/>
+          <w:i w:val="0"/>
+          <w:color w:val="000000"/>
+          <w:sz w:val="26"/>
+        </w:rPr>
+        <w:t xml:space="preserve"> của UNCTAD (2017) chỉ ra ba đặc điểm mới của kinh tế số là nguồn dữ liệu mới từ thiết bị di động và cảm biến, mô hình kinh doanh dựa trên nền tảng, sự phổ biến của trí tuệ nhân tạo và học máy; theo báo cáo, các đặc điểm này có thể mở rộng sự phân tách công việc sang cả những hoạt động ở đầu chuỗi giá trị toàn cầu như nghiên cứu và phát triển [105]. Báo cáo </w:t>
+      </w:r>
+      <w:r>
+        <w:rPr>
+          <w:rFonts w:ascii="Times New Roman" w:hAnsi="Times New Roman" w:eastAsia="Times New Roman" w:cs="Times New Roman"/>
+          <w:b w:val="0"/>
+          <w:i/>
+          <w:color w:val="000000"/>
+          <w:sz w:val="26"/>
+        </w:rPr>
         <w:t>Digital Economy Report 2019: Value Creation and Capture: Implications for Developing Countries</w:t>
       </w:r>
       <w:r>
@@ -2327,7 +2467,45 @@
           <w:color w:val="000000"/>
           <w:sz w:val="26"/>
         </w:rPr>
-        <w:t xml:space="preserve"> của UNCTAD cho thấy giá trị tạo ra từ dữ liệu và nền tảng số tập trung vào một số ít doanh nghiệp nền tảng lớn, đặt ra thách thức cho các nước đang phát triển trong việc giữ lại giá trị [91]. Nghiên cứu của Foster (2024) về quá trình mở rộng dịch vụ tiền di động M-Pesa cho thấy quyền SHTT đối với dịch vụ này thuộc về tập đoàn Vodafone và được cấp phép cho doanh nghiệp vận hành tại Kenya; việc kiểm soát quyền SHTT dẫn tới những điểm nghẽn đối với đổi mới sáng tạo tại địa phương và dòng chuyển giá trị từ nước đang phát triển sang nước phát triển [53]. Các công trình này cho thấy trong nền kinh tế số, quyền SHTT không chỉ là công cụ khuyến khích sáng tạo mà còn là công cụ phân bổ và kiểm soát giá trị; do đó, việc chủ thể trong nước có khai thác được quyền của mình hay không có ý nghĩa đối với lợi ích quốc gia.</w:t>
+        <w:t xml:space="preserve"> của UNCTAD cho thấy giá trị tạo ra từ dữ liệu và nền tảng số tập trung vào một số ít doanh nghiệp nền tảng lớn, đặt ra thách thức cho các nước đang phát triển trong việc giữ lại giá trị [106]. Nghiên cứu của Foster (2024) về quá trình mở rộng dịch vụ tiền di động M-Pesa cho thấy quyền SHTT đối với dịch vụ này thuộc về tập đoàn Vodafone và được cấp phép cho doanh nghiệp vận hành tại Kenya; việc kiểm soát quyền SHTT dẫn tới những điểm nghẽn đối với đổi mới sáng tạo tại địa phương và dòng chuyển giá trị từ nước đang phát triển sang nước phát triển [65]. Các công trình này cho thấy trong nền kinh tế số, quyền SHTT không chỉ là công cụ khuyến khích sáng tạo mà còn là công cụ phân bổ và kiểm soát giá trị; do đó, việc chủ thể trong nước có khai thác được quyền của mình hay không có ý nghĩa đối với lợi ích quốc gia. Từ góc độ chính sách, tài liệu </w:t>
+      </w:r>
+      <w:r>
+        <w:rPr>
+          <w:rFonts w:ascii="Times New Roman" w:hAnsi="Times New Roman" w:eastAsia="Times New Roman" w:cs="Times New Roman"/>
+          <w:b w:val="0"/>
+          <w:i/>
+          <w:color w:val="000000"/>
+          <w:sz w:val="26"/>
+        </w:rPr>
+        <w:t>Harnessing the digital economy for developing countries</w:t>
+      </w:r>
+      <w:r>
+        <w:rPr>
+          <w:rFonts w:ascii="Times New Roman" w:hAnsi="Times New Roman" w:eastAsia="Times New Roman" w:cs="Times New Roman"/>
+          <w:b w:val="0"/>
+          <w:i w:val="0"/>
+          <w:color w:val="000000"/>
+          <w:sz w:val="26"/>
+        </w:rPr>
+        <w:t xml:space="preserve"> của Dahlman, Mealy và Wermelinger (2016) tại Trung tâm Phát triển OECD lập luận rằng lợi ích của kinh tế số không tự đến; Chính phủ các nước đang phát triển cần hoạch định chiến lược để tối đa hóa tác động phát triển và bảo đảm lợi ích được phân phối đồng đều [57]. Lập luận này nhấn mạnh vai trò chủ động của Nhà nước, song được trình bày ở cấp độ chiến lược số nói chung, chưa đi vào lĩnh vực SHTT.</w:t>
+      </w:r>
+    </w:p>
+    <w:p>
+      <w:pPr>
+        <w:keepNext/>
+        <w:spacing w:before="80" w:after="0" w:line="360" w:lineRule="auto"/>
+        <w:ind w:firstLine="720"/>
+        <w:jc w:val="both"/>
+      </w:pPr>
+      <w:r>
+        <w:rPr>
+          <w:rFonts w:ascii="Times New Roman" w:hAnsi="Times New Roman" w:eastAsia="Times New Roman" w:cs="Times New Roman"/>
+          <w:b w:val="0"/>
+          <w:i/>
+          <w:color w:val="000000"/>
+          <w:sz w:val="26"/>
+        </w:rPr>
+        <w:t>Hướng thứ tư: quan hệ giữa bảo hộ quyền sở hữu trí tuệ và phát triển kinh tế số</w:t>
       </w:r>
     </w:p>
     <w:p>
@@ -2345,22 +2523,27 @@
           <w:color w:val="000000"/>
           <w:sz w:val="26"/>
         </w:rPr>
-        <w:t>Nhìn chung, các công trình nước ngoài đã xây dựng hệ thống khái niệm, phương pháp đo lường và nền tảng kinh tế học tương đối đầy đủ về kinh tế số. Giá trị kế thừa đối với luận án là nhận thức về vai trò trung tâm của tài sản vô hình và về quyền SHTT như một công cụ phân bổ giá trị. Hạn chế là các công trình chưa phân tích cụ thể vai trò của Nhà nước trong việc giúp chủ thể trong nước khai thác quyền SHTT trong môi trường số.</w:t>
-      </w:r>
-    </w:p>
-    <w:p>
-      <w:pPr>
-        <w:pStyle w:val="Heading4"/>
-      </w:pPr>
-      <w:r>
-        <w:rPr>
-          <w:rFonts w:ascii="Times New Roman" w:hAnsi="Times New Roman" w:eastAsia="Times New Roman" w:cs="Times New Roman"/>
-          <w:b/>
+        <w:t xml:space="preserve">Một số công trình gần đây, chủ yếu dựa trên dữ liệu của Trung Quốc, kiểm định trực tiếp tác động của bảo hộ quyền SHTT đối với kinh tế số. Sử dụng chỉ số kinh tế số cấp tỉnh do nhóm tác giả tự xây dựng, bài báo </w:t>
+      </w:r>
+      <w:r>
+        <w:rPr>
+          <w:rFonts w:ascii="Times New Roman" w:hAnsi="Times New Roman" w:eastAsia="Times New Roman" w:cs="Times New Roman"/>
+          <w:b w:val="0"/>
           <w:i/>
           <w:color w:val="000000"/>
           <w:sz w:val="26"/>
         </w:rPr>
-        <w:t>1.1.2.2. Các công trình nghiên cứu trong nước</w:t>
+        <w:t>Does intellectual property protection stimulate digital economy development?</w:t>
+      </w:r>
+      <w:r>
+        <w:rPr>
+          <w:rFonts w:ascii="Times New Roman" w:hAnsi="Times New Roman" w:eastAsia="Times New Roman" w:cs="Times New Roman"/>
+          <w:b w:val="0"/>
+          <w:i w:val="0"/>
+          <w:color w:val="000000"/>
+          <w:sz w:val="26"/>
+        </w:rPr>
+        <w:t xml:space="preserve"> của Chen và Wu (2022) cho thấy quan hệ giữa bảo hộ quyền SHTT và kinh tế số có dạng chữ U [55]. Ở cấp độ doanh nghiệp, Zheng, Li và Zhuang (2023) sử dụng phương pháp sai phân ba lần với sự kiện thành lập các tòa án SHTT cuối năm 2014 và cho thấy tăng cường bảo hộ tư pháp đối với quyền SHTT tác động tích cực đến đổi mới sáng tạo số, rõ hơn ở doanh nghiệp nhỏ [113]; Yuan và Li (2025) cho thấy chuyển đổi số là kênh trung gian khuếch đại tác động của bảo hộ quyền SHTT đến đổi mới sáng tạo, song tác động này yếu hơn ở các ngành công nghệ cao [112]. Đáng chú ý, Ding và Yang (2025) đưa quản trị số của chính quyền vào mô hình và cho thấy quản trị số vừa thúc đẩy chuyển đổi số của doanh nghiệp thông qua nâng cao tính minh bạch của chính quyền, vừa điều tiết tích cực quan hệ giữa bảo hộ quyền SHTT và chuyển đổi số [60].</w:t>
       </w:r>
     </w:p>
     <w:p>
@@ -2378,6 +2561,57 @@
           <w:color w:val="000000"/>
           <w:sz w:val="26"/>
         </w:rPr>
+        <w:t>Hướng nghiên cứu này bổ sung bằng chứng thực nghiệm cho cách nhìn có điều kiện về tác động của quyền SHTT đã nêu tại mục 1.1.1.1 và bước đầu đưa năng lực quản trị của chính quyền vào phân tích. Mặc dù vậy, biến số được đo lường là mức độ bảo hộ quyền, trong khi các điều kiện và hoạt động hỗ trợ khai thác quyền chưa được tách riêng; phạm vi bằng chứng cũng giới hạn ở bối cảnh Trung Quốc.</w:t>
+      </w:r>
+    </w:p>
+    <w:p>
+      <w:pPr>
+        <w:keepNext w:val="0"/>
+        <w:spacing w:before="0" w:after="0" w:line="360" w:lineRule="auto"/>
+        <w:ind w:firstLine="720"/>
+        <w:jc w:val="both"/>
+      </w:pPr>
+      <w:r>
+        <w:rPr>
+          <w:rFonts w:ascii="Times New Roman" w:hAnsi="Times New Roman" w:eastAsia="Times New Roman" w:cs="Times New Roman"/>
+          <w:b w:val="0"/>
+          <w:i w:val="0"/>
+          <w:color w:val="000000"/>
+          <w:sz w:val="26"/>
+        </w:rPr>
+        <w:t>Nhìn chung, các công trình nước ngoài đã xây dựng hệ thống khái niệm, phương pháp đo lường và nền tảng kinh tế học tương đối đầy đủ về kinh tế số, đồng thời bắt đầu kiểm định quan hệ giữa bảo hộ quyền SHTT với phát triển kinh tế số. Giá trị kế thừa đối với luận án là nhận thức về vai trò trung tâm của tài sản vô hình và về quyền SHTT như một công cụ phân bổ giá trị. Hạn chế là các công trình mới đo lường mức độ bảo hộ, chưa phân tích cụ thể vai trò của Nhà nước trong việc giúp chủ thể trong nước khai thác quyền SHTT trong môi trường số.</w:t>
+      </w:r>
+    </w:p>
+    <w:p>
+      <w:pPr>
+        <w:pStyle w:val="Heading4"/>
+      </w:pPr>
+      <w:r>
+        <w:rPr>
+          <w:rFonts w:ascii="Times New Roman" w:hAnsi="Times New Roman" w:eastAsia="Times New Roman" w:cs="Times New Roman"/>
+          <w:b/>
+          <w:i/>
+          <w:color w:val="000000"/>
+          <w:sz w:val="26"/>
+        </w:rPr>
+        <w:t>1.1.2.2. Các công trình nghiên cứu trong nước</w:t>
+      </w:r>
+    </w:p>
+    <w:p>
+      <w:pPr>
+        <w:keepNext w:val="0"/>
+        <w:spacing w:before="0" w:after="0" w:line="360" w:lineRule="auto"/>
+        <w:ind w:firstLine="720"/>
+        <w:jc w:val="both"/>
+      </w:pPr>
+      <w:r>
+        <w:rPr>
+          <w:rFonts w:ascii="Times New Roman" w:hAnsi="Times New Roman" w:eastAsia="Times New Roman" w:cs="Times New Roman"/>
+          <w:b w:val="0"/>
+          <w:i w:val="0"/>
+          <w:color w:val="000000"/>
+          <w:sz w:val="26"/>
+        </w:rPr>
         <w:t>Các công trình trong nước về kinh tế số phát triển mạnh từ năm 2019, gắn với các chủ trương về chuyển đổi số quốc gia, có thể hệ thống hóa thành ba hướng: khái niệm, thực trạng và đo lường kinh tế số; thể chế và QLNN đối với kinh tế số; tác động của kinh tế số đối với hệ thống SHTT.</w:t>
       </w:r>
     </w:p>
@@ -2434,7 +2668,27 @@
           <w:color w:val="000000"/>
           <w:sz w:val="26"/>
         </w:rPr>
-        <w:t xml:space="preserve"> do Cơ quan Nghiên cứu Khoa học và Công nghiệp Khối thịnh vượng chung Úc (CSIRO) thực hiện với sự hợp tác của Bộ Khoa học và Công nghệ là một trong những công trình có quy mô lớn, đề xuất khái niệm và các kịch bản phát triển kinh tế số của Việt Nam [3]. Hồ Thức Tài (2019) hệ thống hóa các quan niệm về kinh tế số và đề xuất khuyến nghị chính sách phát triển kinh tế số ở Việt Nam [28]. Vận dụng khung mô hình phát triển kinh tế số của Huawei và Arthur D. Little, Dang Thi Viet Duc (2022) xếp Việt Nam vào kiểu mô hình nhà máy công nghệ thông tin và truyền thông toàn cầu, tức là sản xuất và xuất khẩu khối lượng lớn sản phẩm công nghệ nhưng phần giá trị gia tăng giữ lại còn hạn chế [48]; nhận định này gợi ý rằng năng lực làm chủ và khai thác tài sản trí tuệ là điều kiện để nâng cao phần giá trị mà nền kinh tế giữ lại. Trần Nguyễn Mỹ Linh và cộng sự (2025) tổng hợp thực trạng, cơ hội và thách thức của phát triển kinh tế số [15]. Về đo lường, Bui Xuan Chung (2025) so sánh kinh nghiệm quốc tế và thực tiễn đo lường kinh tế số ở Việt Nam [44]; từ năm 2025, cơ quan thống kê đã chính thức công bố chỉ tiêu tỷ trọng giá trị tăng thêm của kinh tế số trong GDP và tổng sản phẩm trên địa bàn các tỉnh, thành phố [7].</w:t>
+        <w:t xml:space="preserve"> do Cơ quan Nghiên cứu Khoa học và Công nghiệp Khối thịnh vượng chung Úc (CSIRO) thực hiện với sự hợp tác của Bộ Khoa học và Công nghệ là một trong những công trình có quy mô lớn, đề xuất khái niệm và các kịch bản phát triển kinh tế số của Việt Nam [3]. Hồ Thức Tài (2019) hệ thống hóa các quan niệm về kinh tế số và đề xuất khuyến nghị chính sách phát triển kinh tế số ở Việt Nam [35]. Vận dụng khung mô hình phát triển kinh tế số của Huawei và Arthur D. Little, Dang Thi Viet Duc (2022) xếp Việt Nam vào kiểu mô hình nhà máy công nghệ thông tin và truyền thông toàn cầu, tức là sản xuất và xuất khẩu khối lượng lớn sản phẩm công nghệ nhưng phần giá trị gia tăng giữ lại còn hạn chế [59]; nhận định này gợi ý rằng năng lực làm chủ và khai thác tài sản trí tuệ là điều kiện để nâng cao phần giá trị mà nền kinh tế giữ lại. Trần Nguyễn Mỹ Linh và cộng sự (2025) tổng hợp thực trạng, cơ hội và thách thức của phát triển kinh tế số [20]. Bước sang lượng hóa, luận án </w:t>
+      </w:r>
+      <w:r>
+        <w:rPr>
+          <w:rFonts w:ascii="Times New Roman" w:hAnsi="Times New Roman" w:eastAsia="Times New Roman" w:cs="Times New Roman"/>
+          <w:b w:val="0"/>
+          <w:i/>
+          <w:color w:val="000000"/>
+          <w:sz w:val="26"/>
+        </w:rPr>
+        <w:t>Các yếu tố ảnh hưởng đến phát triển kinh tế số ở Việt Nam</w:t>
+      </w:r>
+      <w:r>
+        <w:rPr>
+          <w:rFonts w:ascii="Times New Roman" w:hAnsi="Times New Roman" w:eastAsia="Times New Roman" w:cs="Times New Roman"/>
+          <w:b w:val="0"/>
+          <w:i w:val="0"/>
+          <w:color w:val="000000"/>
+          <w:sz w:val="26"/>
+        </w:rPr>
+        <w:t xml:space="preserve"> của Trần Thị Lan (2025) tiếp cận phát triển kinh tế số qua hai nội dung sản xuất số và thị trường số; sử dụng dữ liệu bảng của 63 tỉnh, thành phố giai đoạn 2020-2023, tác giả cho thấy tỷ lệ lao động qua đào tạo, mức độ phổ cập Internet, thể chế số, FDI và an toàn thông tin nhìn chung có tác động tích cực, riêng tổng sản phẩm trên địa bàn bình quân đầu người có tác động ngược chiều [19]. Thể chế số được xác định là một yếu tố ảnh hưởng, song quyền SHTT chưa được đưa vào mô hình. Về đo lường, Nguyễn Phương Thảo (2024) so sánh phương pháp đo lường của OECD, Ngân hàng Phát triển châu Á và Cục Phân tích Kinh tế Hoa Kỳ, cho rằng một chỉ số đơn lẻ khó phản ánh đầy đủ mức độ phát triển của kinh tế số và đề xuất hướng xây dựng chỉ số đo lường tổng hợp cho Việt Nam [37]; Bui Xuan Chung (2025) so sánh kinh nghiệm quốc tế và thực tiễn đo lường kinh tế số ở Việt Nam [53]; từ năm 2025, cơ quan thống kê đã chính thức công bố chỉ tiêu tỷ trọng giá trị tăng thêm của kinh tế số trong GDP và tổng sản phẩm trên địa bàn các tỉnh, thành phố [7].</w:t>
       </w:r>
     </w:p>
     <w:p>
@@ -2470,7 +2724,45 @@
           <w:color w:val="000000"/>
           <w:sz w:val="26"/>
         </w:rPr>
-        <w:t>Một số công trình tiếp cận kinh tế số từ góc độ thể chế và quản lý. Nguyen Vinh Hung và Nguyen Duc Anh (2024) phân tích hạn chế của công tác quản lý kinh tế số ở Việt Nam, chỉ ra rằng sự phát triển nhanh của giao dịch trên nền tảng số làm gia tăng các vi phạm pháp luật liên quan đến SHTT và thuế, trong khi cơ quan quản lý còn thiếu kinh nghiệm điều chỉnh các hoạt động này; từ đó đề xuất xây dựng khung pháp luật toàn diện và có khả năng thích ứng [79]. Dựa trên các bộ chỉ số quốc tế về đổi mới sáng tạo và năng lực cạnh tranh, Nguyễn Chí Hải và Huỳnh Thị Ly Na (2021) đánh giá những điểm mạnh, hạn chế của hoạt động đổi mới sáng tạo trong bối cảnh kinh tế số, xem đổi mới sáng tạo là điều kiện tiên quyết cho sự phát triển của nền kinh tế số [10].</w:t>
+        <w:t>Một số công trình tiếp cận kinh tế số từ góc độ thể chế và quản lý. Truong Nam Trung (2020) cho rằng kinh tế số có những đặc điểm khác biệt đòi hỏi hoàn thiện thể chế, đồng thời nêu những bất cập như chênh lệch nghĩa vụ thuế giữa nhà cung cấp dịch vụ nước ngoài và doanh nghiệp trong nước cung cấp dịch vụ tương tự [104]. Dựa trên các bộ chỉ số quốc tế về đổi mới sáng tạo và năng lực cạnh tranh, Nguyễn Chí Hải và Huỳnh Thị Ly Na (2021) đánh giá những điểm mạnh, hạn chế của hoạt động đổi mới sáng tạo trong bối cảnh kinh tế số, xem đổi mới sáng tạo là điều kiện tiên quyết cho sự phát triển của nền kinh tế số [11]. Ngô Hoài Sơn và Nguyễn Lê Kim Kiều (2022) vận dụng lý thuyết về phương pháp QLNN về kinh tế, đề xuất các giải pháp theo ba nhóm phương pháp hành chính, kinh tế và tâm lý, giáo dục để thúc đẩy xây dựng nền kinh tế số [34]. Nguyen Vinh Hung và Nguyen Duc Anh (2024) phân tích hạn chế của công tác quản lý kinh tế số ở Việt Nam, chỉ ra rằng sự phát triển nhanh của giao dịch trên nền tảng số làm gia tăng các vi phạm pháp luật liên quan đến SHTT và thuế, trong khi cơ quan quản lý còn thiếu kinh nghiệm điều chỉnh các hoạt động này; từ đó đề xuất xây dựng khung pháp luật toàn diện và có khả năng thích ứng [91].</w:t>
+      </w:r>
+    </w:p>
+    <w:p>
+      <w:pPr>
+        <w:keepNext w:val="0"/>
+        <w:spacing w:before="0" w:after="0" w:line="360" w:lineRule="auto"/>
+        <w:ind w:firstLine="720"/>
+        <w:jc w:val="both"/>
+      </w:pPr>
+      <w:r>
+        <w:rPr>
+          <w:rFonts w:ascii="Times New Roman" w:hAnsi="Times New Roman" w:eastAsia="Times New Roman" w:cs="Times New Roman"/>
+          <w:b w:val="0"/>
+          <w:i w:val="0"/>
+          <w:color w:val="000000"/>
+          <w:sz w:val="26"/>
+        </w:rPr>
+        <w:t xml:space="preserve">Công trình gần nhất với vấn đề đánh giá QLNN là bài báo </w:t>
+      </w:r>
+      <w:r>
+        <w:rPr>
+          <w:rFonts w:ascii="Times New Roman" w:hAnsi="Times New Roman" w:eastAsia="Times New Roman" w:cs="Times New Roman"/>
+          <w:b w:val="0"/>
+          <w:i/>
+          <w:color w:val="000000"/>
+          <w:sz w:val="26"/>
+        </w:rPr>
+        <w:t>Đánh giá hiệu quả quản lý nhà nước trong nền kinh tế số</w:t>
+      </w:r>
+      <w:r>
+        <w:rPr>
+          <w:rFonts w:ascii="Times New Roman" w:hAnsi="Times New Roman" w:eastAsia="Times New Roman" w:cs="Times New Roman"/>
+          <w:b w:val="0"/>
+          <w:i w:val="0"/>
+          <w:color w:val="000000"/>
+          <w:sz w:val="26"/>
+        </w:rPr>
+        <w:t xml:space="preserve"> của Nguyễn Thị Hải Hà (2023). Tác giả chỉ ra rằng các bộ chỉ số hiện hành như chỉ số cải cách hành chính, chỉ số năng lực cạnh tranh cấp tỉnh, chỉ số hài lòng về dịch vụ hành chính công và chỉ số hiệu quả quản trị và hành chính công cấp tỉnh chưa bao quát QLNN đối với kinh tế số, từ đó vận dụng mô hình lăng kính hiệu suất (Performance Prism) để đề xuất bộ tiêu chí gồm bốn tiêu chí trụ cột và 30 tiêu chí thành phần; chính tác giả lưu ý bộ tiêu chí cần được thí điểm ở một mô hình kinh tế chia sẻ cụ thể trước khi áp dụng [10]. Nhóm công trình này cho thấy QLNN đối với kinh tế số đã trở thành đối tượng nghiên cứu, kể cả ở khía cạnh tiêu chí đánh giá; song các tiêu chí được đề xuất hướng tới kinh tế số nói chung, chưa đi vào từng lĩnh vực quản lý như SHTT.</w:t>
       </w:r>
     </w:p>
     <w:p>
@@ -2506,7 +2798,7 @@
           <w:color w:val="000000"/>
           <w:sz w:val="26"/>
         </w:rPr>
-        <w:t>Một số ít công trình trực tiếp phân tích mối quan hệ giữa kinh tế số và SHTT. Nguyễn Vĩnh Hưng và Phan Quốc Nguyên (2020) phân tích tác động của môi trường công nghệ và thương mại điện tử đến hệ thống pháp luật SHTT, chỉ ra những khó khăn mới trong bảo hộ và thực thi quyền [13]; Hoàng Văn Thùy (2024) và Lâm Xuân Hùng (2025) tiếp tục hướng phân tích này trong bối cảnh trí tuệ nhân tạo và tài sản số [12], [31].</w:t>
+        <w:t>Một số ít công trình trực tiếp phân tích mối quan hệ giữa kinh tế số và SHTT. Nguyễn Vĩnh Hưng và Phan Quốc Nguyên (2020) phân tích tác động của môi trường công nghệ và thương mại điện tử đến hệ thống pháp luật SHTT, chỉ ra những khó khăn mới trong bảo hộ và thực thi quyền [17]; Hoàng Văn Thùy (2024) và Lâm Xuân Hùng (2025) tiếp tục hướng phân tích này trong bối cảnh trí tuệ nhân tạo và tài sản số [16], [39]. Tiếp cận từ chính sách quản lý tài sản trí tuệ, Nguyễn Thị Tuyết Nga (2025) chỉ ra rằng dù Luật SHTT đã được sửa đổi năm 2022 và Việt Nam đã tham gia nhiều điều ước quốc tế, thủ tục đăng ký còn rườm rà, cơ chế định giá và khai thác tài sản trí tuệ chưa rõ ràng, việc xử lý vi phạm trong môi trường số còn bất cập [25]. Đây là một trong số ít công trình trong nước nêu trực tiếp vấn đề khai thác tài sản trí tuệ trong kinh tế số, song mới dừng ở mức nhận diện.</w:t>
       </w:r>
     </w:p>
     <w:p>
@@ -2524,7 +2816,7 @@
           <w:color w:val="000000"/>
           <w:sz w:val="26"/>
         </w:rPr>
-        <w:t>Nhìn chung, các công trình trong nước đã cụ thể hóa khái niệm kinh tế số vào bối cảnh Việt Nam, phản ánh thực trạng và đặt ra yêu cầu hoàn thiện thể chế. Hạn chế chung là phần lớn công trình mang tính tổng quan chính sách; các nghiên cứu về mối quan hệ giữa kinh tế số và SHTT chủ yếu tập trung vào bảo hộ và thực thi quyền, ít đề cập đến việc khai thác quyền SHTT trong môi trường số. Đây là cơ sở để tổng quan nhóm công trình thứ ba tại mục 1.1.3.</w:t>
+        <w:t>Nhìn chung, các công trình trong nước đã cụ thể hóa khái niệm kinh tế số vào bối cảnh Việt Nam, phản ánh thực trạng và đặt ra yêu cầu hoàn thiện thể chế. Hạn chế chung là phần lớn công trình mang tính tổng quan chính sách, chỉ một số ít công trình gần đây lượng hóa các yếu tố ảnh hưởng hoặc đề xuất tiêu chí đánh giá QLNN; các nghiên cứu về mối quan hệ giữa kinh tế số và SHTT chủ yếu tập trung vào bảo hộ và thực thi quyền, việc khai thác quyền SHTT trong môi trường số mới được nhận diện như một vấn đề, chưa được phân tích sâu. Đây là cơ sở để tổng quan nhóm công trình thứ ba tại mục 1.1.3.</w:t>
       </w:r>
     </w:p>
     <w:p>
@@ -2628,7 +2920,7 @@
           <w:color w:val="000000"/>
           <w:sz w:val="26"/>
         </w:rPr>
-        <w:t xml:space="preserve"> của Arrow (1962). Arrow chỉ ra rằng tri thức khó chiếm hữu và khó giao dịch: người mua chỉ đánh giá được giá trị của thông tin khi đã biết thông tin đó, nhưng khi đã biết thì không còn cần mua [41]. Nghịch lý thông tin này giải thích vì sao giao dịch tri thức có chi phí cao và vì sao quyền SHTT, bằng cách xác định rõ phạm vi quyền, có thể tạo điều kiện cho giao dịch. Phát triển lập luận này ở cấp độ doanh nghiệp, bài báo </w:t>
+        <w:t xml:space="preserve"> của Arrow (1962). Arrow chỉ ra rằng tri thức khó chiếm hữu và khó giao dịch: người mua chỉ đánh giá được giá trị của thông tin khi đã biết thông tin đó, nhưng khi đã biết thì không còn cần mua [49]. Nghịch lý thông tin này giải thích vì sao giao dịch tri thức có chi phí cao và vì sao quyền SHTT, bằng cách xác định rõ phạm vi quyền, có thể tạo điều kiện cho giao dịch. Phát triển lập luận này ở cấp độ doanh nghiệp, bài báo </w:t>
       </w:r>
       <w:r>
         <w:rPr>
@@ -2648,7 +2940,7 @@
           <w:color w:val="000000"/>
           <w:sz w:val="26"/>
         </w:rPr>
-        <w:t xml:space="preserve"> của Teece (1986) cho thấy người tạo ra đổi mới sáng tạo không phải lúc nào cũng thu được lợi ích từ đổi mới; kết quả phụ thuộc vào chế độ chiếm hữu (mức độ bảo hộ và bản chất của công nghệ) và khả năng kiểm soát các tài sản bổ trợ; khi chế độ chiếm hữu chặt chẽ, li-xăng trở thành phương thức khai thác khả thi [88].</w:t>
+        <w:t xml:space="preserve"> của Teece (1986) cho thấy người tạo ra đổi mới sáng tạo không phải lúc nào cũng thu được lợi ích từ đổi mới; kết quả phụ thuộc vào chế độ chiếm hữu (mức độ bảo hộ và bản chất của công nghệ) và khả năng kiểm soát các tài sản bổ trợ; khi chế độ chiếm hữu chặt chẽ, li-xăng trở thành phương thức khai thác khả thi [101].</w:t>
       </w:r>
     </w:p>
     <w:p>
@@ -2686,7 +2978,7 @@
           <w:color w:val="000000"/>
           <w:sz w:val="26"/>
         </w:rPr>
-        <w:t xml:space="preserve"> của Arora, Fosfuri và Gambardella (2001) phân tích sự hình thành của thị trường công nghệ, trong đó công nghệ được mua bán, li-xăng tách rời khỏi sản phẩm; quyền sáng chế rõ ràng làm giảm chi phí giao dịch và mở rộng lựa chọn chiến lược của doanh nghiệp [40]. Gans và Stern (2003) cho thấy lựa chọn giữa việc hợp tác (li-xăng cho doanh nghiệp đang hoạt động) và cạnh tranh trực tiếp trên thị trường sản phẩm của doanh nghiệp khởi nghiệp công nghệ phụ thuộc vào mức độ bảo hộ quyền SHTT và việc ai nắm giữ tài sản bổ trợ [54]. Nghiên cứu thực nghiệm của Gans, Hsu và Stern (2008) cung cấp bằng chứng rằng khả năng ký kết hợp đồng li-xăng tăng lên rõ rệt sau khi sáng chế được cấp bằng, tức là sự không chắc chắn về quyền làm chậm giao dịch trên thị trường ý tưởng [55].</w:t>
+        <w:t xml:space="preserve"> của Arora, Fosfuri và Gambardella (2001) phân tích sự hình thành của thị trường công nghệ, trong đó công nghệ được mua bán, li-xăng tách rời khỏi sản phẩm; quyền sáng chế rõ ràng làm giảm chi phí giao dịch và mở rộng lựa chọn chiến lược của doanh nghiệp [48]. Gans và Stern (2003) cho thấy lựa chọn giữa việc hợp tác (li-xăng cho doanh nghiệp đang hoạt động) và cạnh tranh trực tiếp trên thị trường sản phẩm của doanh nghiệp khởi nghiệp công nghệ phụ thuộc vào mức độ bảo hộ quyền SHTT và việc ai nắm giữ tài sản bổ trợ [66]. Nghiên cứu thực nghiệm của Gans, Hsu và Stern (2008) cung cấp bằng chứng rằng khả năng ký kết hợp đồng li-xăng tăng lên rõ rệt sau khi sáng chế được cấp bằng, tức là sự không chắc chắn về quyền làm chậm giao dịch trên thị trường ý tưởng [67].</w:t>
       </w:r>
     </w:p>
     <w:p>
@@ -2740,7 +3032,7 @@
           <w:color w:val="000000"/>
           <w:sz w:val="26"/>
         </w:rPr>
-        <w:t xml:space="preserve">Hướng nghiên cứu thứ hai tập trung vào khai thác quyền SHTT từ kết quả nghiên cứu của trường đại học, viện nghiên cứu. Mowery, Nelson, Sampat và Ziedonis (2001) đánh giá tác động của Đạo luật Bayh-Dole năm 1980 của Hoa Kỳ, đạo luật cho phép trường đại học sở hữu sáng chế từ nghiên cứu do liên bang tài trợ; kết quả cho thấy sự gia tăng hoạt động đăng ký sáng chế và li-xăng của các trường đại học không chỉ do đạo luật này mà còn do sự phát triển của nghiên cứu y sinh và các thay đổi khác trong chính sách [74]. Siegel, Waldman và Link (2003) cho thấy năng suất của các văn phòng chuyển giao công nghệ khác nhau đáng kể và phụ thuộc vào các yếu tố tổ chức như cơ chế khen thưởng nhà khoa học, nhân lực của văn phòng và rào cản văn hóa giữa trường đại học với doanh nghiệp [85]. Ở góc độ doanh nghiệp, cuốn </w:t>
+        <w:t xml:space="preserve">Hướng nghiên cứu thứ hai tập trung vào khai thác quyền SHTT từ kết quả nghiên cứu của trường đại học, viện nghiên cứu. Mowery, Nelson, Sampat và Ziedonis (2001) đánh giá tác động của Đạo luật Bayh-Dole năm 1980 của Hoa Kỳ, đạo luật cho phép trường đại học sở hữu sáng chế từ nghiên cứu do liên bang tài trợ; kết quả cho thấy sự gia tăng hoạt động đăng ký sáng chế và li-xăng của các trường đại học không chỉ do đạo luật này mà còn do sự phát triển của nghiên cứu y sinh và các thay đổi khác trong chính sách [86]. Siegel, Waldman và Link (2003) cho thấy năng suất của các văn phòng chuyển giao công nghệ khác nhau đáng kể và phụ thuộc vào các yếu tố tổ chức như cơ chế khen thưởng nhà khoa học, nhân lực của văn phòng và rào cản văn hóa giữa trường đại học với doanh nghiệp [98]. Ở góc độ doanh nghiệp, cuốn </w:t>
       </w:r>
       <w:r>
         <w:rPr>
@@ -2760,7 +3052,7 @@
           <w:color w:val="000000"/>
           <w:sz w:val="26"/>
         </w:rPr>
-        <w:t xml:space="preserve"> của Chesbrough (2003) chỉ ra rằng doanh nghiệp có thể tạo giá trị bằng cách li-xăng ra bên ngoài các công nghệ không sử dụng hết, đồng thời tiếp nhận công nghệ từ bên ngoài [46]. Nghiên cứu so sánh của Fasi (2022) về các văn phòng chuyển giao công nghệ ở Hoa Kỳ và Trung Quốc cho thấy khung pháp luật về quyền sở hữu của trường đại học, sự hỗ trợ của Nhà nước và các quỹ tài trợ giai đoạn chứng minh khái niệm là những điều kiện quan trọng của thương mại hóa [50]. Đối với Việt Nam, đánh giá của OECD và Ngân hàng Thế giới (2014) chỉ ra rằng thị trường tri thức và công nghệ còn kém phát triển và các tổ chức trung gian có chức năng chuyển giao tri thức, thương mại hóa là lĩnh vực cần được chính sách quan tâm [80].</w:t>
+        <w:t xml:space="preserve"> của Chesbrough (2003) chỉ ra rằng doanh nghiệp có thể tạo giá trị bằng cách li-xăng ra bên ngoài các công nghệ không sử dụng hết, đồng thời tiếp nhận công nghệ từ bên ngoài [56]. Nghiên cứu so sánh của Fasi (2022) về các văn phòng chuyển giao công nghệ ở Hoa Kỳ và Trung Quốc cho thấy khung pháp luật về quyền sở hữu của trường đại học, sự hỗ trợ của Nhà nước và các quỹ tài trợ giai đoạn chứng minh khái niệm là những điều kiện quan trọng của thương mại hóa [62]. Đối với Việt Nam, đánh giá của OECD và Ngân hàng Thế giới (2014) chỉ ra rằng thị trường tri thức và công nghệ còn kém phát triển và các tổ chức trung gian có chức năng chuyển giao tri thức, thương mại hóa là lĩnh vực cần được chính sách quan tâm [92].</w:t>
       </w:r>
     </w:p>
     <w:p>
@@ -2814,7 +3106,7 @@
           <w:color w:val="000000"/>
           <w:sz w:val="26"/>
         </w:rPr>
-        <w:t>Hướng nghiên cứu thứ ba xem quyền SHTT như một tài sản có thể dùng để huy động vốn. Haskel và Westlake (2018) chỉ ra rằng tài sản vô hình có chi phí chìm lớn và khó bán lại, vì vậy khó được sử dụng làm tài sản bảo đảm, gây khó khăn cho doanh nghiệp giàu tài sản vô hình khi tiếp cận tín dụng [58]. Các nghiên cứu thực nghiệm gần đây cho thấy rào cản này có thể được giảm bớt. Hochberg, Serrano và Ziedonis (2018) phân tích thị trường cho vay mạo hiểm ở Hoa Kỳ và cho thấy sáng chế được sử dụng làm tài sản bảo đảm, trong đó tính thanh khoản của thị trường thứ cấp về sáng chế có vai trò quan trọng đối với khả năng cho vay [60]. Mann (2018) cho thấy việc tăng cường quyền của bên cho vay đối với sáng chế dùng làm tài sản bảo đảm có liên hệ với khả năng huy động vốn cho hoạt động đổi mới sáng tạo [69].</w:t>
+        <w:t>Hướng nghiên cứu thứ ba xem quyền SHTT như một tài sản có thể dùng để huy động vốn. Haskel và Westlake (2018) chỉ ra rằng tài sản vô hình có chi phí chìm lớn và khó bán lại, vì vậy khó được sử dụng làm tài sản bảo đảm, gây khó khăn cho doanh nghiệp giàu tài sản vô hình khi tiếp cận tín dụng [70]. Các nghiên cứu thực nghiệm gần đây cho thấy rào cản này có thể được giảm bớt. Hochberg, Serrano và Ziedonis (2018) phân tích thị trường cho vay mạo hiểm ở Hoa Kỳ và cho thấy sáng chế được sử dụng làm tài sản bảo đảm, trong đó tính thanh khoản của thị trường thứ cấp về sáng chế có vai trò quan trọng đối với khả năng cho vay [72]. Mann (2018) cho thấy việc tăng cường quyền của bên cho vay đối với sáng chế dùng làm tài sản bảo đảm có liên hệ với khả năng huy động vốn cho hoạt động đổi mới sáng tạo [81].</w:t>
       </w:r>
     </w:p>
     <w:p>
@@ -2888,7 +3180,7 @@
           <w:color w:val="000000"/>
           <w:sz w:val="26"/>
         </w:rPr>
-        <w:t xml:space="preserve"> của Shapiro và Varian (1999) phân tích các đặc điểm kinh tế của hàng hóa thông tin, gồm chi phí sản xuất bản đầu tiên cao và chi phí nhân bản thấp, hiệu ứng mạng và hiệu ứng khóa chặt, từ đó đề xuất các chiến lược cấp phép, định giá theo phiên bản và quản lý quyền trong môi trường số [84]. Như đã phân tích tại mục 1.1.2.1, công nghệ số làm giảm mạnh chi phí sao chép và phân phối [56], đồng thời làm cho giá trị có xu hướng tập trung vào chủ thể kiểm soát nền tảng và quyền SHTT [53], [91]. Báo cáo </w:t>
+        <w:t xml:space="preserve"> của Shapiro và Varian (1999) phân tích các đặc điểm kinh tế của hàng hóa thông tin, gồm chi phí sản xuất bản đầu tiên cao và chi phí nhân bản thấp, hiệu ứng mạng và hiệu ứng khóa chặt, từ đó đề xuất các chiến lược cấp phép, định giá theo phiên bản và quản lý quyền trong môi trường số [97]. Như đã phân tích tại mục 1.1.2.1, công nghệ số làm giảm mạnh chi phí sao chép và phân phối [68], đồng thời làm cho giá trị có xu hướng tập trung vào chủ thể kiểm soát nền tảng và quyền SHTT [65], [106]. Báo cáo </w:t>
       </w:r>
       <w:r>
         <w:rPr>
@@ -2908,7 +3200,7 @@
           <w:color w:val="000000"/>
           <w:sz w:val="26"/>
         </w:rPr>
-        <w:t xml:space="preserve"> của WIPO cho thấy khoảng thời gian từ khi công nghệ ra đời đến khi được sử dụng rộng rãi đã giảm mạnh [94]. Kết hợp các phân tích này có thể thấy trong môi trường số, cơ hội khai thác quyền mở rộng nhờ khả năng tiếp cận thị trường toàn cầu, nhưng thời gian để khai thác rút ngắn và rủi ro mất quyền kiểm soát giá trị tăng lên.</w:t>
+        <w:t xml:space="preserve"> của WIPO cho thấy khoảng thời gian từ khi công nghệ ra đời đến khi được sử dụng rộng rãi đã giảm mạnh [110]. Kết hợp các phân tích này có thể thấy trong môi trường số, cơ hội khai thác quyền mở rộng nhờ khả năng tiếp cận thị trường toàn cầu, nhưng thời gian để khai thác rút ngắn và rủi ro mất quyền kiểm soát giá trị tăng lên.</w:t>
       </w:r>
     </w:p>
     <w:p>
@@ -2995,7 +3287,7 @@
           <w:color w:val="000000"/>
           <w:sz w:val="26"/>
         </w:rPr>
-        <w:t>Đoàn Đức Lương (2009) là một trong những công trình sớm phân tích vai trò của SHTT đối với nghiên cứu khoa học và chuyển giao công nghệ trong trường đại học, kiến nghị thành lập tổ chức chuyên trách về SHTT và chuyển giao công nghệ tại các trường [17]. Trên cơ sở khảo sát và phỏng vấn sâu 201 doanh nghiệp là chủ đơn đăng ký sáng chế, kiểu dáng công nghiệp và nhãn hiệu giai đoạn 2011-2015, Nguyễn Hữu Cẩn (2017) phân tích thực trạng tạo dựng, xác lập và thương mại hóa tài sản trí tuệ của doanh nghiệp, cùng các lý do thúc đẩy và cản trở hoạt động này; theo đánh giá của doanh nghiệp, rào cản lớn nhất đối với thương mại hóa là sản phẩm chứa tài sản trí tuệ bị sao chép, làm nhái trên thị trường [4]. Mẫu khảo sát chỉ gồm doanh nghiệp có công bố thông tin tài chính và tập trung ở Bắc Bộ, Nam Bộ (87,5%), nên phản ánh chủ yếu nhóm doanh nghiệp có quy mô và mức độ minh bạch tương đối cao. Nguyễn Hữu Xuyên (2018) chỉ ra các nút thắt trong khai thác, thương mại hóa sáng chế: chưa có chính sách riêng về khai thác sáng chế, các ưu đãi mới được lồng ghép trong các văn bản và chương trình khác và chưa hấp dẫn đối với doanh nghiệp, nhà đầu tư; tác giả đề xuất cụ thể hóa cơ chế phân chia lợi ích đối với sáng chế từ ngân sách nhà nước theo hướng lấy việc đưa sáng chế vào sản xuất, kinh doanh làm trọng tâm [38]. Lê Thị Thanh Tâm và Hoàng Thị Hải Yến (2025) cho thấy thương mại hóa sáng chế thông qua chuyển giao công nghệ đạt hiệu quả rất thấp trong giai đoạn 2011-2021, trong đó thủ tục đăng ký hợp đồng là một rào cản, và đề xuất chuyển thủ tục đăng ký sang thông báo [29].</w:t>
+        <w:t>Đoàn Đức Lương (2009) là một trong những công trình sớm phân tích vai trò của SHTT đối với nghiên cứu khoa học và chuyển giao công nghệ trong trường đại học, kiến nghị thành lập tổ chức chuyên trách về SHTT và chuyển giao công nghệ tại các trường [22]. Trên cơ sở khảo sát và phỏng vấn sâu 201 doanh nghiệp là chủ đơn đăng ký sáng chế, kiểu dáng công nghiệp và nhãn hiệu giai đoạn 2011-2015, Nguyễn Hữu Cẩn (2017) phân tích thực trạng tạo dựng, xác lập và thương mại hóa tài sản trí tuệ của doanh nghiệp, cùng các lý do thúc đẩy và cản trở hoạt động này; theo đánh giá của doanh nghiệp, rào cản lớn nhất đối với thương mại hóa là sản phẩm chứa tài sản trí tuệ bị sao chép, làm nhái trên thị trường [4]. Mẫu khảo sát chỉ gồm doanh nghiệp có công bố thông tin tài chính và tập trung ở Bắc Bộ, Nam Bộ (87,5%), nên phản ánh chủ yếu nhóm doanh nghiệp có quy mô và mức độ minh bạch tương đối cao. Nguyễn Hữu Xuyên (2018) chỉ ra các nút thắt trong khai thác, thương mại hóa sáng chế: chưa có chính sách riêng về khai thác sáng chế, các ưu đãi mới được lồng ghép trong các văn bản và chương trình khác và chưa hấp dẫn đối với doanh nghiệp, nhà đầu tư; tác giả đề xuất cụ thể hóa cơ chế phân chia lợi ích đối với sáng chế từ ngân sách nhà nước theo hướng lấy việc đưa sáng chế vào sản xuất, kinh doanh làm trọng tâm [46]. Lê Thị Thanh Tâm và Hoàng Thị Hải Yến (2025) cho thấy thương mại hóa sáng chế thông qua chuyển giao công nghệ đạt hiệu quả rất thấp trong giai đoạn 2011-2021, trong đó thủ tục đăng ký hợp đồng là một rào cản, và đề xuất chuyển thủ tục đăng ký sang thông báo [36].</w:t>
       </w:r>
     </w:p>
     <w:p>
@@ -3013,7 +3305,7 @@
           <w:color w:val="000000"/>
           <w:sz w:val="26"/>
         </w:rPr>
-        <w:t>Các công trình gần đây tập trung vào khu vực đại học. Dựa trên số liệu giai đoạn 2019-2023 thu thập bằng bảng hỏi tại Đại học Quốc gia Hà Nội và 44 cơ sở giáo dục đại học ở ba miền, kết hợp phỏng vấn sâu lãnh đạo đơn vị và tác giả sáng chế, Luu Hoang Long (2025a) cho thấy số lượng tài sản trí tuệ được thương mại hóa rất thấp, chưa có sáng chế hoặc giải pháp hữu ích nào được thương mại hóa thông qua doanh nghiệp khởi nguồn, và đề xuất mô hình công viên công nghệ [67]; một khảo sát khác tại 11 trường đại học và 3 viện nghiên cứu của Đại học Quốc gia Hà Nội đề xuất phát triển hệ sinh thái đổi mới sáng tạo với vườn ươm khởi nghiệp làm hạt nhân [68]. So sánh chính sách của Hoa Kỳ, Vương quốc Anh, Hàn Quốc và Singapore, Dang Thanh Dat (2026) kết luận rằng kết quả thương mại hóa không phụ thuộc vào một công cụ chính sách đơn lẻ mà vào sự đồng bộ giữa quy định về quyền SHTT, năng lực tổ chức trung gian, cơ chế tài chính, động lực của nhà nghiên cứu và mức độ phát triển của thị trường công nghệ; đối với Việt Nam, các hạn chế chủ yếu gồm thiếu dữ liệu định lượng thống nhất, năng lực tổ chức chuyển giao còn yếu, thiếu vốn cho giai đoạn chứng minh khái niệm và thị trường công nghệ thiếu thông tin, chuẩn định giá [47].</w:t>
+        <w:t>Các công trình gần đây tập trung vào khu vực đại học. Dựa trên số liệu giai đoạn 2019-2023 thu thập bằng bảng hỏi tại Đại học Quốc gia Hà Nội và 44 cơ sở giáo dục đại học ở ba miền, kết hợp phỏng vấn sâu lãnh đạo đơn vị và tác giả sáng chế, Luu Hoang Long (2025a) cho thấy số lượng tài sản trí tuệ được thương mại hóa rất thấp, chưa có sáng chế hoặc giải pháp hữu ích nào được thương mại hóa thông qua doanh nghiệp khởi nguồn, và đề xuất mô hình công viên công nghệ [79]; một khảo sát khác tại 11 trường đại học và 3 viện nghiên cứu của Đại học Quốc gia Hà Nội đề xuất phát triển hệ sinh thái đổi mới sáng tạo với vườn ươm khởi nghiệp làm hạt nhân [80]. So sánh chính sách của Hoa Kỳ, Vương quốc Anh, Hàn Quốc và Singapore, Dang Thanh Dat (2026) kết luận rằng kết quả thương mại hóa không phụ thuộc vào một công cụ chính sách đơn lẻ mà vào sự đồng bộ giữa quy định về quyền SHTT, năng lực tổ chức trung gian, cơ chế tài chính, động lực của nhà nghiên cứu và mức độ phát triển của thị trường công nghệ; đối với Việt Nam, các hạn chế chủ yếu gồm thiếu dữ liệu định lượng thống nhất, năng lực tổ chức chuyển giao còn yếu, thiếu vốn cho giai đoạn chứng minh khái niệm và thị trường công nghệ thiếu thông tin, chuẩn định giá [58].</w:t>
       </w:r>
     </w:p>
     <w:p>
@@ -3049,7 +3341,7 @@
           <w:color w:val="000000"/>
           <w:sz w:val="26"/>
         </w:rPr>
-        <w:t>Hướng nghiên cứu này tập trung vào các hợp đồng là công cụ pháp lý của khai thác quyền. Hoàng Lan Phương (2019) xem li-xăng nhãn hiệu là một hình thức thương mại hóa tài sản trí tuệ phổ biến và chỉ ra các bất cập của pháp luật về khái niệm, chủ thể, đối tượng, hình thức và nội dung hợp đồng li-xăng nhãn hiệu [23]. Nguyễn Thanh Tùng (2026) tiếp tục phân tích hạn chế của pháp luật về dạng hợp đồng, đăng ký hợp đồng và hạn chế chuyển quyền sử dụng đối với nhãn hiệu tập thể [36]. Ở khía cạnh khai thác thông tin sáng chế, Phạm Ngọc Pha (2025) đề xuất mô hình khai thác cơ sở dữ liệu sáng chế để hỗ trợ doanh nghiệp nâng cao năng lực công nghệ [21]; Tran Van Hai (2022) đề xuất vận dụng khung năng lực số trong khai thác thông tin phục vụ thương mại hóa quyền SHTT trong nền kinh tế số [90]. Các công trình này cung cấp luận cứ cụ thể cho việc hoàn thiện thể chế giao dịch, nhưng chủ yếu dừng ở kiến nghị sửa đổi quy phạm, chưa đánh giá tác động của các quy định đối với quy mô giao dịch trên thị trường.</w:t>
+        <w:t>Hướng nghiên cứu này tập trung vào các hợp đồng là công cụ pháp lý của khai thác quyền. Hoàng Lan Phương (2019) xem li-xăng nhãn hiệu là một hình thức thương mại hóa tài sản trí tuệ phổ biến và chỉ ra các bất cập của pháp luật về khái niệm, chủ thể, đối tượng, hình thức và nội dung hợp đồng li-xăng nhãn hiệu [29]. Nguyễn Thanh Tùng (2026) tiếp tục phân tích hạn chế của pháp luật về dạng hợp đồng, đăng ký hợp đồng và hạn chế chuyển quyền sử dụng đối với nhãn hiệu tập thể [44]. Ở khía cạnh khai thác thông tin sáng chế, Phạm Ngọc Pha (2025) đề xuất mô hình khai thác cơ sở dữ liệu sáng chế để hỗ trợ doanh nghiệp nâng cao năng lực công nghệ [27]; Tran Van Hai (2022) đề xuất vận dụng khung năng lực số trong khai thác thông tin phục vụ thương mại hóa quyền SHTT trong nền kinh tế số [103]. Các công trình này cung cấp luận cứ cụ thể cho việc hoàn thiện thể chế giao dịch, nhưng chủ yếu dừng ở kiến nghị sửa đổi quy phạm, chưa đánh giá tác động của các quy định đối với quy mô giao dịch trên thị trường.</w:t>
       </w:r>
     </w:p>
     <w:p>
@@ -3085,7 +3377,7 @@
           <w:color w:val="000000"/>
           <w:sz w:val="26"/>
         </w:rPr>
-        <w:t>Một số công trình tiếp cận từ phía chủ thể quyền. Cuốn sách Quản trị tài sản trí tuệ của doanh nghiệp của Nguyễn Hữu Cẩn (2020) hệ thống hóa quan điểm quản trị tài sản trí tuệ một cách có chiến lược [5]. Qua khảo sát 125 doanh nghiệp tại Hà Nội, Hải Phòng, Thành phố Hồ Chí Minh, Đà Nẵng và Bắc Giang, Nguyễn Quốc Thịnh, Khúc Đại Long và Nguyễn Thu Hương (2020) cho thấy phần lớn doanh nghiệp còn chưa nhận diện rõ tài sản trí tuệ của mình: chỉ 14/125 doanh nghiệp coi kiểu dáng công nghiệp và sáng chế là đối tượng có thể khai thác thương mại thông qua nhượng quyền và các hoạt động khác, 2/125 doanh nghiệp xây dựng danh mục tài sản trí tuệ; các tác giả đề xuất quy trình nhận diện, đánh giá, quản lý và khai thác tài sản trí tuệ [30]. Người trả lời là lãnh đạo doanh nghiệp nhỏ và vừa tham gia lớp bồi dưỡng về quản trị tài sản thương hiệu, vì vậy kết quả có ý nghĩa mô tả nhiều hơn là suy rộng. Nghiên cứu định lượng trên 122 phiếu hợp lệ của doanh nghiệp ngành công nghệ thông tin và truyền thông, sử dụng thang Likert 5 mức, kiểm định Cronbach's Alpha, phân tích nhân tố khám phá và mô hình cấu trúc tuyến tính, của Le Thi Thu Ha, Nguyen Nhu Ngoc và Luong Thi Dai Trang (2022) cho thấy các cấp độ quản trị SHTT đều tác động tích cực đến hiệu quả hoạt động của doanh nghiệp, trong đó cấp độ khai thác và quản lý có mức tác động lớn nhất [64]. Công trình này đo lường quản trị SHTT từ phía doanh nghiệp của một ngành, chưa xem xét đánh giá của cơ quan quản lý. Nghiên cứu tình huống dựa trên phỏng vấn sâu giám đốc sáu doanh nghiệp nhỏ và vừa của Le và Luong (2022) nhấn mạnh vai trò của hợp tác giữa doanh nghiệp với trường đại học, viện nghiên cứu và sự hỗ trợ của Nhà nước về tài chính, chính sách; chính các tác giả thừa nhận mẫu nhỏ và chỉ gồm doanh nghiệp ở miền Bắc [63]. Trên cơ sở khảo sát 109 doanh nghiệp được chọn theo phương pháp thuận tiện và phân tích bằng điểm trung bình, độ lệch chuẩn, Nguyen Huu Xuyen (2024) đánh giá năng lực quản trị SHTT của doanh nghiệp và kiến nghị Nhà nước hỗ trợ tổ chức thương mại hóa, chuyển giao thông qua mạng lưới trung tâm chuyển giao công nghệ [78]. Cách tiếp cận thống kê mô tả của công trình này tương đồng với hướng luận án lựa chọn, song mẫu chỉ gồm doanh nghiệp. Trong khu vực đại học, Nguyễn Minh Huyền Trang (2025) phân tích cơ hội và thách thức đối với quản trị tài sản trí tuệ trong bối cảnh Cách mạng công nghiệp lần thứ tư [35].</w:t>
+        <w:t>Một số công trình tiếp cận từ phía chủ thể quyền. Cuốn sách Quản trị tài sản trí tuệ của doanh nghiệp của Nguyễn Hữu Cẩn (2020) hệ thống hóa quan điểm quản trị tài sản trí tuệ một cách có chiến lược [5]. Qua khảo sát 125 doanh nghiệp tại Hà Nội, Hải Phòng, Thành phố Hồ Chí Minh, Đà Nẵng và Bắc Giang, Nguyễn Quốc Thịnh, Khúc Đại Long và Nguyễn Thu Hương (2020) cho thấy phần lớn doanh nghiệp còn chưa nhận diện rõ tài sản trí tuệ của mình: chỉ 14/125 doanh nghiệp coi kiểu dáng công nghiệp và sáng chế là đối tượng có thể khai thác thương mại thông qua nhượng quyền và các hoạt động khác, 2/125 doanh nghiệp xây dựng danh mục tài sản trí tuệ; các tác giả đề xuất quy trình nhận diện, đánh giá, quản lý và khai thác tài sản trí tuệ [38]. Người trả lời là lãnh đạo doanh nghiệp nhỏ và vừa tham gia lớp bồi dưỡng về quản trị tài sản thương hiệu, vì vậy kết quả có ý nghĩa mô tả nhiều hơn là suy rộng. Nghiên cứu định lượng trên 122 phiếu hợp lệ của doanh nghiệp ngành công nghệ thông tin và truyền thông, sử dụng thang Likert 5 mức, kiểm định Cronbach's Alpha, phân tích nhân tố khám phá và mô hình cấu trúc tuyến tính, của Le Thi Thu Ha, Nguyen Nhu Ngoc và Luong Thi Dai Trang (2022) cho thấy các cấp độ quản trị SHTT đều tác động tích cực đến hiệu quả hoạt động của doanh nghiệp, trong đó cấp độ khai thác và quản lý có mức tác động lớn nhất [76]. Công trình này đo lường quản trị SHTT từ phía doanh nghiệp của một ngành, chưa xem xét đánh giá của cơ quan quản lý. Nghiên cứu tình huống dựa trên phỏng vấn sâu giám đốc sáu doanh nghiệp nhỏ và vừa của Le và Luong (2022) nhấn mạnh vai trò của hợp tác giữa doanh nghiệp với trường đại học, viện nghiên cứu và sự hỗ trợ của Nhà nước về tài chính, chính sách; chính các tác giả thừa nhận mẫu nhỏ và chỉ gồm doanh nghiệp ở miền Bắc [75]. Trên cơ sở khảo sát 109 doanh nghiệp được chọn theo phương pháp thuận tiện và phân tích bằng điểm trung bình, độ lệch chuẩn, Nguyen Huu Xuyen (2024) đánh giá năng lực quản trị SHTT của doanh nghiệp và kiến nghị Nhà nước hỗ trợ tổ chức thương mại hóa, chuyển giao thông qua mạng lưới trung tâm chuyển giao công nghệ [90]. Cách tiếp cận thống kê mô tả của công trình này tương đồng với hướng luận án lựa chọn, song mẫu chỉ gồm doanh nghiệp. Trong khu vực đại học, Nguyễn Minh Huyền Trang (2025) phân tích cơ hội và thách thức đối với quản trị tài sản trí tuệ trong bối cảnh Cách mạng công nghiệp lần thứ tư [43].</w:t>
       </w:r>
     </w:p>
     <w:p>
@@ -3139,7 +3431,7 @@
           <w:color w:val="000000"/>
           <w:sz w:val="26"/>
         </w:rPr>
-        <w:t>Một số công trình đánh giá khai thác quyền SHTT ở địa phương. Đoàn Đức Lương và Ngô Minh Tiến (2022) cho thấy tỉnh Quảng Ngãi đạt nhiều kết quả trong xác lập quyền đối với chỉ dẫn địa lý, nhãn hiệu tập thể và nhãn hiệu chứng nhận, nhưng việc khai thác các tài sản này còn nhiều hạn chế [18]. Nguyễn Văn Phúc (2025) phân tích việc bảo hộ và khai thác nhãn hiệu có nguồn gốc từ tri thức truyền thống tại Thừa Thiên Huế [22]. Nghiên cứu định lượng trên 296 hộ kinh doanh cá thể tại ba tỉnh miền Trung, chọn mẫu thuận tiện từ danh sách do chính quyền địa phương giới thiệu và phân tích bằng mô hình cấu trúc tuyến tính, của Long Tran Viet và Hai Phan Thanh (2023) cho thấy tài sản trí tuệ địa phương tác động đến phát triển du lịch thông qua vai trò trung gian của hoạt động bảo hộ, khai thác quyền và sự hỗ trợ của chính quyền địa phương [65]. Luận án của Nguyễn Văn Đông (2025), thuộc chuyên ngành Quản lý kinh tế, là công trình gần với đề tài nhất về cách tiếp cận. Tác giả kết hợp khảo sát 197 hộ được chọn ngẫu nhiên trong số 390 hộ được cấp quyền sử dụng địa danh, khảo sát có chủ đích 300 khách hàng và phỏng vấn tám chuyên gia, từ đó chỉ ra rằng trong ba hoạt động xác lập, quản lý và khai thác quyền SHTT, các địa phương mới tập trung vào xác lập quyền, còn hiệu quả quản lý và khai thác chưa cao [8]. Kết luận tương tự được nêu trong đánh giá việc thực hiện chính sách phát triển tài sản trí tuệ của Nhà nước tại địa phương: thành tích nổi bật nằm ở đăng ký, xác lập quyền, trong khi việc phát triển và khai thác tài sản trí tuệ sau bảo hộ cần được quan tâm hơn [37].</w:t>
+        <w:t>Một số công trình đánh giá khai thác quyền SHTT ở địa phương. Đoàn Đức Lương và Ngô Minh Tiến (2022) cho thấy tỉnh Quảng Ngãi đạt nhiều kết quả trong xác lập quyền đối với chỉ dẫn địa lý, nhãn hiệu tập thể và nhãn hiệu chứng nhận, nhưng việc khai thác các tài sản này còn nhiều hạn chế [23]. Nguyễn Văn Phúc (2025) phân tích việc bảo hộ và khai thác nhãn hiệu có nguồn gốc từ tri thức truyền thống tại Thừa Thiên Huế [28]. Nghiên cứu định lượng trên 296 hộ kinh doanh cá thể tại ba tỉnh miền Trung, chọn mẫu thuận tiện từ danh sách do chính quyền địa phương giới thiệu và phân tích bằng mô hình cấu trúc tuyến tính, của Long Tran Viet và Hai Phan Thanh (2023) cho thấy tài sản trí tuệ địa phương tác động đến phát triển du lịch thông qua vai trò trung gian của hoạt động bảo hộ, khai thác quyền và sự hỗ trợ của chính quyền địa phương [77]. Luận án của Nguyễn Văn Đông (2025), thuộc chuyên ngành Quản lý kinh tế, là công trình gần với đề tài nhất về cách tiếp cận. Tác giả kết hợp khảo sát 197 hộ được chọn ngẫu nhiên trong số 390 hộ được cấp quyền sử dụng địa danh, khảo sát có chủ đích 300 khách hàng và phỏng vấn tám chuyên gia, từ đó chỉ ra rằng trong ba hoạt động xác lập, quản lý và khai thác quyền SHTT, các địa phương mới tập trung vào xác lập quyền, còn hiệu quả quản lý và khai thác chưa cao [8]. Kết luận tương tự được nêu trong đánh giá việc thực hiện chính sách phát triển tài sản trí tuệ của Nhà nước tại địa phương: thành tích nổi bật nằm ở đăng ký, xác lập quyền, trong khi việc phát triển và khai thác tài sản trí tuệ sau bảo hộ cần được quan tâm hơn [45].</w:t>
       </w:r>
     </w:p>
     <w:p>
@@ -3157,7 +3449,7 @@
           <w:color w:val="000000"/>
           <w:sz w:val="26"/>
         </w:rPr>
-        <w:t>Về tài chính hóa, Phạm Hồng Quất, Lương Văn Thường, Nguyễn Minh Ngọc và Lê Ngọc Mỹ (2021) phân tích triển vọng, thách thức và kinh nghiệm của Hàn Quốc, Singapore, Trung Quốc, Hoa Kỳ trong việc khai thác tài sản trí tuệ thành công cụ tài chính, kiến nghị Việt Nam ban hành cơ chế khuyến khích và quy định đặc thù về hạch toán tài sản trí tuệ [24]. Phạm Trung Luân (2025) phân tích mối quan hệ giữa chuyển giao công nghệ và bảo đảm quyền đối với tài sản trí tuệ của doanh nghiệp sáng tạo [16]. Lâm Xuân Hùng (2025) đề xuất trao quyền sở hữu trực tiếp kết quả nghiên cứu cho tổ chức chủ trì nhiệm vụ khoa học và công nghệ sử dụng ngân sách nhà nước, tương tự mô hình Bayh-Dole của Hoa Kỳ, kèm cơ chế phân chia lợi nhuận hợp lý [12].</w:t>
+        <w:t>Về tài chính hóa, Phạm Hồng Quất, Lương Văn Thường, Nguyễn Minh Ngọc và Lê Ngọc Mỹ (2021) phân tích triển vọng, thách thức và kinh nghiệm của Hàn Quốc, Singapore, Trung Quốc, Hoa Kỳ trong việc khai thác tài sản trí tuệ thành công cụ tài chính, kiến nghị Việt Nam ban hành cơ chế khuyến khích và quy định đặc thù về hạch toán tài sản trí tuệ [30]. Phạm Trung Luân (2025) phân tích mối quan hệ giữa chuyển giao công nghệ và bảo đảm quyền đối với tài sản trí tuệ của doanh nghiệp sáng tạo [21]. Lâm Xuân Hùng (2025) đề xuất trao quyền sở hữu trực tiếp kết quả nghiên cứu cho tổ chức chủ trì nhiệm vụ khoa học và công nghệ sử dụng ngân sách nhà nước, tương tự mô hình Bayh-Dole của Hoa Kỳ, kèm cơ chế phân chia lợi nhuận hợp lý [16].</w:t>
       </w:r>
     </w:p>
     <w:p>
@@ -3175,7 +3467,7 @@
           <w:color w:val="000000"/>
           <w:sz w:val="26"/>
         </w:rPr>
-        <w:t>Xét về phương pháp, các công trình trong nước có sử dụng dữ liệu sơ cấp đều khảo sát một hoặc hai nhóm chủ thể: doanh nghiệp [4], [30], [64], [78], cơ sở giáo dục đại học [67], hộ kinh doanh và người tiêu dùng [8], [65]. Quy mô mẫu phổ biến từ khoảng 100 đến 300 quan sát, chủ yếu được chọn thuận tiện hoặc có chủ đích. Một số công trình sử dụng mô hình cấu trúc tuyến tính để kiểm định quan hệ giữa các nhân tố, số khác sử dụng thống kê mô tả để nhận diện thực trạng và rào cản. Đánh giá của cán bộ QLNN và tổ chức trung gian ít được thu thập cùng lúc với đánh giá của chủ thể quyền theo một bộ câu hỏi chung, do đó khó đối chiếu nhận định của bên quản lý với nhận định của bên chịu tác động của chính sách. Hạn chế này gợi ý rằng khi đánh giá QLNN đối với khai thác quyền SHTT, việc khảo sát đồng thời nhiều nhóm chủ thể với phần câu hỏi chung là cần thiết.</w:t>
+        <w:t>Xét về phương pháp, các công trình trong nước có sử dụng dữ liệu sơ cấp đều khảo sát một hoặc hai nhóm chủ thể: doanh nghiệp [4], [38], [76], [90], cơ sở giáo dục đại học [79], hộ kinh doanh và người tiêu dùng [8], [77]. Quy mô mẫu phổ biến từ khoảng 100 đến 300 quan sát, chủ yếu được chọn thuận tiện hoặc có chủ đích. Một số công trình sử dụng mô hình cấu trúc tuyến tính để kiểm định quan hệ giữa các nhân tố, số khác sử dụng thống kê mô tả để nhận diện thực trạng và rào cản. Đánh giá của cán bộ QLNN và tổ chức trung gian ít được thu thập cùng lúc với đánh giá của chủ thể quyền theo một bộ câu hỏi chung, do đó khó đối chiếu nhận định của bên quản lý với nhận định của bên chịu tác động của chính sách. Hạn chế này gợi ý rằng khi đánh giá QLNN đối với khai thác quyền SHTT, việc khảo sát đồng thời nhiều nhóm chủ thể với phần câu hỏi chung là cần thiết.</w:t>
       </w:r>
     </w:p>
     <w:p>
@@ -3528,7 +3820,7 @@
                 <w:color w:val="000000"/>
                 <w:sz w:val="24"/>
               </w:rPr>
-              <w:t>Chuẩn hóa khái niệm; nhiều luận cứ hoàn thiện pháp luật về bảo hộ, thực thi</w:t>
+              <w:t>Chuẩn hóa khái niệm; nhiều luận cứ hoàn thiện pháp luật về bảo hộ, thực thi; bước đầu đánh giá năng lực và sự phối hợp của bộ máy thực thi</w:t>
             </w:r>
           </w:p>
         </w:tc>
@@ -3593,7 +3885,7 @@
                 <w:color w:val="000000"/>
                 <w:sz w:val="24"/>
               </w:rPr>
-              <w:t>Khái niệm, đo lường; cơ chế kinh tế của công nghệ số, tài sản vô hình; phân phối giá trị và quyền kiểm soát</w:t>
+              <w:t>Khái niệm, đo lường; cơ chế kinh tế của công nghệ số, tài sản vô hình; phân phối giá trị và quyền kiểm soát; quan hệ giữa bảo hộ quyền SHTT và kinh tế số</w:t>
             </w:r>
           </w:p>
         </w:tc>
@@ -3700,7 +3992,7 @@
                 <w:color w:val="000000"/>
                 <w:sz w:val="24"/>
               </w:rPr>
-              <w:t>Cụ thể hóa khái niệm vào bối cảnh Việt Nam; bắt đầu đo lường chính thức; nhận diện áp lực đối với pháp luật SHTT</w:t>
+              <w:t>Cụ thể hóa khái niệm vào bối cảnh Việt Nam; bắt đầu đo lường chính thức, lượng hóa yếu tố ảnh hưởng và đề xuất tiêu chí đánh giá QLNN; nhận diện áp lực đối với pháp luật SHTT</w:t>
             </w:r>
           </w:p>
         </w:tc>
@@ -3947,7 +4239,7 @@
           <w:color w:val="000000"/>
           <w:sz w:val="26"/>
         </w:rPr>
-        <w:t>Thứ nhất, các công trình thống nhất rằng quyền SHTT là một chế định kinh tế do Nhà nước thiết kế và có thể điều chỉnh; tác động của quyền SHTT đối với đổi mới sáng tạo và tăng trưởng không đồng nhất mà phụ thuộc vào trình độ phát triển, năng lực hấp thụ công nghệ và mức độ phát triển của thị trường [71], [77].</w:t>
+        <w:t>Thứ nhất, các công trình thống nhất rằng quyền SHTT là một chế định kinh tế do Nhà nước thiết kế và có thể điều chỉnh; tác động của quyền SHTT đối với đổi mới sáng tạo và tăng trưởng không đồng nhất mà phụ thuộc vào trình độ phát triển, năng lực hấp thụ công nghệ và mức độ phát triển của thị trường [83], [89].</w:t>
       </w:r>
     </w:p>
     <w:p>
@@ -3965,7 +4257,7 @@
           <w:color w:val="000000"/>
           <w:sz w:val="26"/>
         </w:rPr>
-        <w:t>Thứ hai, các công trình thống nhất rằng xác lập quyền là điều kiện cần nhưng chưa đủ để quyền SHTT tạo ra giá trị kinh tế; hiệu quả khai thác phụ thuộc vào chi phí giao dịch, mức độ chắc chắn của quyền, tài sản bổ trợ, năng lực của tổ chức trung gian và năng lực quản trị của chủ thể quyền [40], [55], [64], [88].</w:t>
+        <w:t>Thứ hai, các công trình thống nhất rằng xác lập quyền là điều kiện cần nhưng chưa đủ để quyền SHTT tạo ra giá trị kinh tế; hiệu quả khai thác phụ thuộc vào chi phí giao dịch, mức độ chắc chắn của quyền, tài sản bổ trợ, năng lực của tổ chức trung gian và năng lực quản trị của chủ thể quyền [48], [67], [76], [101].</w:t>
       </w:r>
     </w:p>
     <w:p>
@@ -3983,7 +4275,7 @@
           <w:color w:val="000000"/>
           <w:sz w:val="26"/>
         </w:rPr>
-        <w:t>Thứ ba, trong nền kinh tế số, tài sản vô hình, trong đó có tài sản trí tuệ, trở thành nguồn tạo giá trị trung tâm; công nghệ số vừa mở rộng cơ hội khai thác quyền vừa làm cho giá trị có xu hướng tập trung vào chủ thể kiểm soát nền tảng và quyền SHTT [53], [56], [58].</w:t>
+        <w:t>Thứ ba, trong nền kinh tế số, tài sản vô hình, trong đó có tài sản trí tuệ, trở thành nguồn tạo giá trị trung tâm; công nghệ số vừa mở rộng cơ hội khai thác quyền vừa làm cho giá trị có xu hướng tập trung vào chủ thể kiểm soát nền tảng và quyền SHTT [65], [68], [70].</w:t>
       </w:r>
     </w:p>
     <w:p>
@@ -4001,7 +4293,7 @@
           <w:color w:val="000000"/>
           <w:sz w:val="26"/>
         </w:rPr>
-        <w:t>Thứ tư, các công trình trong nước thống nhất rằng hoạt động khai thác quyền SHTT ở Việt Nam còn hạn chế so với hoạt động xác lập quyền, với các điểm nghẽn về chính sách, thủ tục giao dịch, định giá, tổ chức trung gian, cơ chế phân chia lợi ích và năng lực của chủ thể quyền [8], [29], [38], [47], [67].</w:t>
+        <w:t>Thứ tư, các công trình trong nước thống nhất rằng hoạt động khai thác quyền SHTT ở Việt Nam còn hạn chế so với hoạt động xác lập quyền, với các điểm nghẽn về chính sách, thủ tục giao dịch, định giá, tổ chức trung gian, cơ chế phân chia lợi ích và năng lực của chủ thể quyền [8], [36], [46], [58], [79].</w:t>
       </w:r>
     </w:p>
     <w:p>
@@ -4202,7 +4494,7 @@
                 <w:color w:val="000000"/>
                 <w:sz w:val="24"/>
               </w:rPr>
-              <w:t>[4], [55], [88]</w:t>
+              <w:t>[4], [67], [101]</w:t>
             </w:r>
           </w:p>
         </w:tc>
@@ -4288,7 +4580,7 @@
                 <w:color w:val="000000"/>
                 <w:sz w:val="24"/>
               </w:rPr>
-              <w:t>[23], [29], [36]</w:t>
+              <w:t>[29], [36], [44]</w:t>
             </w:r>
           </w:p>
         </w:tc>
@@ -4374,7 +4666,7 @@
                 <w:color w:val="000000"/>
                 <w:sz w:val="24"/>
               </w:rPr>
-              <w:t>[12], [38], [74]</w:t>
+              <w:t>[16], [46], [86]</w:t>
             </w:r>
           </w:p>
         </w:tc>
@@ -4460,7 +4752,7 @@
                 <w:color w:val="000000"/>
                 <w:sz w:val="24"/>
               </w:rPr>
-              <w:t>[21], [47]</w:t>
+              <w:t>[27], [58]</w:t>
             </w:r>
           </w:p>
         </w:tc>
@@ -4546,7 +4838,7 @@
                 <w:color w:val="000000"/>
                 <w:sz w:val="24"/>
               </w:rPr>
-              <w:t>[78], [80], [85]</w:t>
+              <w:t>[90], [92], [98]</w:t>
             </w:r>
           </w:p>
         </w:tc>
@@ -4632,7 +4924,7 @@
                 <w:color w:val="000000"/>
                 <w:sz w:val="24"/>
               </w:rPr>
-              <w:t>[24], [58], [60]</w:t>
+              <w:t>[30], [70], [72]</w:t>
             </w:r>
           </w:p>
         </w:tc>
@@ -4718,7 +5010,7 @@
                 <w:color w:val="000000"/>
                 <w:sz w:val="24"/>
               </w:rPr>
-              <w:t>[56], [84], [94]</w:t>
+              <w:t>[68], [97], [110]</w:t>
             </w:r>
           </w:p>
         </w:tc>
@@ -4804,7 +5096,7 @@
                 <w:color w:val="000000"/>
                 <w:sz w:val="24"/>
               </w:rPr>
-              <w:t>[30], [54], [64]</w:t>
+              <w:t>[38], [66], [76]</w:t>
             </w:r>
           </w:p>
         </w:tc>
@@ -4890,7 +5182,7 @@
                 <w:color w:val="000000"/>
                 <w:sz w:val="24"/>
               </w:rPr>
-              <w:t>[46], [63], [68]</w:t>
+              <w:t>[56], [75], [80]</w:t>
             </w:r>
           </w:p>
         </w:tc>
@@ -5345,7 +5637,7 @@
                 <w:color w:val="000000"/>
                 <w:sz w:val="24"/>
               </w:rPr>
-              <w:t>Teece (1986) [88]</w:t>
+              <w:t>Teece (1986) [101]</w:t>
             </w:r>
           </w:p>
         </w:tc>
@@ -5487,7 +5779,7 @@
                 <w:color w:val="000000"/>
                 <w:sz w:val="24"/>
               </w:rPr>
-              <w:t>Shapiro và Varian (1999) [84]</w:t>
+              <w:t>Shapiro và Varian (1999) [97]</w:t>
             </w:r>
           </w:p>
         </w:tc>
@@ -5619,7 +5911,7 @@
                 <w:color w:val="000000"/>
                 <w:sz w:val="24"/>
               </w:rPr>
-              <w:t>Arora, Fosfuri và Gambardella (2001) [40]</w:t>
+              <w:t>Arora, Fosfuri và Gambardella (2001) [48]</w:t>
             </w:r>
           </w:p>
         </w:tc>
@@ -5751,7 +6043,7 @@
                 <w:color w:val="000000"/>
                 <w:sz w:val="24"/>
               </w:rPr>
-              <w:t>Mowery và cộng sự (2001) [74]</w:t>
+              <w:t>Mowery và cộng sự (2001) [86]</w:t>
             </w:r>
           </w:p>
         </w:tc>
@@ -5883,7 +6175,7 @@
                 <w:color w:val="000000"/>
                 <w:sz w:val="24"/>
               </w:rPr>
-              <w:t>Chesbrough (2003) [46]</w:t>
+              <w:t>Chesbrough (2003) [56]</w:t>
             </w:r>
           </w:p>
         </w:tc>
@@ -6015,7 +6307,7 @@
                 <w:color w:val="000000"/>
                 <w:sz w:val="24"/>
               </w:rPr>
-              <w:t>Gans và Stern (2003) [54]</w:t>
+              <w:t>Gans và Stern (2003) [66]</w:t>
             </w:r>
           </w:p>
         </w:tc>
@@ -6157,7 +6449,7 @@
                 <w:color w:val="000000"/>
                 <w:sz w:val="24"/>
               </w:rPr>
-              <w:t>Siegel, Waldman và Link (2003) [85]</w:t>
+              <w:t>Siegel, Waldman và Link (2003) [98]</w:t>
             </w:r>
           </w:p>
         </w:tc>
@@ -6299,7 +6591,7 @@
                 <w:color w:val="000000"/>
                 <w:sz w:val="24"/>
               </w:rPr>
-              <w:t>Gans, Hsu và Stern (2008) [55]</w:t>
+              <w:t>Gans, Hsu và Stern (2008) [67]</w:t>
             </w:r>
           </w:p>
         </w:tc>
@@ -6431,7 +6723,7 @@
                 <w:color w:val="000000"/>
                 <w:sz w:val="24"/>
               </w:rPr>
-              <w:t>OECD và Ngân hàng Thế giới (2014) [80]</w:t>
+              <w:t>OECD và Ngân hàng Thế giới (2014) [92]</w:t>
             </w:r>
           </w:p>
         </w:tc>
@@ -6563,7 +6855,7 @@
                 <w:color w:val="000000"/>
                 <w:sz w:val="24"/>
               </w:rPr>
-              <w:t>Haskel và Westlake (2018) [58]</w:t>
+              <w:t>Haskel và Westlake (2018) [70]</w:t>
             </w:r>
           </w:p>
         </w:tc>
@@ -6695,7 +6987,7 @@
                 <w:color w:val="000000"/>
                 <w:sz w:val="24"/>
               </w:rPr>
-              <w:t>Hochberg, Serrano và Ziedonis (2018) [60]</w:t>
+              <w:t>Hochberg, Serrano và Ziedonis (2018) [72]</w:t>
             </w:r>
           </w:p>
         </w:tc>
@@ -6827,7 +7119,7 @@
                 <w:color w:val="000000"/>
                 <w:sz w:val="24"/>
               </w:rPr>
-              <w:t>Mann (2018) [69]</w:t>
+              <w:t>Mann (2018) [81]</w:t>
             </w:r>
           </w:p>
         </w:tc>
@@ -6959,7 +7251,7 @@
                 <w:color w:val="000000"/>
                 <w:sz w:val="24"/>
               </w:rPr>
-              <w:t>Goldfarb và Tucker (2019) [56]</w:t>
+              <w:t>Goldfarb và Tucker (2019) [68]</w:t>
             </w:r>
           </w:p>
         </w:tc>
@@ -7091,7 +7383,7 @@
                 <w:color w:val="000000"/>
                 <w:sz w:val="24"/>
               </w:rPr>
-              <w:t>Fasi (2022) [50]</w:t>
+              <w:t>Fasi (2022) [62]</w:t>
             </w:r>
           </w:p>
         </w:tc>
@@ -7243,7 +7535,7 @@
                 <w:color w:val="000000"/>
                 <w:sz w:val="24"/>
               </w:rPr>
-              <w:t>Foster (2024) [53]</w:t>
+              <w:t>Foster (2024) [65]</w:t>
             </w:r>
           </w:p>
         </w:tc>
@@ -7375,7 +7667,7 @@
                 <w:color w:val="000000"/>
                 <w:sz w:val="24"/>
               </w:rPr>
-              <w:t>WIPO (2026) [94]</w:t>
+              <w:t>WIPO (2026) [110]</w:t>
             </w:r>
           </w:p>
         </w:tc>
@@ -7761,7 +8053,7 @@
                 <w:color w:val="000000"/>
                 <w:sz w:val="24"/>
               </w:rPr>
-              <w:t>Nguyễn Hữu Xuyên (2018) [38]</w:t>
+              <w:t>Nguyễn Hữu Xuyên (2018) [46]</w:t>
             </w:r>
           </w:p>
         </w:tc>
@@ -7893,7 +8185,7 @@
                 <w:color w:val="000000"/>
                 <w:sz w:val="24"/>
               </w:rPr>
-              <w:t>Hoàng Lan Phương (2019) [23]</w:t>
+              <w:t>Hoàng Lan Phương (2019) [29]</w:t>
             </w:r>
           </w:p>
         </w:tc>
@@ -8025,7 +8317,7 @@
                 <w:color w:val="000000"/>
                 <w:sz w:val="24"/>
               </w:rPr>
-              <w:t>Nguyễn Quốc Thịnh và cộng sự (2020) [30]</w:t>
+              <w:t>Nguyễn Quốc Thịnh và cộng sự (2020) [38]</w:t>
             </w:r>
           </w:p>
         </w:tc>
@@ -8157,7 +8449,7 @@
                 <w:color w:val="000000"/>
                 <w:sz w:val="24"/>
               </w:rPr>
-              <w:t>Phạm Hồng Quất và cộng sự (2021) [24]</w:t>
+              <w:t>Phạm Hồng Quất và cộng sự (2021) [30]</w:t>
             </w:r>
           </w:p>
         </w:tc>
@@ -8289,7 +8581,7 @@
                 <w:color w:val="000000"/>
                 <w:sz w:val="24"/>
               </w:rPr>
-              <w:t>Le Thi Thu Ha và cộng sự (2022) [64]</w:t>
+              <w:t>Le Thi Thu Ha và cộng sự (2022) [76]</w:t>
             </w:r>
           </w:p>
         </w:tc>
@@ -8421,7 +8713,7 @@
                 <w:color w:val="000000"/>
                 <w:sz w:val="24"/>
               </w:rPr>
-              <w:t>Le và Luong (2022) [63]</w:t>
+              <w:t>Le và Luong (2022) [75]</w:t>
             </w:r>
           </w:p>
         </w:tc>
@@ -8553,7 +8845,7 @@
                 <w:color w:val="000000"/>
                 <w:sz w:val="24"/>
               </w:rPr>
-              <w:t>Tran Van Hai (2022) [90]</w:t>
+              <w:t>Tran Van Hai (2022) [103]</w:t>
             </w:r>
           </w:p>
         </w:tc>
@@ -8685,7 +8977,7 @@
                 <w:color w:val="000000"/>
                 <w:sz w:val="24"/>
               </w:rPr>
-              <w:t>Nguyen Huu Xuyen (2024) [78]</w:t>
+              <w:t>Nguyen Huu Xuyen (2024) [90]</w:t>
             </w:r>
           </w:p>
         </w:tc>
@@ -8827,7 +9119,7 @@
                 <w:color w:val="000000"/>
                 <w:sz w:val="24"/>
               </w:rPr>
-              <w:t>Lâm Xuân Hùng (2025) [12]</w:t>
+              <w:t>Lâm Xuân Hùng (2025) [16]</w:t>
             </w:r>
           </w:p>
         </w:tc>
@@ -8979,7 +9271,7 @@
                 <w:color w:val="000000"/>
                 <w:sz w:val="24"/>
               </w:rPr>
-              <w:t>Lê Thị Thanh Tâm và Hoàng Thị Hải Yến (2025) [29]</w:t>
+              <w:t>Lê Thị Thanh Tâm và Hoàng Thị Hải Yến (2025) [36]</w:t>
             </w:r>
           </w:p>
         </w:tc>
@@ -9111,7 +9403,7 @@
                 <w:color w:val="000000"/>
                 <w:sz w:val="24"/>
               </w:rPr>
-              <w:t>Luu Hoang Long (2025a) [67]</w:t>
+              <w:t>Luu Hoang Long (2025a) [79]</w:t>
             </w:r>
           </w:p>
         </w:tc>
@@ -9243,7 +9535,7 @@
                 <w:color w:val="000000"/>
                 <w:sz w:val="24"/>
               </w:rPr>
-              <w:t>Luu Hoang Long (2025b) [68]</w:t>
+              <w:t>Luu Hoang Long (2025b) [80]</w:t>
             </w:r>
           </w:p>
         </w:tc>
@@ -9375,7 +9667,7 @@
                 <w:color w:val="000000"/>
                 <w:sz w:val="24"/>
               </w:rPr>
-              <w:t>Phạm Ngọc Pha (2025) [21]</w:t>
+              <w:t>Phạm Ngọc Pha (2025) [27]</w:t>
             </w:r>
           </w:p>
         </w:tc>
@@ -9507,7 +9799,7 @@
                 <w:color w:val="000000"/>
                 <w:sz w:val="24"/>
               </w:rPr>
-              <w:t>Dang Thanh Dat (2026) [47]</w:t>
+              <w:t>Dang Thanh Dat (2026) [58]</w:t>
             </w:r>
           </w:p>
         </w:tc>
@@ -9669,7 +9961,7 @@
                 <w:color w:val="000000"/>
                 <w:sz w:val="24"/>
               </w:rPr>
-              <w:t>Nguyễn Thanh Tùng (2026) [36]</w:t>
+              <w:t>Nguyễn Thanh Tùng (2026) [44]</w:t>
             </w:r>
           </w:p>
         </w:tc>
@@ -10044,7 +10336,7 @@
           <w:color w:val="000000"/>
           <w:sz w:val="26"/>
         </w:rPr>
-        <w:t>Thứ nhất, vấn đề còn tranh luận là mức độ can thiệp phù hợp của Nhà nước. Một hướng quan điểm nhấn mạnh vai trò của thị trường và cho rằng Nhà nước chủ yếu cần xác định rõ quyền và giảm chi phí giao dịch [40]; hướng quan điểm khác cho rằng Nhà nước cần chủ động kiến tạo thị trường và chấp nhận rủi ro [72]. Kinh nghiệm của Đạo luật Bayh-Dole cũng cho thấy tác động của việc trao quyền sở hữu kết quả nghiên cứu cho tổ chức chủ trì còn được đánh giá khác nhau [74], trong khi các nghiên cứu trong nước đề xuất áp dụng mô hình này [12].</w:t>
+        <w:t>Thứ nhất, vấn đề còn tranh luận là mức độ can thiệp phù hợp của Nhà nước. Một hướng quan điểm nhấn mạnh vai trò của thị trường và cho rằng Nhà nước chủ yếu cần xác định rõ quyền và giảm chi phí giao dịch [48]; hướng quan điểm khác cho rằng Nhà nước cần chủ động kiến tạo thị trường và chấp nhận rủi ro [84]. Kinh nghiệm của Đạo luật Bayh-Dole cũng cho thấy tác động của việc trao quyền sở hữu kết quả nghiên cứu cho tổ chức chủ trì còn được đánh giá khác nhau [86], trong khi các nghiên cứu trong nước đề xuất áp dụng mô hình này [16].</w:t>
       </w:r>
     </w:p>
     <w:p>
@@ -10350,7 +10642,7 @@
                 <w:color w:val="000000"/>
                 <w:sz w:val="24"/>
               </w:rPr>
-              <w:t>Nguyễn Quốc Thịnh và cộng sự (2020) [30]</w:t>
+              <w:t>Nguyễn Quốc Thịnh và cộng sự (2020) [38]</w:t>
             </w:r>
           </w:p>
         </w:tc>
@@ -10457,7 +10749,7 @@
                 <w:color w:val="000000"/>
                 <w:sz w:val="24"/>
               </w:rPr>
-              <w:t>Le Thi Thu Ha và cộng sự (2022) [64]</w:t>
+              <w:t>Le Thi Thu Ha và cộng sự (2022) [76]</w:t>
             </w:r>
           </w:p>
         </w:tc>
@@ -10564,7 +10856,7 @@
                 <w:color w:val="000000"/>
                 <w:sz w:val="24"/>
               </w:rPr>
-              <w:t>Le và Luong (2022) [63]</w:t>
+              <w:t>Le và Luong (2022) [75]</w:t>
             </w:r>
           </w:p>
         </w:tc>
@@ -10671,7 +10963,7 @@
                 <w:color w:val="000000"/>
                 <w:sz w:val="24"/>
               </w:rPr>
-              <w:t>Long Tran Viet và Hai Phan Thanh (2023) [65]</w:t>
+              <w:t>Long Tran Viet và Hai Phan Thanh (2023) [77]</w:t>
             </w:r>
           </w:p>
         </w:tc>
@@ -10778,7 +11070,7 @@
                 <w:color w:val="000000"/>
                 <w:sz w:val="24"/>
               </w:rPr>
-              <w:t>Nguyen Huu Xuyen (2024) [78]</w:t>
+              <w:t>Nguyen Huu Xuyen (2024) [90]</w:t>
             </w:r>
           </w:p>
         </w:tc>
@@ -10885,7 +11177,7 @@
                 <w:color w:val="000000"/>
                 <w:sz w:val="24"/>
               </w:rPr>
-              <w:t>Luu Hoang Long (2025a) [67]</w:t>
+              <w:t>Luu Hoang Long (2025a) [79]</w:t>
             </w:r>
           </w:p>
         </w:tc>
@@ -10992,7 +11284,7 @@
                 <w:color w:val="000000"/>
                 <w:sz w:val="24"/>
               </w:rPr>
-              <w:t>Luu Hoang Long (2025b) [68]</w:t>
+              <w:t>Luu Hoang Long (2025b) [80]</w:t>
             </w:r>
           </w:p>
         </w:tc>
@@ -11222,7 +11514,7 @@
           <w:color w:val="000000"/>
           <w:sz w:val="26"/>
         </w:rPr>
-        <w:t>Thứ tư, những thay đổi thể chế giai đoạn 2025-2026, gồm Luật Khoa học, công nghệ và đổi mới sáng tạo, Luật Sở hữu trí tuệ sửa đổi với Điều 8a về quản lý, khai thác quyền SHTT, Kết luận số 51-KL/TW và Quyết định số 1624/QĐ-TTg [2], [25], [26], [33], chưa được các công trình trước đây phân tích; khoảng cách giữa điều kiện quản lý hiện hữu và các yêu cầu mới về thị trường, định giá, tài chính hóa quyền SHTT vì vậy chưa được làm rõ.</w:t>
+        <w:t>Thứ tư, những thay đổi thể chế giai đoạn 2025-2026, gồm Luật Khoa học, công nghệ và đổi mới sáng tạo, Luật Sở hữu trí tuệ sửa đổi với Điều 8a về quản lý, khai thác quyền SHTT, Kết luận số 51-KL/TW và Quyết định số 1624/QĐ-TTg [2], [31], [32], [41], chưa được các công trình trước đây phân tích; khoảng cách giữa điều kiện quản lý hiện hữu và các yêu cầu mới về thị trường, định giá, tài chính hóa quyền SHTT vì vậy chưa được làm rõ.</w:t>
       </w:r>
     </w:p>
     <w:p>
@@ -11934,7 +12226,7 @@
           <w:color w:val="000000"/>
           <w:sz w:val="26"/>
         </w:rPr>
-        <w:t xml:space="preserve">[10] Nguyễn Chí Hải, Huỳnh Thị Ly Na (2021), “Đổi mới sáng tạo trong bối cảnh phát triển nền kinh tế số ở Việt Nam”, </w:t>
+        <w:t xml:space="preserve">[10] Nguyễn Thị Hải Hà (2023), “Đánh giá hiệu quả quản lý nhà nước trong nền kinh tế số”, </w:t>
       </w:r>
       <w:r>
         <w:rPr>
@@ -11944,7 +12236,7 @@
           <w:color w:val="000000"/>
           <w:sz w:val="26"/>
         </w:rPr>
-        <w:t>Tạp chí Ngân hàng</w:t>
+        <w:t>Tạp chí Phát triển bền vững Vùng</w:t>
       </w:r>
       <w:r>
         <w:rPr>
@@ -11954,7 +12246,7 @@
           <w:color w:val="000000"/>
           <w:sz w:val="26"/>
         </w:rPr>
-        <w:t>, (6).</w:t>
+        <w:t>, 13(2), 11-20.</w:t>
       </w:r>
     </w:p>
     <w:p>
@@ -11972,7 +12264,7 @@
           <w:color w:val="000000"/>
           <w:sz w:val="26"/>
         </w:rPr>
-        <w:t xml:space="preserve">[11] Trần Thị Thanh Huyền (2021), </w:t>
+        <w:t xml:space="preserve">[11] Nguyễn Chí Hải, Huỳnh Thị Ly Na (2021), “Đổi mới sáng tạo trong bối cảnh phát triển nền kinh tế số ở Việt Nam”, </w:t>
       </w:r>
       <w:r>
         <w:rPr>
@@ -11982,7 +12274,7 @@
           <w:color w:val="000000"/>
           <w:sz w:val="26"/>
         </w:rPr>
-        <w:t>Quyền sở hữu công nghiệp đối với nhãn hiệu trong thương mại điện tử</w:t>
+        <w:t>Tạp chí Ngân hàng</w:t>
       </w:r>
       <w:r>
         <w:rPr>
@@ -11992,7 +12284,7 @@
           <w:color w:val="000000"/>
           <w:sz w:val="26"/>
         </w:rPr>
-        <w:t>, Luận án tiến sĩ Luật học, Trường Đại học Luật Hà Nội, Hà Nội.</w:t>
+        <w:t>, (6).</w:t>
       </w:r>
     </w:p>
     <w:p>
@@ -12010,7 +12302,7 @@
           <w:color w:val="000000"/>
           <w:sz w:val="26"/>
         </w:rPr>
-        <w:t xml:space="preserve">[12] Lâm Xuân Hùng (2025), “Pháp luật về sở hữu trí tuệ trong kỷ nguyên mới”, </w:t>
+        <w:t xml:space="preserve">[12] Trần Văn Hải (2021), </w:t>
       </w:r>
       <w:r>
         <w:rPr>
@@ -12020,7 +12312,7 @@
           <w:color w:val="000000"/>
           <w:sz w:val="26"/>
         </w:rPr>
-        <w:t>Tạp chí Việt Nam Hội nhập</w:t>
+        <w:t>Chính sách pháp luật hình sự Việt Nam đối với các tội xâm phạm quyền sở hữu trí tuệ</w:t>
       </w:r>
       <w:r>
         <w:rPr>
@@ -12030,7 +12322,7 @@
           <w:color w:val="000000"/>
           <w:sz w:val="26"/>
         </w:rPr>
-        <w:t>, (371), 23-29.</w:t>
+        <w:t>, Luận án tiến sĩ Luật học, Học viện Khoa học xã hội, Hà Nội.</w:t>
       </w:r>
     </w:p>
     <w:p>
@@ -12048,7 +12340,7 @@
           <w:color w:val="000000"/>
           <w:sz w:val="26"/>
         </w:rPr>
-        <w:t xml:space="preserve">[13] Nguyễn Vĩnh Hưng, Phan Quốc Nguyên (2020), “Sự tác động của nền kinh tế số đến hệ thống pháp luật sở hữu trí tuệ tại Việt Nam”, </w:t>
+        <w:t xml:space="preserve">[13] Hứa Thị Hồng (2023), </w:t>
       </w:r>
       <w:r>
         <w:rPr>
@@ -12058,7 +12350,7 @@
           <w:color w:val="000000"/>
           <w:sz w:val="26"/>
         </w:rPr>
-        <w:t>Tạp chí Nghề Luật</w:t>
+        <w:t>Bảo vệ quyền sở hữu trí tuệ tại biên giới thông qua kiểm soát hàng hoá giả mạo về sở hữu trí tuệ của Hải quan Việt Nam</w:t>
       </w:r>
       <w:r>
         <w:rPr>
@@ -12068,7 +12360,7 @@
           <w:color w:val="000000"/>
           <w:sz w:val="26"/>
         </w:rPr>
-        <w:t>, (10).</w:t>
+        <w:t>, Luận án tiến sĩ Luật học, Trường Đại học Luật Hà Nội, Hà Nội.</w:t>
       </w:r>
     </w:p>
     <w:p>
@@ -12086,7 +12378,7 @@
           <w:color w:val="000000"/>
           <w:sz w:val="26"/>
         </w:rPr>
-        <w:t xml:space="preserve">[14] Nguyễn Văn Kim, Nguyễn Thị Ngọc Anh (2015), “Tác động của sáng chế đối với hoạt động nghiên cứu khoa học và phát triển tiềm lực khoa học và công nghệ”, </w:t>
+        <w:t xml:space="preserve">[14] Phạm Minh Huyền (2024), </w:t>
       </w:r>
       <w:r>
         <w:rPr>
@@ -12096,7 +12388,7 @@
           <w:color w:val="000000"/>
           <w:sz w:val="26"/>
         </w:rPr>
-        <w:t>Tạp chí Khoa học Đại học Quốc gia Hà Nội: Nghiên cứu Chính sách và Quản lý</w:t>
+        <w:t>Giới hạn quyền tác giả, quyền liên quan - Những vấn đề lý luận và thực tiễn</w:t>
       </w:r>
       <w:r>
         <w:rPr>
@@ -12106,7 +12398,7 @@
           <w:color w:val="000000"/>
           <w:sz w:val="26"/>
         </w:rPr>
-        <w:t>, 31(2), 14-23.</w:t>
+        <w:t>, Luận án tiến sĩ Luật học, Trường Đại học Luật Hà Nội, Hà Nội.</w:t>
       </w:r>
     </w:p>
     <w:p>
@@ -12124,7 +12416,7 @@
           <w:color w:val="000000"/>
           <w:sz w:val="26"/>
         </w:rPr>
-        <w:t xml:space="preserve">[15] Trần Nguyễn Mỹ Linh, Nguyễn Thị Hồ Điệp, Vũ Kiều Oanh (2025), “Phát triển kinh tế số tại Việt Nam: Thực trạng và giải pháp”, </w:t>
+        <w:t xml:space="preserve">[15] Trần Thị Thanh Huyền (2021), </w:t>
       </w:r>
       <w:r>
         <w:rPr>
@@ -12134,7 +12426,7 @@
           <w:color w:val="000000"/>
           <w:sz w:val="26"/>
         </w:rPr>
-        <w:t>Tạp chí Thông tin Khoa học xã hội</w:t>
+        <w:t>Quyền sở hữu công nghiệp đối với nhãn hiệu trong thương mại điện tử</w:t>
       </w:r>
       <w:r>
         <w:rPr>
@@ -12144,7 +12436,7 @@
           <w:color w:val="000000"/>
           <w:sz w:val="26"/>
         </w:rPr>
-        <w:t>, (9).</w:t>
+        <w:t>, Luận án tiến sĩ Luật học, Trường Đại học Luật Hà Nội, Hà Nội.</w:t>
       </w:r>
     </w:p>
     <w:p>
@@ -12162,7 +12454,7 @@
           <w:color w:val="000000"/>
           <w:sz w:val="26"/>
         </w:rPr>
-        <w:t xml:space="preserve">[16] Phạm Trung Luân (2025), “Chuyển giao công nghệ đảm bảo tài sản trí tuệ cho doanh nghiệp sáng tạo”, </w:t>
+        <w:t xml:space="preserve">[16] Lâm Xuân Hùng (2025), “Pháp luật về sở hữu trí tuệ trong kỷ nguyên mới”, </w:t>
       </w:r>
       <w:r>
         <w:rPr>
@@ -12182,7 +12474,7 @@
           <w:color w:val="000000"/>
           <w:sz w:val="26"/>
         </w:rPr>
-        <w:t>, (371), 82-87.</w:t>
+        <w:t>, (371), 23-29.</w:t>
       </w:r>
     </w:p>
     <w:p>
@@ -12200,7 +12492,7 @@
           <w:color w:val="000000"/>
           <w:sz w:val="26"/>
         </w:rPr>
-        <w:t xml:space="preserve">[17] Đoàn Đức Lương (2009), “Vai trò của sở hữu trí tuệ trong nghiên cứu khoa học và chuyển giao công nghệ trong các trường đại học”, </w:t>
+        <w:t xml:space="preserve">[17] Nguyễn Vĩnh Hưng, Phan Quốc Nguyên (2020), “Sự tác động của nền kinh tế số đến hệ thống pháp luật sở hữu trí tuệ tại Việt Nam”, </w:t>
       </w:r>
       <w:r>
         <w:rPr>
@@ -12210,7 +12502,7 @@
           <w:color w:val="000000"/>
           <w:sz w:val="26"/>
         </w:rPr>
-        <w:t>Tạp chí Khoa học Đại học Huế</w:t>
+        <w:t>Tạp chí Nghề Luật</w:t>
       </w:r>
       <w:r>
         <w:rPr>
@@ -12220,7 +12512,7 @@
           <w:color w:val="000000"/>
           <w:sz w:val="26"/>
         </w:rPr>
-        <w:t>, (51), 97-103.</w:t>
+        <w:t>, (10).</w:t>
       </w:r>
     </w:p>
     <w:p>
@@ -12238,7 +12530,7 @@
           <w:color w:val="000000"/>
           <w:sz w:val="26"/>
         </w:rPr>
-        <w:t xml:space="preserve">[18] Đoàn Đức Lương, Ngô Minh Tiến (2022), “Khai thác tài sản trí tuệ mang yếu tố địa danh ở tỉnh Quảng Ngãi: Thực trạng và một số tồn tại hạn chế”, </w:t>
+        <w:t xml:space="preserve">[18] Nguyễn Văn Kim, Nguyễn Thị Ngọc Anh (2015), “Tác động của sáng chế đối với hoạt động nghiên cứu khoa học và phát triển tiềm lực khoa học và công nghệ”, </w:t>
       </w:r>
       <w:r>
         <w:rPr>
@@ -12248,7 +12540,7 @@
           <w:color w:val="000000"/>
           <w:sz w:val="26"/>
         </w:rPr>
-        <w:t>Tạp chí Pháp luật và Thực tiễn</w:t>
+        <w:t>Tạp chí Khoa học Đại học Quốc gia Hà Nội: Nghiên cứu Chính sách và Quản lý</w:t>
       </w:r>
       <w:r>
         <w:rPr>
@@ -12258,7 +12550,7 @@
           <w:color w:val="000000"/>
           <w:sz w:val="26"/>
         </w:rPr>
-        <w:t>, (51), 79-88.</w:t>
+        <w:t>, 31(2), 14-23.</w:t>
       </w:r>
     </w:p>
     <w:p>
@@ -12276,7 +12568,7 @@
           <w:color w:val="000000"/>
           <w:sz w:val="26"/>
         </w:rPr>
-        <w:t xml:space="preserve">[19] Lê Nết (2006), </w:t>
+        <w:t xml:space="preserve">[19] Trần Thị Lan (2025), </w:t>
       </w:r>
       <w:r>
         <w:rPr>
@@ -12286,7 +12578,7 @@
           <w:color w:val="000000"/>
           <w:sz w:val="26"/>
         </w:rPr>
-        <w:t>Quyền sở hữu trí tuệ</w:t>
+        <w:t>Các yếu tố ảnh hưởng đến phát triển kinh tế số ở Việt Nam</w:t>
       </w:r>
       <w:r>
         <w:rPr>
@@ -12296,7 +12588,7 @@
           <w:color w:val="000000"/>
           <w:sz w:val="26"/>
         </w:rPr>
-        <w:t>, Nhà xuất bản Đại học Quốc gia Thành phố Hồ Chí Minh, Thành phố Hồ Chí Minh.</w:t>
+        <w:t>, Luận án tiến sĩ Kinh tế, Học viện Khoa học xã hội, Hà Nội.</w:t>
       </w:r>
     </w:p>
     <w:p>
@@ -12314,7 +12606,7 @@
           <w:color w:val="000000"/>
           <w:sz w:val="26"/>
         </w:rPr>
-        <w:t xml:space="preserve">[20] Hồ Thúy Ngọc (2025), </w:t>
+        <w:t xml:space="preserve">[20] Trần Nguyễn Mỹ Linh, Nguyễn Thị Hồ Điệp, Vũ Kiều Oanh (2025), “Phát triển kinh tế số tại Việt Nam: Thực trạng và giải pháp”, </w:t>
       </w:r>
       <w:r>
         <w:rPr>
@@ -12324,7 +12616,7 @@
           <w:color w:val="000000"/>
           <w:sz w:val="26"/>
         </w:rPr>
-        <w:t>Bảo hộ quyền sở hữu trí tuệ đối với các sản phẩm tạo ra từ trí tuệ nhân tạo</w:t>
+        <w:t>Tạp chí Thông tin Khoa học xã hội</w:t>
       </w:r>
       <w:r>
         <w:rPr>
@@ -12334,7 +12626,7 @@
           <w:color w:val="000000"/>
           <w:sz w:val="26"/>
         </w:rPr>
-        <w:t>, Luận án tiến sĩ Luật học, Trường Đại học Luật Thành phố Hồ Chí Minh, Thành phố Hồ Chí Minh.</w:t>
+        <w:t>, (9).</w:t>
       </w:r>
     </w:p>
     <w:p>
@@ -12352,7 +12644,7 @@
           <w:color w:val="000000"/>
           <w:sz w:val="26"/>
         </w:rPr>
-        <w:t xml:space="preserve">[21] Phạm Ngọc Pha (2025), “Mô hình khai thác sáng chế hỗ trợ doanh nghiệp nâng cao trình độ và năng lực công nghệ”, </w:t>
+        <w:t xml:space="preserve">[21] Phạm Trung Luân (2025), “Chuyển giao công nghệ đảm bảo tài sản trí tuệ cho doanh nghiệp sáng tạo”, </w:t>
       </w:r>
       <w:r>
         <w:rPr>
@@ -12362,7 +12654,7 @@
           <w:color w:val="000000"/>
           <w:sz w:val="26"/>
         </w:rPr>
-        <w:t>Tạp chí Khoa học và Công nghệ Việt Nam</w:t>
+        <w:t>Tạp chí Việt Nam Hội nhập</w:t>
       </w:r>
       <w:r>
         <w:rPr>
@@ -12372,7 +12664,7 @@
           <w:color w:val="000000"/>
           <w:sz w:val="26"/>
         </w:rPr>
-        <w:t>, (2), 15-18.</w:t>
+        <w:t>, (371), 82-87.</w:t>
       </w:r>
     </w:p>
     <w:p>
@@ -12390,7 +12682,7 @@
           <w:color w:val="000000"/>
           <w:sz w:val="26"/>
         </w:rPr>
-        <w:t xml:space="preserve">[22] Nguyễn Văn Phúc (2025), “Bảo hộ và khai thác quyền sở hữu trí tuệ đối với nhãn hiệu có nguồn gốc từ tri thức truyền thống: Thực tiễn tại tỉnh Thừa Thiên Huế”, </w:t>
+        <w:t xml:space="preserve">[22] Đoàn Đức Lương (2009), “Vai trò của sở hữu trí tuệ trong nghiên cứu khoa học và chuyển giao công nghệ trong các trường đại học”, </w:t>
       </w:r>
       <w:r>
         <w:rPr>
@@ -12400,7 +12692,7 @@
           <w:color w:val="000000"/>
           <w:sz w:val="26"/>
         </w:rPr>
-        <w:t>Tạp chí Khoa học Đại học Huế: Khoa học Xã hội và Nhân văn</w:t>
+        <w:t>Tạp chí Khoa học Đại học Huế</w:t>
       </w:r>
       <w:r>
         <w:rPr>
@@ -12410,7 +12702,7 @@
           <w:color w:val="000000"/>
           <w:sz w:val="26"/>
         </w:rPr>
-        <w:t>, 134(6S-1), 111-124.</w:t>
+        <w:t>, (51), 97-103.</w:t>
       </w:r>
     </w:p>
     <w:p>
@@ -12428,7 +12720,7 @@
           <w:color w:val="000000"/>
           <w:sz w:val="26"/>
         </w:rPr>
-        <w:t xml:space="preserve">[23] Hoàng Lan Phương (2019), “Pháp luật về chuyển quyền sử dụng nhãn hiệu: Những bất cập cần khắc phục”, </w:t>
+        <w:t xml:space="preserve">[23] Đoàn Đức Lương, Ngô Minh Tiến (2022), “Khai thác tài sản trí tuệ mang yếu tố địa danh ở tỉnh Quảng Ngãi: Thực trạng và một số tồn tại hạn chế”, </w:t>
       </w:r>
       <w:r>
         <w:rPr>
@@ -12438,7 +12730,7 @@
           <w:color w:val="000000"/>
           <w:sz w:val="26"/>
         </w:rPr>
-        <w:t>Tạp chí Khoa học và Công nghệ Việt Nam</w:t>
+        <w:t>Tạp chí Pháp luật và Thực tiễn</w:t>
       </w:r>
       <w:r>
         <w:rPr>
@@ -12448,7 +12740,7 @@
           <w:color w:val="000000"/>
           <w:sz w:val="26"/>
         </w:rPr>
-        <w:t>, 61(10), 29-33.</w:t>
+        <w:t>, (51), 79-88.</w:t>
       </w:r>
     </w:p>
     <w:p>
@@ -12466,7 +12758,7 @@
           <w:color w:val="000000"/>
           <w:sz w:val="26"/>
         </w:rPr>
-        <w:t xml:space="preserve">[24] Phạm Hồng Quất, Lương Văn Thường, Nguyễn Minh Ngọc, Lê Ngọc Mỹ (2021), “Khai thác tài sản trí tuệ thúc đẩy phát triển hệ sinh thái khởi nghiệp đổi mới sáng tạo và hệ thống đổi mới sáng tạo ở Việt Nam”, </w:t>
+        <w:t xml:space="preserve">[24] Lê Nết (2006), </w:t>
       </w:r>
       <w:r>
         <w:rPr>
@@ -12476,7 +12768,7 @@
           <w:color w:val="000000"/>
           <w:sz w:val="26"/>
         </w:rPr>
-        <w:t>Tạp chí Chính sách và Quản lý Khoa học và Công nghệ</w:t>
+        <w:t>Quyền sở hữu trí tuệ</w:t>
       </w:r>
       <w:r>
         <w:rPr>
@@ -12486,7 +12778,7 @@
           <w:color w:val="000000"/>
           <w:sz w:val="26"/>
         </w:rPr>
-        <w:t>, 10(4), 60-73.</w:t>
+        <w:t>, Nhà xuất bản Đại học Quốc gia Thành phố Hồ Chí Minh, Thành phố Hồ Chí Minh.</w:t>
       </w:r>
     </w:p>
     <w:p>
@@ -12504,7 +12796,7 @@
           <w:color w:val="000000"/>
           <w:sz w:val="26"/>
         </w:rPr>
-        <w:t xml:space="preserve">[25] Quốc hội (2025), </w:t>
+        <w:t xml:space="preserve">[25] Nguyễn Thị Tuyết Nga (2025), “Hoàn thiện chính sách sở hữu trí tuệ trong nền kinh tế số ở Việt Nam hiện nay”, </w:t>
       </w:r>
       <w:r>
         <w:rPr>
@@ -12514,7 +12806,7 @@
           <w:color w:val="000000"/>
           <w:sz w:val="26"/>
         </w:rPr>
-        <w:t>Luật Khoa học, công nghệ và đổi mới sáng tạo số 93/2025/QH15 ngày 27/6/2025</w:t>
+        <w:t>Tạp chí Quản lý nhà nước</w:t>
       </w:r>
       <w:r>
         <w:rPr>
@@ -12524,7 +12816,7 @@
           <w:color w:val="000000"/>
           <w:sz w:val="26"/>
         </w:rPr>
-        <w:t>.</w:t>
+        <w:t xml:space="preserve"> (điện tử), đăng ngày 30/6/2025, quanlynhanuoc.vn.</w:t>
       </w:r>
     </w:p>
     <w:p>
@@ -12542,7 +12834,7 @@
           <w:color w:val="000000"/>
           <w:sz w:val="26"/>
         </w:rPr>
-        <w:t xml:space="preserve">[26] Quốc hội (2025), </w:t>
+        <w:t xml:space="preserve">[26] Hồ Thúy Ngọc (2025), </w:t>
       </w:r>
       <w:r>
         <w:rPr>
@@ -12552,7 +12844,7 @@
           <w:color w:val="000000"/>
           <w:sz w:val="26"/>
         </w:rPr>
-        <w:t>Luật sửa đổi, bổ sung một số điều của Luật Sở hữu trí tuệ số 131/2025/QH15 ngày 10/12/2025</w:t>
+        <w:t>Bảo hộ quyền sở hữu trí tuệ đối với các sản phẩm tạo ra từ trí tuệ nhân tạo</w:t>
       </w:r>
       <w:r>
         <w:rPr>
@@ -12562,7 +12854,7 @@
           <w:color w:val="000000"/>
           <w:sz w:val="26"/>
         </w:rPr>
-        <w:t>.</w:t>
+        <w:t>, Luận án tiến sĩ Luật học, Trường Đại học Luật Thành phố Hồ Chí Minh, Thành phố Hồ Chí Minh.</w:t>
       </w:r>
     </w:p>
     <w:p>
@@ -12580,7 +12872,7 @@
           <w:color w:val="000000"/>
           <w:sz w:val="26"/>
         </w:rPr>
-        <w:t xml:space="preserve">[27] Quốc hội (2025), </w:t>
+        <w:t xml:space="preserve">[27] Phạm Ngọc Pha (2025), “Mô hình khai thác sáng chế hỗ trợ doanh nghiệp nâng cao trình độ và năng lực công nghệ”, </w:t>
       </w:r>
       <w:r>
         <w:rPr>
@@ -12590,7 +12882,7 @@
           <w:color w:val="000000"/>
           <w:sz w:val="26"/>
         </w:rPr>
-        <w:t>Luật Chuyển đổi số số 148/2025/QH15 ngày 11/12/2025</w:t>
+        <w:t>Tạp chí Khoa học và Công nghệ Việt Nam</w:t>
       </w:r>
       <w:r>
         <w:rPr>
@@ -12600,7 +12892,7 @@
           <w:color w:val="000000"/>
           <w:sz w:val="26"/>
         </w:rPr>
-        <w:t>.</w:t>
+        <w:t>, (2), 15-18.</w:t>
       </w:r>
     </w:p>
     <w:p>
@@ -12618,7 +12910,7 @@
           <w:color w:val="000000"/>
           <w:sz w:val="26"/>
         </w:rPr>
-        <w:t xml:space="preserve">[28] Hồ Thức Tài (2019), “Chính sách phát triển nền kinh tế số ở Việt Nam”, </w:t>
+        <w:t xml:space="preserve">[28] Nguyễn Văn Phúc (2025), “Bảo hộ và khai thác quyền sở hữu trí tuệ đối với nhãn hiệu có nguồn gốc từ tri thức truyền thống: Thực tiễn tại tỉnh Thừa Thiên Huế”, </w:t>
       </w:r>
       <w:r>
         <w:rPr>
@@ -12628,7 +12920,7 @@
           <w:color w:val="000000"/>
           <w:sz w:val="26"/>
         </w:rPr>
-        <w:t>Tạp chí Công Thương</w:t>
+        <w:t>Tạp chí Khoa học Đại học Huế: Khoa học Xã hội và Nhân văn</w:t>
       </w:r>
       <w:r>
         <w:rPr>
@@ -12638,7 +12930,7 @@
           <w:color w:val="000000"/>
           <w:sz w:val="26"/>
         </w:rPr>
-        <w:t>, (13), 36-41.</w:t>
+        <w:t>, 134(6S-1), 111-124.</w:t>
       </w:r>
     </w:p>
     <w:p>
@@ -12656,7 +12948,7 @@
           <w:color w:val="000000"/>
           <w:sz w:val="26"/>
         </w:rPr>
-        <w:t xml:space="preserve">[29] Lê Thị Thanh Tâm, Hoàng Thị Hải Yến (2025), “Thương mại hóa sáng chế thông qua hoạt động chuyển giao công nghệ theo pháp luật Việt Nam”, </w:t>
+        <w:t xml:space="preserve">[29] Hoàng Lan Phương (2019), “Pháp luật về chuyển quyền sử dụng nhãn hiệu: Những bất cập cần khắc phục”, </w:t>
       </w:r>
       <w:r>
         <w:rPr>
@@ -12666,7 +12958,7 @@
           <w:color w:val="000000"/>
           <w:sz w:val="26"/>
         </w:rPr>
-        <w:t>Tạp chí Khoa học Đại học Huế: Khoa học Xã hội và Nhân văn</w:t>
+        <w:t>Tạp chí Khoa học và Công nghệ Việt Nam</w:t>
       </w:r>
       <w:r>
         <w:rPr>
@@ -12676,7 +12968,7 @@
           <w:color w:val="000000"/>
           <w:sz w:val="26"/>
         </w:rPr>
-        <w:t>, 134(6D), 35-46.</w:t>
+        <w:t>, 61(10), 29-33.</w:t>
       </w:r>
     </w:p>
     <w:p>
@@ -12694,7 +12986,7 @@
           <w:color w:val="000000"/>
           <w:sz w:val="26"/>
         </w:rPr>
-        <w:t xml:space="preserve">[30] Nguyễn Quốc Thịnh, Khúc Đại Long, Nguyễn Thu Hương (2020), “Quản trị tài sản trí tuệ trong doanh nghiệp Việt Nam: Động lực cho sự khác biệt hóa”, </w:t>
+        <w:t xml:space="preserve">[30] Phạm Hồng Quất, Lương Văn Thường, Nguyễn Minh Ngọc, Lê Ngọc Mỹ (2021), “Khai thác tài sản trí tuệ thúc đẩy phát triển hệ sinh thái khởi nghiệp đổi mới sáng tạo và hệ thống đổi mới sáng tạo ở Việt Nam”, </w:t>
       </w:r>
       <w:r>
         <w:rPr>
@@ -12704,7 +12996,7 @@
           <w:color w:val="000000"/>
           <w:sz w:val="26"/>
         </w:rPr>
-        <w:t>Tạp chí Khoa học Thương mại</w:t>
+        <w:t>Tạp chí Chính sách và Quản lý Khoa học và Công nghệ</w:t>
       </w:r>
       <w:r>
         <w:rPr>
@@ -12714,7 +13006,7 @@
           <w:color w:val="000000"/>
           <w:sz w:val="26"/>
         </w:rPr>
-        <w:t>, (143), 38-44.</w:t>
+        <w:t>, 10(4), 60-73.</w:t>
       </w:r>
     </w:p>
     <w:p>
@@ -12732,7 +13024,7 @@
           <w:color w:val="000000"/>
           <w:sz w:val="26"/>
         </w:rPr>
-        <w:t xml:space="preserve">[31] Hoàng Văn Thùy (2024), “Bảo vệ quyền sở hữu trí tuệ trong kinh tế số”, </w:t>
+        <w:t xml:space="preserve">[31] Quốc hội (2025), </w:t>
       </w:r>
       <w:r>
         <w:rPr>
@@ -12742,7 +13034,7 @@
           <w:color w:val="000000"/>
           <w:sz w:val="26"/>
         </w:rPr>
-        <w:t>Tạp chí Nghề Luật</w:t>
+        <w:t>Luật Khoa học, công nghệ và đổi mới sáng tạo số 93/2025/QH15 ngày 27/6/2025</w:t>
       </w:r>
       <w:r>
         <w:rPr>
@@ -12752,7 +13044,7 @@
           <w:color w:val="000000"/>
           <w:sz w:val="26"/>
         </w:rPr>
-        <w:t>, (1), 21-25.</w:t>
+        <w:t>.</w:t>
       </w:r>
     </w:p>
     <w:p>
@@ -12770,7 +13062,7 @@
           <w:color w:val="000000"/>
           <w:sz w:val="26"/>
         </w:rPr>
-        <w:t xml:space="preserve">[32] Thủ tướng Chính phủ (2019), </w:t>
+        <w:t xml:space="preserve">[32] Quốc hội (2025), </w:t>
       </w:r>
       <w:r>
         <w:rPr>
@@ -12780,7 +13072,7 @@
           <w:color w:val="000000"/>
           <w:sz w:val="26"/>
         </w:rPr>
-        <w:t>Quyết định số 1068/QĐ-TTg ngày 22/8/2019 phê duyệt Chiến lược sở hữu trí tuệ đến năm 2030</w:t>
+        <w:t>Luật sửa đổi, bổ sung một số điều của Luật Sở hữu trí tuệ số 131/2025/QH15 ngày 10/12/2025</w:t>
       </w:r>
       <w:r>
         <w:rPr>
@@ -12790,7 +13082,7 @@
           <w:color w:val="000000"/>
           <w:sz w:val="26"/>
         </w:rPr>
-        <w:t>, Hà Nội.</w:t>
+        <w:t>.</w:t>
       </w:r>
     </w:p>
     <w:p>
@@ -12808,7 +13100,7 @@
           <w:color w:val="000000"/>
           <w:sz w:val="26"/>
         </w:rPr>
-        <w:t xml:space="preserve">[33] Thủ tướng Chính phủ (2026), </w:t>
+        <w:t xml:space="preserve">[33] Quốc hội (2025), </w:t>
       </w:r>
       <w:r>
         <w:rPr>
@@ -12818,7 +13110,7 @@
           <w:color w:val="000000"/>
           <w:sz w:val="26"/>
         </w:rPr>
-        <w:t>Quyết định số 1624/QĐ-TTg ngày 21/8/2026 sửa đổi, bổ sung một số điều của Quyết định số 1068/QĐ-TTg ngày 22/8/2019 phê duyệt Chiến lược sở hữu trí tuệ đến năm 2030</w:t>
+        <w:t>Luật Chuyển đổi số số 148/2025/QH15 ngày 11/12/2025</w:t>
       </w:r>
       <w:r>
         <w:rPr>
@@ -12828,7 +13120,7 @@
           <w:color w:val="000000"/>
           <w:sz w:val="26"/>
         </w:rPr>
-        <w:t>, Hà Nội.</w:t>
+        <w:t>.</w:t>
       </w:r>
     </w:p>
     <w:p>
@@ -12846,7 +13138,7 @@
           <w:color w:val="000000"/>
           <w:sz w:val="26"/>
         </w:rPr>
-        <w:t xml:space="preserve">[34] Lê Thị Bích Thủy (2021), </w:t>
+        <w:t xml:space="preserve">[34] Ngô Hoài Sơn, Nguyễn Lê Kim Kiều (2022), “Vận dụng lý thuyết phương pháp quản lý nhà nước về kinh tế để xây dựng nền kinh tế số ở Việt Nam”, </w:t>
       </w:r>
       <w:r>
         <w:rPr>
@@ -12856,7 +13148,7 @@
           <w:color w:val="000000"/>
           <w:sz w:val="26"/>
         </w:rPr>
-        <w:t>Bảo hộ quyền sở hữu trí tuệ đối với sáng chế liên quan đến dược phẩm tại Việt Nam trong điều kiện hội nhập kinh tế quốc tế</w:t>
+        <w:t>Tạp chí Công Thương</w:t>
       </w:r>
       <w:r>
         <w:rPr>
@@ -12866,7 +13158,7 @@
           <w:color w:val="000000"/>
           <w:sz w:val="26"/>
         </w:rPr>
-        <w:t>, Luận án tiến sĩ Luật học, Trường Đại học Luật Hà Nội, Hà Nội.</w:t>
+        <w:t>, (21), 248-254.</w:t>
       </w:r>
     </w:p>
     <w:p>
@@ -12884,7 +13176,7 @@
           <w:color w:val="000000"/>
           <w:sz w:val="26"/>
         </w:rPr>
-        <w:t xml:space="preserve">[35] Nguyễn Minh Huyền Trang (2025), “Quản trị tài sản trí tuệ tại các cơ sở giáo dục đại học: Cơ hội và thách thức trong bối cảnh cuộc Cách mạng công nghiệp 4.0”, </w:t>
+        <w:t xml:space="preserve">[35] Hồ Thức Tài (2019), “Chính sách phát triển nền kinh tế số ở Việt Nam”, </w:t>
       </w:r>
       <w:r>
         <w:rPr>
@@ -12894,7 +13186,7 @@
           <w:color w:val="000000"/>
           <w:sz w:val="26"/>
         </w:rPr>
-        <w:t>Tạp chí Khoa học Trường Đại học Sư phạm Thành phố Hồ Chí Minh</w:t>
+        <w:t>Tạp chí Công Thương</w:t>
       </w:r>
       <w:r>
         <w:rPr>
@@ -12904,7 +13196,7 @@
           <w:color w:val="000000"/>
           <w:sz w:val="26"/>
         </w:rPr>
-        <w:t>, 22(1), 123-131.</w:t>
+        <w:t>, (13), 36-41.</w:t>
       </w:r>
     </w:p>
     <w:p>
@@ -12922,7 +13214,7 @@
           <w:color w:val="000000"/>
           <w:sz w:val="26"/>
         </w:rPr>
-        <w:t xml:space="preserve">[36] Nguyễn Thanh Tùng (2026), “Một số hạn chế, bất cập của pháp luật Việt Nam về hợp đồng chuyển giao quyền sử dụng nhãn hiệu và giải pháp hoàn thiện”, </w:t>
+        <w:t xml:space="preserve">[36] Lê Thị Thanh Tâm, Hoàng Thị Hải Yến (2025), “Thương mại hóa sáng chế thông qua hoạt động chuyển giao công nghệ theo pháp luật Việt Nam”, </w:t>
       </w:r>
       <w:r>
         <w:rPr>
@@ -12942,7 +13234,7 @@
           <w:color w:val="000000"/>
           <w:sz w:val="26"/>
         </w:rPr>
-        <w:t>, 135(6A), 23-34.</w:t>
+        <w:t>, 134(6D), 35-46.</w:t>
       </w:r>
     </w:p>
     <w:p>
@@ -12960,7 +13252,7 @@
           <w:color w:val="000000"/>
           <w:sz w:val="26"/>
         </w:rPr>
-        <w:t xml:space="preserve">[37] Nguyễn Thị Tố Uyên, Nguyễn Hữu Việt (2023), “Một số vấn đề về thực hiện chính sách phát triển tài sản trí tuệ của Nhà nước tại địa phương”, </w:t>
+        <w:t xml:space="preserve">[37] Nguyễn Phương Thảo (2024), “Phương pháp đo lường kinh tế số của các tổ chức trên thế giới và đề xuất cho Việt Nam”, </w:t>
       </w:r>
       <w:r>
         <w:rPr>
@@ -12970,7 +13262,7 @@
           <w:color w:val="000000"/>
           <w:sz w:val="26"/>
         </w:rPr>
-        <w:t>Tạp chí Nghiên cứu khoa học và Phát triển</w:t>
+        <w:t>Tạp chí Kinh tế và Dự báo</w:t>
       </w:r>
       <w:r>
         <w:rPr>
@@ -12980,7 +13272,7 @@
           <w:color w:val="000000"/>
           <w:sz w:val="26"/>
         </w:rPr>
-        <w:t>, 2(4), 56-65.</w:t>
+        <w:t>, (21), 27-30.</w:t>
       </w:r>
     </w:p>
     <w:p>
@@ -12998,7 +13290,311 @@
           <w:color w:val="000000"/>
           <w:sz w:val="26"/>
         </w:rPr>
-        <w:t xml:space="preserve">[38] Nguyễn Hữu Xuyên (2018), “Những nút thắt trong khai thác, thương mại hóa sáng chế”, </w:t>
+        <w:t xml:space="preserve">[38] Nguyễn Quốc Thịnh, Khúc Đại Long, Nguyễn Thu Hương (2020), “Quản trị tài sản trí tuệ trong doanh nghiệp Việt Nam: Động lực cho sự khác biệt hóa”, </w:t>
+      </w:r>
+      <w:r>
+        <w:rPr>
+          <w:rFonts w:ascii="Times New Roman" w:hAnsi="Times New Roman" w:eastAsia="Times New Roman" w:cs="Times New Roman"/>
+          <w:b w:val="0"/>
+          <w:i/>
+          <w:color w:val="000000"/>
+          <w:sz w:val="26"/>
+        </w:rPr>
+        <w:t>Tạp chí Khoa học Thương mại</w:t>
+      </w:r>
+      <w:r>
+        <w:rPr>
+          <w:rFonts w:ascii="Times New Roman" w:hAnsi="Times New Roman" w:eastAsia="Times New Roman" w:cs="Times New Roman"/>
+          <w:b w:val="0"/>
+          <w:i w:val="0"/>
+          <w:color w:val="000000"/>
+          <w:sz w:val="26"/>
+        </w:rPr>
+        <w:t>, (143), 38-44.</w:t>
+      </w:r>
+    </w:p>
+    <w:p>
+      <w:pPr>
+        <w:keepNext w:val="0"/>
+        <w:spacing w:before="0" w:after="40" w:line="312" w:lineRule="auto"/>
+        <w:ind w:left="567" w:hanging="567"/>
+        <w:jc w:val="both"/>
+      </w:pPr>
+      <w:r>
+        <w:rPr>
+          <w:rFonts w:ascii="Times New Roman" w:hAnsi="Times New Roman" w:eastAsia="Times New Roman" w:cs="Times New Roman"/>
+          <w:b w:val="0"/>
+          <w:i w:val="0"/>
+          <w:color w:val="000000"/>
+          <w:sz w:val="26"/>
+        </w:rPr>
+        <w:t xml:space="preserve">[39] Hoàng Văn Thùy (2024), “Bảo vệ quyền sở hữu trí tuệ trong kinh tế số”, </w:t>
+      </w:r>
+      <w:r>
+        <w:rPr>
+          <w:rFonts w:ascii="Times New Roman" w:hAnsi="Times New Roman" w:eastAsia="Times New Roman" w:cs="Times New Roman"/>
+          <w:b w:val="0"/>
+          <w:i/>
+          <w:color w:val="000000"/>
+          <w:sz w:val="26"/>
+        </w:rPr>
+        <w:t>Tạp chí Nghề Luật</w:t>
+      </w:r>
+      <w:r>
+        <w:rPr>
+          <w:rFonts w:ascii="Times New Roman" w:hAnsi="Times New Roman" w:eastAsia="Times New Roman" w:cs="Times New Roman"/>
+          <w:b w:val="0"/>
+          <w:i w:val="0"/>
+          <w:color w:val="000000"/>
+          <w:sz w:val="26"/>
+        </w:rPr>
+        <w:t>, (1), 21-25.</w:t>
+      </w:r>
+    </w:p>
+    <w:p>
+      <w:pPr>
+        <w:keepNext w:val="0"/>
+        <w:spacing w:before="0" w:after="40" w:line="312" w:lineRule="auto"/>
+        <w:ind w:left="567" w:hanging="567"/>
+        <w:jc w:val="both"/>
+      </w:pPr>
+      <w:r>
+        <w:rPr>
+          <w:rFonts w:ascii="Times New Roman" w:hAnsi="Times New Roman" w:eastAsia="Times New Roman" w:cs="Times New Roman"/>
+          <w:b w:val="0"/>
+          <w:i w:val="0"/>
+          <w:color w:val="000000"/>
+          <w:sz w:val="26"/>
+        </w:rPr>
+        <w:t xml:space="preserve">[40] Thủ tướng Chính phủ (2019), </w:t>
+      </w:r>
+      <w:r>
+        <w:rPr>
+          <w:rFonts w:ascii="Times New Roman" w:hAnsi="Times New Roman" w:eastAsia="Times New Roman" w:cs="Times New Roman"/>
+          <w:b w:val="0"/>
+          <w:i/>
+          <w:color w:val="000000"/>
+          <w:sz w:val="26"/>
+        </w:rPr>
+        <w:t>Quyết định số 1068/QĐ-TTg ngày 22/8/2019 phê duyệt Chiến lược sở hữu trí tuệ đến năm 2030</w:t>
+      </w:r>
+      <w:r>
+        <w:rPr>
+          <w:rFonts w:ascii="Times New Roman" w:hAnsi="Times New Roman" w:eastAsia="Times New Roman" w:cs="Times New Roman"/>
+          <w:b w:val="0"/>
+          <w:i w:val="0"/>
+          <w:color w:val="000000"/>
+          <w:sz w:val="26"/>
+        </w:rPr>
+        <w:t>, Hà Nội.</w:t>
+      </w:r>
+    </w:p>
+    <w:p>
+      <w:pPr>
+        <w:keepNext w:val="0"/>
+        <w:spacing w:before="0" w:after="40" w:line="312" w:lineRule="auto"/>
+        <w:ind w:left="567" w:hanging="567"/>
+        <w:jc w:val="both"/>
+      </w:pPr>
+      <w:r>
+        <w:rPr>
+          <w:rFonts w:ascii="Times New Roman" w:hAnsi="Times New Roman" w:eastAsia="Times New Roman" w:cs="Times New Roman"/>
+          <w:b w:val="0"/>
+          <w:i w:val="0"/>
+          <w:color w:val="000000"/>
+          <w:sz w:val="26"/>
+        </w:rPr>
+        <w:t xml:space="preserve">[41] Thủ tướng Chính phủ (2026), </w:t>
+      </w:r>
+      <w:r>
+        <w:rPr>
+          <w:rFonts w:ascii="Times New Roman" w:hAnsi="Times New Roman" w:eastAsia="Times New Roman" w:cs="Times New Roman"/>
+          <w:b w:val="0"/>
+          <w:i/>
+          <w:color w:val="000000"/>
+          <w:sz w:val="26"/>
+        </w:rPr>
+        <w:t>Quyết định số 1624/QĐ-TTg ngày 21/8/2026 sửa đổi, bổ sung một số điều của Quyết định số 1068/QĐ-TTg ngày 22/8/2019 phê duyệt Chiến lược sở hữu trí tuệ đến năm 2030</w:t>
+      </w:r>
+      <w:r>
+        <w:rPr>
+          <w:rFonts w:ascii="Times New Roman" w:hAnsi="Times New Roman" w:eastAsia="Times New Roman" w:cs="Times New Roman"/>
+          <w:b w:val="0"/>
+          <w:i w:val="0"/>
+          <w:color w:val="000000"/>
+          <w:sz w:val="26"/>
+        </w:rPr>
+        <w:t>, Hà Nội.</w:t>
+      </w:r>
+    </w:p>
+    <w:p>
+      <w:pPr>
+        <w:keepNext w:val="0"/>
+        <w:spacing w:before="0" w:after="40" w:line="312" w:lineRule="auto"/>
+        <w:ind w:left="567" w:hanging="567"/>
+        <w:jc w:val="both"/>
+      </w:pPr>
+      <w:r>
+        <w:rPr>
+          <w:rFonts w:ascii="Times New Roman" w:hAnsi="Times New Roman" w:eastAsia="Times New Roman" w:cs="Times New Roman"/>
+          <w:b w:val="0"/>
+          <w:i w:val="0"/>
+          <w:color w:val="000000"/>
+          <w:sz w:val="26"/>
+        </w:rPr>
+        <w:t xml:space="preserve">[42] Lê Thị Bích Thủy (2021), </w:t>
+      </w:r>
+      <w:r>
+        <w:rPr>
+          <w:rFonts w:ascii="Times New Roman" w:hAnsi="Times New Roman" w:eastAsia="Times New Roman" w:cs="Times New Roman"/>
+          <w:b w:val="0"/>
+          <w:i/>
+          <w:color w:val="000000"/>
+          <w:sz w:val="26"/>
+        </w:rPr>
+        <w:t>Bảo hộ quyền sở hữu trí tuệ đối với sáng chế liên quan đến dược phẩm tại Việt Nam trong điều kiện hội nhập kinh tế quốc tế</w:t>
+      </w:r>
+      <w:r>
+        <w:rPr>
+          <w:rFonts w:ascii="Times New Roman" w:hAnsi="Times New Roman" w:eastAsia="Times New Roman" w:cs="Times New Roman"/>
+          <w:b w:val="0"/>
+          <w:i w:val="0"/>
+          <w:color w:val="000000"/>
+          <w:sz w:val="26"/>
+        </w:rPr>
+        <w:t>, Luận án tiến sĩ Luật học, Trường Đại học Luật Hà Nội, Hà Nội.</w:t>
+      </w:r>
+    </w:p>
+    <w:p>
+      <w:pPr>
+        <w:keepNext w:val="0"/>
+        <w:spacing w:before="0" w:after="40" w:line="312" w:lineRule="auto"/>
+        <w:ind w:left="567" w:hanging="567"/>
+        <w:jc w:val="both"/>
+      </w:pPr>
+      <w:r>
+        <w:rPr>
+          <w:rFonts w:ascii="Times New Roman" w:hAnsi="Times New Roman" w:eastAsia="Times New Roman" w:cs="Times New Roman"/>
+          <w:b w:val="0"/>
+          <w:i w:val="0"/>
+          <w:color w:val="000000"/>
+          <w:sz w:val="26"/>
+        </w:rPr>
+        <w:t xml:space="preserve">[43] Nguyễn Minh Huyền Trang (2025), “Quản trị tài sản trí tuệ tại các cơ sở giáo dục đại học: Cơ hội và thách thức trong bối cảnh cuộc Cách mạng công nghiệp 4.0”, </w:t>
+      </w:r>
+      <w:r>
+        <w:rPr>
+          <w:rFonts w:ascii="Times New Roman" w:hAnsi="Times New Roman" w:eastAsia="Times New Roman" w:cs="Times New Roman"/>
+          <w:b w:val="0"/>
+          <w:i/>
+          <w:color w:val="000000"/>
+          <w:sz w:val="26"/>
+        </w:rPr>
+        <w:t>Tạp chí Khoa học Trường Đại học Sư phạm Thành phố Hồ Chí Minh</w:t>
+      </w:r>
+      <w:r>
+        <w:rPr>
+          <w:rFonts w:ascii="Times New Roman" w:hAnsi="Times New Roman" w:eastAsia="Times New Roman" w:cs="Times New Roman"/>
+          <w:b w:val="0"/>
+          <w:i w:val="0"/>
+          <w:color w:val="000000"/>
+          <w:sz w:val="26"/>
+        </w:rPr>
+        <w:t>, 22(1), 123-131.</w:t>
+      </w:r>
+    </w:p>
+    <w:p>
+      <w:pPr>
+        <w:keepNext w:val="0"/>
+        <w:spacing w:before="0" w:after="40" w:line="312" w:lineRule="auto"/>
+        <w:ind w:left="567" w:hanging="567"/>
+        <w:jc w:val="both"/>
+      </w:pPr>
+      <w:r>
+        <w:rPr>
+          <w:rFonts w:ascii="Times New Roman" w:hAnsi="Times New Roman" w:eastAsia="Times New Roman" w:cs="Times New Roman"/>
+          <w:b w:val="0"/>
+          <w:i w:val="0"/>
+          <w:color w:val="000000"/>
+          <w:sz w:val="26"/>
+        </w:rPr>
+        <w:t xml:space="preserve">[44] Nguyễn Thanh Tùng (2026), “Một số hạn chế, bất cập của pháp luật Việt Nam về hợp đồng chuyển giao quyền sử dụng nhãn hiệu và giải pháp hoàn thiện”, </w:t>
+      </w:r>
+      <w:r>
+        <w:rPr>
+          <w:rFonts w:ascii="Times New Roman" w:hAnsi="Times New Roman" w:eastAsia="Times New Roman" w:cs="Times New Roman"/>
+          <w:b w:val="0"/>
+          <w:i/>
+          <w:color w:val="000000"/>
+          <w:sz w:val="26"/>
+        </w:rPr>
+        <w:t>Tạp chí Khoa học Đại học Huế: Khoa học Xã hội và Nhân văn</w:t>
+      </w:r>
+      <w:r>
+        <w:rPr>
+          <w:rFonts w:ascii="Times New Roman" w:hAnsi="Times New Roman" w:eastAsia="Times New Roman" w:cs="Times New Roman"/>
+          <w:b w:val="0"/>
+          <w:i w:val="0"/>
+          <w:color w:val="000000"/>
+          <w:sz w:val="26"/>
+        </w:rPr>
+        <w:t>, 135(6A), 23-34.</w:t>
+      </w:r>
+    </w:p>
+    <w:p>
+      <w:pPr>
+        <w:keepNext w:val="0"/>
+        <w:spacing w:before="0" w:after="40" w:line="312" w:lineRule="auto"/>
+        <w:ind w:left="567" w:hanging="567"/>
+        <w:jc w:val="both"/>
+      </w:pPr>
+      <w:r>
+        <w:rPr>
+          <w:rFonts w:ascii="Times New Roman" w:hAnsi="Times New Roman" w:eastAsia="Times New Roman" w:cs="Times New Roman"/>
+          <w:b w:val="0"/>
+          <w:i w:val="0"/>
+          <w:color w:val="000000"/>
+          <w:sz w:val="26"/>
+        </w:rPr>
+        <w:t xml:space="preserve">[45] Nguyễn Thị Tố Uyên, Nguyễn Hữu Việt (2023), “Một số vấn đề về thực hiện chính sách phát triển tài sản trí tuệ của Nhà nước tại địa phương”, </w:t>
+      </w:r>
+      <w:r>
+        <w:rPr>
+          <w:rFonts w:ascii="Times New Roman" w:hAnsi="Times New Roman" w:eastAsia="Times New Roman" w:cs="Times New Roman"/>
+          <w:b w:val="0"/>
+          <w:i/>
+          <w:color w:val="000000"/>
+          <w:sz w:val="26"/>
+        </w:rPr>
+        <w:t>Tạp chí Nghiên cứu khoa học và Phát triển</w:t>
+      </w:r>
+      <w:r>
+        <w:rPr>
+          <w:rFonts w:ascii="Times New Roman" w:hAnsi="Times New Roman" w:eastAsia="Times New Roman" w:cs="Times New Roman"/>
+          <w:b w:val="0"/>
+          <w:i w:val="0"/>
+          <w:color w:val="000000"/>
+          <w:sz w:val="26"/>
+        </w:rPr>
+        <w:t>, 2(4), 56-65.</w:t>
+      </w:r>
+    </w:p>
+    <w:p>
+      <w:pPr>
+        <w:keepNext w:val="0"/>
+        <w:spacing w:before="0" w:after="40" w:line="312" w:lineRule="auto"/>
+        <w:ind w:left="567" w:hanging="567"/>
+        <w:jc w:val="both"/>
+      </w:pPr>
+      <w:r>
+        <w:rPr>
+          <w:rFonts w:ascii="Times New Roman" w:hAnsi="Times New Roman" w:eastAsia="Times New Roman" w:cs="Times New Roman"/>
+          <w:b w:val="0"/>
+          <w:i w:val="0"/>
+          <w:color w:val="000000"/>
+          <w:sz w:val="26"/>
+        </w:rPr>
+        <w:t xml:space="preserve">[46] Nguyễn Hữu Xuyên (2018), “Những nút thắt trong khai thác, thương mại hóa sáng chế”, </w:t>
       </w:r>
       <w:r>
         <w:rPr>
@@ -13054,7 +13650,7 @@
           <w:color w:val="000000"/>
           <w:sz w:val="26"/>
         </w:rPr>
-        <w:t xml:space="preserve">[39] Acemoglu D., Akcigit U. (2012), “Intellectual property rights policy, competition and innovation”, </w:t>
+        <w:t xml:space="preserve">[47] Acemoglu D., Akcigit U. (2012), “Intellectual property rights policy, competition and innovation”, </w:t>
       </w:r>
       <w:r>
         <w:rPr>
@@ -13092,7 +13688,7 @@
           <w:color w:val="000000"/>
           <w:sz w:val="26"/>
         </w:rPr>
-        <w:t xml:space="preserve">[40] Arora A., Fosfuri A., Gambardella A. (2001), “Markets for technology and their implications for corporate strategy”, </w:t>
+        <w:t xml:space="preserve">[48] Arora A., Fosfuri A., Gambardella A. (2001), “Markets for technology and their implications for corporate strategy”, </w:t>
       </w:r>
       <w:r>
         <w:rPr>
@@ -13130,7 +13726,7 @@
           <w:color w:val="000000"/>
           <w:sz w:val="26"/>
         </w:rPr>
-        <w:t xml:space="preserve">[41] Arrow K.J. (1962), “Economic welfare and the allocation of resources for invention”, in National Bureau of Economic Research, </w:t>
+        <w:t xml:space="preserve">[49] Arrow K.J. (1962), “Economic welfare and the allocation of resources for invention”, in National Bureau of Economic Research, </w:t>
       </w:r>
       <w:r>
         <w:rPr>
@@ -13168,7 +13764,7 @@
           <w:color w:val="000000"/>
           <w:sz w:val="26"/>
         </w:rPr>
-        <w:t xml:space="preserve">[42] Branstetter L.G., Fisman R., Foley C.F. (2006), “Do stronger intellectual property rights increase international technology transfer? Empirical evidence from U.S. firm-level panel data”, </w:t>
+        <w:t xml:space="preserve">[50] Barefoot K., Curtis D., Jolliff W., Nicholson J.R., Omohundro R. (2018), </w:t>
       </w:r>
       <w:r>
         <w:rPr>
@@ -13178,7 +13774,7 @@
           <w:color w:val="000000"/>
           <w:sz w:val="26"/>
         </w:rPr>
-        <w:t>The Quarterly Journal of Economics</w:t>
+        <w:t>Defining and Measuring the Digital Economy</w:t>
       </w:r>
       <w:r>
         <w:rPr>
@@ -13188,7 +13784,7 @@
           <w:color w:val="000000"/>
           <w:sz w:val="26"/>
         </w:rPr>
-        <w:t>, 121(1), 321-349.</w:t>
+        <w:t>, Working Paper, Bureau of Economic Analysis, U.S. Department of Commerce.</w:t>
       </w:r>
     </w:p>
     <w:p>
@@ -13206,7 +13802,7 @@
           <w:color w:val="000000"/>
           <w:sz w:val="26"/>
         </w:rPr>
-        <w:t xml:space="preserve">[43] Brynjolfsson E. (1993), “The productivity paradox of information technology”, </w:t>
+        <w:t xml:space="preserve">[51] Branstetter L.G., Fisman R., Foley C.F. (2006), “Do stronger intellectual property rights increase international technology transfer? Empirical evidence from U.S. firm-level panel data”, </w:t>
       </w:r>
       <w:r>
         <w:rPr>
@@ -13216,7 +13812,7 @@
           <w:color w:val="000000"/>
           <w:sz w:val="26"/>
         </w:rPr>
-        <w:t>Communications of the ACM</w:t>
+        <w:t>The Quarterly Journal of Economics</w:t>
       </w:r>
       <w:r>
         <w:rPr>
@@ -13226,7 +13822,7 @@
           <w:color w:val="000000"/>
           <w:sz w:val="26"/>
         </w:rPr>
-        <w:t>, 36(12), 66-77.</w:t>
+        <w:t>, 121(1), 321-349.</w:t>
       </w:r>
     </w:p>
     <w:p>
@@ -13244,7 +13840,7 @@
           <w:color w:val="000000"/>
           <w:sz w:val="26"/>
         </w:rPr>
-        <w:t xml:space="preserve">[44] Bui Xuan Chung (2025), “Measuring the digital economy: International experience and practices in Vietnam”, </w:t>
+        <w:t xml:space="preserve">[52] Brynjolfsson E. (1993), “The productivity paradox of information technology”, </w:t>
       </w:r>
       <w:r>
         <w:rPr>
@@ -13254,7 +13850,7 @@
           <w:color w:val="000000"/>
           <w:sz w:val="26"/>
         </w:rPr>
-        <w:t>TNU Journal of Science and Technology</w:t>
+        <w:t>Communications of the ACM</w:t>
       </w:r>
       <w:r>
         <w:rPr>
@@ -13264,7 +13860,7 @@
           <w:color w:val="000000"/>
           <w:sz w:val="26"/>
         </w:rPr>
-        <w:t>, 230(15), 105-112.</w:t>
+        <w:t>, 36(12), 66-77.</w:t>
       </w:r>
     </w:p>
     <w:p>
@@ -13282,7 +13878,7 @@
           <w:color w:val="000000"/>
           <w:sz w:val="26"/>
         </w:rPr>
-        <w:t xml:space="preserve">[45] Bukht R., Heeks R. (2017), </w:t>
+        <w:t xml:space="preserve">[53] Bui Xuan Chung (2025), “Measuring the digital economy: International experience and practices in Vietnam”, </w:t>
       </w:r>
       <w:r>
         <w:rPr>
@@ -13292,7 +13888,7 @@
           <w:color w:val="000000"/>
           <w:sz w:val="26"/>
         </w:rPr>
-        <w:t>Defining, Conceptualising and Measuring the Digital Economy</w:t>
+        <w:t>TNU Journal of Science and Technology</w:t>
       </w:r>
       <w:r>
         <w:rPr>
@@ -13302,7 +13898,7 @@
           <w:color w:val="000000"/>
           <w:sz w:val="26"/>
         </w:rPr>
-        <w:t>, Development Informatics Working Paper No. 68, Centre for Development Informatics, University of Manchester, Manchester.</w:t>
+        <w:t>, 230(15), 105-112.</w:t>
       </w:r>
     </w:p>
     <w:p>
@@ -13320,7 +13916,7 @@
           <w:color w:val="000000"/>
           <w:sz w:val="26"/>
         </w:rPr>
-        <w:t xml:space="preserve">[46] Chesbrough H.W. (2003), </w:t>
+        <w:t xml:space="preserve">[54] Bukht R., Heeks R. (2017), </w:t>
       </w:r>
       <w:r>
         <w:rPr>
@@ -13330,7 +13926,7 @@
           <w:color w:val="000000"/>
           <w:sz w:val="26"/>
         </w:rPr>
-        <w:t>Open Innovation: The New Imperative for Creating and Profiting from Technology</w:t>
+        <w:t>Defining, Conceptualising and Measuring the Digital Economy</w:t>
       </w:r>
       <w:r>
         <w:rPr>
@@ -13340,7 +13936,7 @@
           <w:color w:val="000000"/>
           <w:sz w:val="26"/>
         </w:rPr>
-        <w:t>, Harvard Business School Press, Boston.</w:t>
+        <w:t>, Development Informatics Working Paper No. 68, Centre for Development Informatics, University of Manchester, Manchester.</w:t>
       </w:r>
     </w:p>
     <w:p>
@@ -13358,7 +13954,7 @@
           <w:color w:val="000000"/>
           <w:sz w:val="26"/>
         </w:rPr>
-        <w:t xml:space="preserve">[47] Dang Thanh Dat (2026), “Policies for the commercialization of university research: International experiences and implications for Vietnam”, </w:t>
+        <w:t xml:space="preserve">[55] Chen W., Wu Y. (2022), “Does intellectual property protection stimulate digital economy development?”, </w:t>
       </w:r>
       <w:r>
         <w:rPr>
@@ -13368,7 +13964,7 @@
           <w:color w:val="000000"/>
           <w:sz w:val="26"/>
         </w:rPr>
-        <w:t>VNU Journal of Science: Policy and Management Studies</w:t>
+        <w:t>Journal of Applied Economics</w:t>
       </w:r>
       <w:r>
         <w:rPr>
@@ -13378,7 +13974,7 @@
           <w:color w:val="000000"/>
           <w:sz w:val="26"/>
         </w:rPr>
-        <w:t>, 42(2), 54-75.</w:t>
+        <w:t>, 25(1), 723-730.</w:t>
       </w:r>
     </w:p>
     <w:p>
@@ -13396,7 +13992,7 @@
           <w:color w:val="000000"/>
           <w:sz w:val="26"/>
         </w:rPr>
-        <w:t xml:space="preserve">[48] Dang Thi Viet Duc (2022), “Digital economy model in Vietnam”, </w:t>
+        <w:t xml:space="preserve">[56] Chesbrough H.W. (2003), </w:t>
       </w:r>
       <w:r>
         <w:rPr>
@@ -13406,7 +14002,7 @@
           <w:color w:val="000000"/>
           <w:sz w:val="26"/>
         </w:rPr>
-        <w:t>VNU Journal of Science: Policy and Management Studies</w:t>
+        <w:t>Open Innovation: The New Imperative for Creating and Profiting from Technology</w:t>
       </w:r>
       <w:r>
         <w:rPr>
@@ -13416,7 +14012,7 @@
           <w:color w:val="000000"/>
           <w:sz w:val="26"/>
         </w:rPr>
-        <w:t>, 38(2), 88-99.</w:t>
+        <w:t>, Harvard Business School Press, Boston.</w:t>
       </w:r>
     </w:p>
     <w:p>
@@ -13434,7 +14030,7 @@
           <w:color w:val="000000"/>
           <w:sz w:val="26"/>
         </w:rPr>
-        <w:t xml:space="preserve">[49] European Patent Office, European Union Intellectual Property Office (2021), </w:t>
+        <w:t xml:space="preserve">[57] Dahlman C., Mealy S., Wermelinger M. (2016), </w:t>
       </w:r>
       <w:r>
         <w:rPr>
@@ -13444,7 +14040,7 @@
           <w:color w:val="000000"/>
           <w:sz w:val="26"/>
         </w:rPr>
-        <w:t>Intellectual Property Rights and Firm Performance in the European Union: Firm-Level Analysis Report</w:t>
+        <w:t>Harnessing the digital economy for developing countries</w:t>
       </w:r>
       <w:r>
         <w:rPr>
@@ -13454,7 +14050,7 @@
           <w:color w:val="000000"/>
           <w:sz w:val="26"/>
         </w:rPr>
-        <w:t>, EUIPO, Alicante.</w:t>
+        <w:t>, OECD Development Centre Working Papers No. 334, OECD Publishing, Paris.</w:t>
       </w:r>
     </w:p>
     <w:p>
@@ -13472,7 +14068,7 @@
           <w:color w:val="000000"/>
           <w:sz w:val="26"/>
         </w:rPr>
-        <w:t xml:space="preserve">[50] Fasi M.A. (2022), “An overview on patenting trends and technology commercialization practices in the university Technology Transfer Offices in USA and China”, </w:t>
+        <w:t xml:space="preserve">[58] Dang Thanh Dat (2026), “Policies for the commercialization of university research: International experiences and implications for Vietnam”, </w:t>
       </w:r>
       <w:r>
         <w:rPr>
@@ -13482,7 +14078,7 @@
           <w:color w:val="000000"/>
           <w:sz w:val="26"/>
         </w:rPr>
-        <w:t>World Patent Information</w:t>
+        <w:t>VNU Journal of Science: Policy and Management Studies</w:t>
       </w:r>
       <w:r>
         <w:rPr>
@@ -13492,7 +14088,7 @@
           <w:color w:val="000000"/>
           <w:sz w:val="26"/>
         </w:rPr>
-        <w:t>, 68, 102097.</w:t>
+        <w:t>, 42(2), 54-75.</w:t>
       </w:r>
     </w:p>
     <w:p>
@@ -13510,7 +14106,7 @@
           <w:color w:val="000000"/>
           <w:sz w:val="26"/>
         </w:rPr>
-        <w:t xml:space="preserve">[51] Fink C., Maskus K.E. (eds.) (2005), </w:t>
+        <w:t xml:space="preserve">[59] Dang Thi Viet Duc (2022), “Digital economy model in Vietnam”, </w:t>
       </w:r>
       <w:r>
         <w:rPr>
@@ -13520,7 +14116,7 @@
           <w:color w:val="000000"/>
           <w:sz w:val="26"/>
         </w:rPr>
-        <w:t>Intellectual Property and Development: Lessons from Recent Economic Research</w:t>
+        <w:t>VNU Journal of Science: Policy and Management Studies</w:t>
       </w:r>
       <w:r>
         <w:rPr>
@@ -13530,7 +14126,7 @@
           <w:color w:val="000000"/>
           <w:sz w:val="26"/>
         </w:rPr>
-        <w:t>, World Bank and Oxford University Press, Washington, DC.</w:t>
+        <w:t>, 38(2), 88-99.</w:t>
       </w:r>
     </w:p>
     <w:p>
@@ -13548,7 +14144,7 @@
           <w:color w:val="000000"/>
           <w:sz w:val="26"/>
         </w:rPr>
-        <w:t xml:space="preserve">[52] Fisher W.W. (2001), “Theories of intellectual property”, in S.R. Munzer (ed.), </w:t>
+        <w:t xml:space="preserve">[60] Ding T., Yang L. (2025), “Intellectual property protection and corporate digital transformation: An empirical analysis from the perspectives of intellectual property protection and digital governance”, </w:t>
       </w:r>
       <w:r>
         <w:rPr>
@@ -13558,7 +14154,7 @@
           <w:color w:val="000000"/>
           <w:sz w:val="26"/>
         </w:rPr>
-        <w:t>New Essays in the Legal and Political Theory of Property</w:t>
+        <w:t>International Review of Economics &amp; Finance</w:t>
       </w:r>
       <w:r>
         <w:rPr>
@@ -13568,7 +14164,7 @@
           <w:color w:val="000000"/>
           <w:sz w:val="26"/>
         </w:rPr>
-        <w:t>, Cambridge University Press, Cambridge, 168-199.</w:t>
+        <w:t>, 100, 104125.</w:t>
       </w:r>
     </w:p>
     <w:p>
@@ -13586,7 +14182,7 @@
           <w:color w:val="000000"/>
           <w:sz w:val="26"/>
         </w:rPr>
-        <w:t xml:space="preserve">[53] Foster C. (2024), “Intellectual property rights and control in the digital economy: Examining the expansion of M-Pesa”, </w:t>
+        <w:t xml:space="preserve">[61] European Patent Office, European Union Intellectual Property Office (2021), </w:t>
       </w:r>
       <w:r>
         <w:rPr>
@@ -13596,7 +14192,7 @@
           <w:color w:val="000000"/>
           <w:sz w:val="26"/>
         </w:rPr>
-        <w:t>The Information Society</w:t>
+        <w:t>Intellectual Property Rights and Firm Performance in the European Union: Firm-Level Analysis Report</w:t>
       </w:r>
       <w:r>
         <w:rPr>
@@ -13606,7 +14202,7 @@
           <w:color w:val="000000"/>
           <w:sz w:val="26"/>
         </w:rPr>
-        <w:t>, 40(1), 1-17.</w:t>
+        <w:t>, EUIPO, Alicante.</w:t>
       </w:r>
     </w:p>
     <w:p>
@@ -13624,7 +14220,7 @@
           <w:color w:val="000000"/>
           <w:sz w:val="26"/>
         </w:rPr>
-        <w:t xml:space="preserve">[54] Gans J.S., Stern S. (2003), “The product market and the market for ‘ideas’: Commercialization strategies for technology entrepreneurs”, </w:t>
+        <w:t xml:space="preserve">[62] Fasi M.A. (2022), “An overview on patenting trends and technology commercialization practices in the university Technology Transfer Offices in USA and China”, </w:t>
       </w:r>
       <w:r>
         <w:rPr>
@@ -13634,7 +14230,7 @@
           <w:color w:val="000000"/>
           <w:sz w:val="26"/>
         </w:rPr>
-        <w:t>Research Policy</w:t>
+        <w:t>World Patent Information</w:t>
       </w:r>
       <w:r>
         <w:rPr>
@@ -13644,7 +14240,7 @@
           <w:color w:val="000000"/>
           <w:sz w:val="26"/>
         </w:rPr>
-        <w:t>, 32(2), 333-350.</w:t>
+        <w:t>, 68, 102097.</w:t>
       </w:r>
     </w:p>
     <w:p>
@@ -13662,7 +14258,7 @@
           <w:color w:val="000000"/>
           <w:sz w:val="26"/>
         </w:rPr>
-        <w:t xml:space="preserve">[55] Gans J.S., Hsu D.H., Stern S. (2008), “The impact of uncertain intellectual property rights on the market for ideas: Evidence from patent grant delays”, </w:t>
+        <w:t xml:space="preserve">[63] Fink C., Maskus K.E. (eds.) (2005), </w:t>
       </w:r>
       <w:r>
         <w:rPr>
@@ -13672,7 +14268,7 @@
           <w:color w:val="000000"/>
           <w:sz w:val="26"/>
         </w:rPr>
-        <w:t>Management Science</w:t>
+        <w:t>Intellectual Property and Development: Lessons from Recent Economic Research</w:t>
       </w:r>
       <w:r>
         <w:rPr>
@@ -13682,7 +14278,7 @@
           <w:color w:val="000000"/>
           <w:sz w:val="26"/>
         </w:rPr>
-        <w:t>, 54(5), 982-997.</w:t>
+        <w:t>, World Bank and Oxford University Press, Washington, DC.</w:t>
       </w:r>
     </w:p>
     <w:p>
@@ -13700,7 +14296,7 @@
           <w:color w:val="000000"/>
           <w:sz w:val="26"/>
         </w:rPr>
-        <w:t xml:space="preserve">[56] Goldfarb A., Tucker C. (2019), “Digital economics”, </w:t>
+        <w:t xml:space="preserve">[64] Fisher W.W. (2001), “Theories of intellectual property”, in S.R. Munzer (ed.), </w:t>
       </w:r>
       <w:r>
         <w:rPr>
@@ -13710,7 +14306,7 @@
           <w:color w:val="000000"/>
           <w:sz w:val="26"/>
         </w:rPr>
-        <w:t>Journal of Economic Literature</w:t>
+        <w:t>New Essays in the Legal and Political Theory of Property</w:t>
       </w:r>
       <w:r>
         <w:rPr>
@@ -13720,7 +14316,7 @@
           <w:color w:val="000000"/>
           <w:sz w:val="26"/>
         </w:rPr>
-        <w:t>, 57(1), 3-43.</w:t>
+        <w:t>, Cambridge University Press, Cambridge, 168-199.</w:t>
       </w:r>
     </w:p>
     <w:p>
@@ -13738,7 +14334,7 @@
           <w:color w:val="000000"/>
           <w:sz w:val="26"/>
         </w:rPr>
-        <w:t xml:space="preserve">[57] Gould D.M., Gruben W.C. (1996), “The role of intellectual property rights in economic growth”, </w:t>
+        <w:t xml:space="preserve">[65] Foster C. (2024), “Intellectual property rights and control in the digital economy: Examining the expansion of M-Pesa”, </w:t>
       </w:r>
       <w:r>
         <w:rPr>
@@ -13748,7 +14344,7 @@
           <w:color w:val="000000"/>
           <w:sz w:val="26"/>
         </w:rPr>
-        <w:t>Journal of Development Economics</w:t>
+        <w:t>The Information Society</w:t>
       </w:r>
       <w:r>
         <w:rPr>
@@ -13758,7 +14354,7 @@
           <w:color w:val="000000"/>
           <w:sz w:val="26"/>
         </w:rPr>
-        <w:t>, 48(2), 323-350.</w:t>
+        <w:t>, 40(1), 1-17.</w:t>
       </w:r>
     </w:p>
     <w:p>
@@ -13776,7 +14372,7 @@
           <w:color w:val="000000"/>
           <w:sz w:val="26"/>
         </w:rPr>
-        <w:t xml:space="preserve">[58] Haskel J., Westlake S. (2018), </w:t>
+        <w:t xml:space="preserve">[66] Gans J.S., Stern S. (2003), “The product market and the market for ‘ideas’: Commercialization strategies for technology entrepreneurs”, </w:t>
       </w:r>
       <w:r>
         <w:rPr>
@@ -13786,7 +14382,7 @@
           <w:color w:val="000000"/>
           <w:sz w:val="26"/>
         </w:rPr>
-        <w:t>Capitalism without Capital: The Rise of the Intangible Economy</w:t>
+        <w:t>Research Policy</w:t>
       </w:r>
       <w:r>
         <w:rPr>
@@ -13796,7 +14392,7 @@
           <w:color w:val="000000"/>
           <w:sz w:val="26"/>
         </w:rPr>
-        <w:t>, Princeton University Press, Princeton.</w:t>
+        <w:t>, 32(2), 333-350.</w:t>
       </w:r>
     </w:p>
     <w:p>
@@ -13814,7 +14410,7 @@
           <w:color w:val="000000"/>
           <w:sz w:val="26"/>
         </w:rPr>
-        <w:t xml:space="preserve">[59] Helpman E. (1993), “Innovation, imitation, and intellectual property rights”, </w:t>
+        <w:t xml:space="preserve">[67] Gans J.S., Hsu D.H., Stern S. (2008), “The impact of uncertain intellectual property rights on the market for ideas: Evidence from patent grant delays”, </w:t>
       </w:r>
       <w:r>
         <w:rPr>
@@ -13824,7 +14420,7 @@
           <w:color w:val="000000"/>
           <w:sz w:val="26"/>
         </w:rPr>
-        <w:t>Econometrica</w:t>
+        <w:t>Management Science</w:t>
       </w:r>
       <w:r>
         <w:rPr>
@@ -13834,7 +14430,7 @@
           <w:color w:val="000000"/>
           <w:sz w:val="26"/>
         </w:rPr>
-        <w:t>, 61(6), 1247-1280.</w:t>
+        <w:t>, 54(5), 982-997.</w:t>
       </w:r>
     </w:p>
     <w:p>
@@ -13852,7 +14448,7 @@
           <w:color w:val="000000"/>
           <w:sz w:val="26"/>
         </w:rPr>
-        <w:t xml:space="preserve">[60] Hochberg Y.V., Serrano C.J., Ziedonis R.H. (2018), “Patent collateral, investor commitment, and the market for venture lending”, </w:t>
+        <w:t xml:space="preserve">[68] Goldfarb A., Tucker C. (2019), “Digital economics”, </w:t>
       </w:r>
       <w:r>
         <w:rPr>
@@ -13862,7 +14458,7 @@
           <w:color w:val="000000"/>
           <w:sz w:val="26"/>
         </w:rPr>
-        <w:t>Journal of Financial Economics</w:t>
+        <w:t>Journal of Economic Literature</w:t>
       </w:r>
       <w:r>
         <w:rPr>
@@ -13872,7 +14468,7 @@
           <w:color w:val="000000"/>
           <w:sz w:val="26"/>
         </w:rPr>
-        <w:t>, 130(1), 74-94.</w:t>
+        <w:t>, 57(1), 3-43.</w:t>
       </w:r>
     </w:p>
     <w:p>
@@ -13890,7 +14486,7 @@
           <w:color w:val="000000"/>
           <w:sz w:val="26"/>
         </w:rPr>
-        <w:t xml:space="preserve">[61] Hughes J. (1988), “The philosophy of intellectual property”, </w:t>
+        <w:t xml:space="preserve">[69] Gould D.M., Gruben W.C. (1996), “The role of intellectual property rights in economic growth”, </w:t>
       </w:r>
       <w:r>
         <w:rPr>
@@ -13900,7 +14496,7 @@
           <w:color w:val="000000"/>
           <w:sz w:val="26"/>
         </w:rPr>
-        <w:t>Georgetown Law Journal</w:t>
+        <w:t>Journal of Development Economics</w:t>
       </w:r>
       <w:r>
         <w:rPr>
@@ -13910,7 +14506,7 @@
           <w:color w:val="000000"/>
           <w:sz w:val="26"/>
         </w:rPr>
-        <w:t>, 77(2), 287-366.</w:t>
+        <w:t>, 48(2), 323-350.</w:t>
       </w:r>
     </w:p>
     <w:p>
@@ -13928,7 +14524,7 @@
           <w:color w:val="000000"/>
           <w:sz w:val="26"/>
         </w:rPr>
-        <w:t xml:space="preserve">[62] International Monetary Fund (2018), </w:t>
+        <w:t xml:space="preserve">[70] Haskel J., Westlake S. (2018), </w:t>
       </w:r>
       <w:r>
         <w:rPr>
@@ -13938,7 +14534,7 @@
           <w:color w:val="000000"/>
           <w:sz w:val="26"/>
         </w:rPr>
-        <w:t>Measuring the Digital Economy</w:t>
+        <w:t>Capitalism without Capital: The Rise of the Intangible Economy</w:t>
       </w:r>
       <w:r>
         <w:rPr>
@@ -13948,7 +14544,7 @@
           <w:color w:val="000000"/>
           <w:sz w:val="26"/>
         </w:rPr>
-        <w:t>, IMF Policy Paper, IMF, Washington, DC.</w:t>
+        <w:t>, Princeton University Press, Princeton.</w:t>
       </w:r>
     </w:p>
     <w:p>
@@ -13966,7 +14562,7 @@
           <w:color w:val="000000"/>
           <w:sz w:val="26"/>
         </w:rPr>
-        <w:t xml:space="preserve">[63] Le H.T.T., Luong T.T.D. (2022), “Intellectual property management: Case studies of Vietnamese SMEs”, </w:t>
+        <w:t xml:space="preserve">[71] Helpman E. (1993), “Innovation, imitation, and intellectual property rights”, </w:t>
       </w:r>
       <w:r>
         <w:rPr>
@@ -13976,7 +14572,7 @@
           <w:color w:val="000000"/>
           <w:sz w:val="26"/>
         </w:rPr>
-        <w:t>International Journal of Business Strategy and Social Sciences</w:t>
+        <w:t>Econometrica</w:t>
       </w:r>
       <w:r>
         <w:rPr>
@@ -13986,7 +14582,7 @@
           <w:color w:val="000000"/>
           <w:sz w:val="26"/>
         </w:rPr>
-        <w:t>, 5(2), 70-87.</w:t>
+        <w:t>, 61(6), 1247-1280.</w:t>
       </w:r>
     </w:p>
     <w:p>
@@ -14004,7 +14600,7 @@
           <w:color w:val="000000"/>
           <w:sz w:val="26"/>
         </w:rPr>
-        <w:t xml:space="preserve">[64] Le Thi Thu Ha, Nguyen Nhu Ngoc, Luong Thi Dai Trang (2022), “The relation between intellectual property management and firm performance of Vietnamese firms in the information and communication technology industry (ICT)”, </w:t>
+        <w:t xml:space="preserve">[72] Hochberg Y.V., Serrano C.J., Ziedonis R.H. (2018), “Patent collateral, investor commitment, and the market for venture lending”, </w:t>
       </w:r>
       <w:r>
         <w:rPr>
@@ -14014,7 +14610,7 @@
           <w:color w:val="000000"/>
           <w:sz w:val="26"/>
         </w:rPr>
-        <w:t>VNU Journal of Science: Policy and Management Studies</w:t>
+        <w:t>Journal of Financial Economics</w:t>
       </w:r>
       <w:r>
         <w:rPr>
@@ -14024,7 +14620,7 @@
           <w:color w:val="000000"/>
           <w:sz w:val="26"/>
         </w:rPr>
-        <w:t>, 38(1), 87-104.</w:t>
+        <w:t>, 130(1), 74-94.</w:t>
       </w:r>
     </w:p>
     <w:p>
@@ -14042,7 +14638,7 @@
           <w:color w:val="000000"/>
           <w:sz w:val="26"/>
         </w:rPr>
-        <w:t xml:space="preserve">[65] Long Tran Viet, Hai Phan Thanh (2023), “Mediating impact of the protection and exploitation of intellectual property rights of local intellectual property on tourism development: An empirical study in Central Vietnam”, </w:t>
+        <w:t xml:space="preserve">[73] Hughes J. (1988), “The philosophy of intellectual property”, </w:t>
       </w:r>
       <w:r>
         <w:rPr>
@@ -14052,7 +14648,7 @@
           <w:color w:val="000000"/>
           <w:sz w:val="26"/>
         </w:rPr>
-        <w:t>Problems and Perspectives in Management</w:t>
+        <w:t>Georgetown Law Journal</w:t>
       </w:r>
       <w:r>
         <w:rPr>
@@ -14062,7 +14658,7 @@
           <w:color w:val="000000"/>
           <w:sz w:val="26"/>
         </w:rPr>
-        <w:t>, 21(2), 767-780.</w:t>
+        <w:t>, 77(2), 287-366.</w:t>
       </w:r>
     </w:p>
     <w:p>
@@ -14080,7 +14676,7 @@
           <w:color w:val="000000"/>
           <w:sz w:val="26"/>
         </w:rPr>
-        <w:t xml:space="preserve">[66] Lundvall B.-Å. (ed.) (1992), </w:t>
+        <w:t xml:space="preserve">[74] International Monetary Fund (2018), </w:t>
       </w:r>
       <w:r>
         <w:rPr>
@@ -14090,7 +14686,7 @@
           <w:color w:val="000000"/>
           <w:sz w:val="26"/>
         </w:rPr>
-        <w:t>National Systems of Innovation: Towards a Theory of Innovation and Interactive Learning</w:t>
+        <w:t>Measuring the Digital Economy</w:t>
       </w:r>
       <w:r>
         <w:rPr>
@@ -14100,7 +14696,7 @@
           <w:color w:val="000000"/>
           <w:sz w:val="26"/>
         </w:rPr>
-        <w:t>, Pinter, London.</w:t>
+        <w:t>, IMF Policy Paper, IMF, Washington, DC.</w:t>
       </w:r>
     </w:p>
     <w:p>
@@ -14118,7 +14714,7 @@
           <w:color w:val="000000"/>
           <w:sz w:val="26"/>
         </w:rPr>
-        <w:t xml:space="preserve">[67] Luu Hoang Long (2025a), “Establishing technology park to support the commercialization of intellectual property in higher education institutions”, </w:t>
+        <w:t xml:space="preserve">[75] Le H.T.T., Luong T.T.D. (2022), “Intellectual property management: Case studies of Vietnamese SMEs”, </w:t>
       </w:r>
       <w:r>
         <w:rPr>
@@ -14128,7 +14724,7 @@
           <w:color w:val="000000"/>
           <w:sz w:val="26"/>
         </w:rPr>
-        <w:t>VNU Journal of Science: Policy and Management Studies</w:t>
+        <w:t>International Journal of Business Strategy and Social Sciences</w:t>
       </w:r>
       <w:r>
         <w:rPr>
@@ -14138,7 +14734,7 @@
           <w:color w:val="000000"/>
           <w:sz w:val="26"/>
         </w:rPr>
-        <w:t>, 41(2), 43-53.</w:t>
+        <w:t>, 5(2), 70-87.</w:t>
       </w:r>
     </w:p>
     <w:p>
@@ -14156,7 +14752,7 @@
           <w:color w:val="000000"/>
           <w:sz w:val="26"/>
         </w:rPr>
-        <w:t xml:space="preserve">[68] Luu Hoang Long (2025b), “Building an innovation ecosystem to support the commercialization of intellectual property at Vietnam National University, Hanoi”, </w:t>
+        <w:t xml:space="preserve">[76] Le Thi Thu Ha, Nguyen Nhu Ngoc, Luong Thi Dai Trang (2022), “The relation between intellectual property management and firm performance of Vietnamese firms in the information and communication technology industry (ICT)”, </w:t>
       </w:r>
       <w:r>
         <w:rPr>
@@ -14176,7 +14772,7 @@
           <w:color w:val="000000"/>
           <w:sz w:val="26"/>
         </w:rPr>
-        <w:t>, 41(4), 63-73.</w:t>
+        <w:t>, 38(1), 87-104.</w:t>
       </w:r>
     </w:p>
     <w:p>
@@ -14194,7 +14790,7 @@
           <w:color w:val="000000"/>
           <w:sz w:val="26"/>
         </w:rPr>
-        <w:t xml:space="preserve">[69] Mann W. (2018), “Creditor rights and innovation: Evidence from patent collateral”, </w:t>
+        <w:t xml:space="preserve">[77] Long Tran Viet, Hai Phan Thanh (2023), “Mediating impact of the protection and exploitation of intellectual property rights of local intellectual property on tourism development: An empirical study in Central Vietnam”, </w:t>
       </w:r>
       <w:r>
         <w:rPr>
@@ -14204,7 +14800,7 @@
           <w:color w:val="000000"/>
           <w:sz w:val="26"/>
         </w:rPr>
-        <w:t>Journal of Financial Economics</w:t>
+        <w:t>Problems and Perspectives in Management</w:t>
       </w:r>
       <w:r>
         <w:rPr>
@@ -14214,7 +14810,7 @@
           <w:color w:val="000000"/>
           <w:sz w:val="26"/>
         </w:rPr>
-        <w:t>, 130(1), 25-47.</w:t>
+        <w:t>, 21(2), 767-780.</w:t>
       </w:r>
     </w:p>
     <w:p>
@@ -14232,7 +14828,7 @@
           <w:color w:val="000000"/>
           <w:sz w:val="26"/>
         </w:rPr>
-        <w:t xml:space="preserve">[70] Mansfield E. (1994), </w:t>
+        <w:t xml:space="preserve">[78] Lundvall B.-Å. (ed.) (1992), </w:t>
       </w:r>
       <w:r>
         <w:rPr>
@@ -14242,7 +14838,7 @@
           <w:color w:val="000000"/>
           <w:sz w:val="26"/>
         </w:rPr>
-        <w:t>Intellectual Property Protection, Foreign Direct Investment, and Technology Transfer</w:t>
+        <w:t>National Systems of Innovation: Towards a Theory of Innovation and Interactive Learning</w:t>
       </w:r>
       <w:r>
         <w:rPr>
@@ -14252,7 +14848,7 @@
           <w:color w:val="000000"/>
           <w:sz w:val="26"/>
         </w:rPr>
-        <w:t>, IFC Discussion Paper No. 19, International Finance Corporation, Washington, DC.</w:t>
+        <w:t>, Pinter, London.</w:t>
       </w:r>
     </w:p>
     <w:p>
@@ -14270,7 +14866,7 @@
           <w:color w:val="000000"/>
           <w:sz w:val="26"/>
         </w:rPr>
-        <w:t xml:space="preserve">[71] Maskus K.E. (2000), </w:t>
+        <w:t xml:space="preserve">[79] Luu Hoang Long (2025a), “Establishing technology park to support the commercialization of intellectual property in higher education institutions”, </w:t>
       </w:r>
       <w:r>
         <w:rPr>
@@ -14280,7 +14876,7 @@
           <w:color w:val="000000"/>
           <w:sz w:val="26"/>
         </w:rPr>
-        <w:t>Intellectual Property Rights in the Global Economy</w:t>
+        <w:t>VNU Journal of Science: Policy and Management Studies</w:t>
       </w:r>
       <w:r>
         <w:rPr>
@@ -14290,7 +14886,7 @@
           <w:color w:val="000000"/>
           <w:sz w:val="26"/>
         </w:rPr>
-        <w:t>, Institute for International Economics, Washington, DC.</w:t>
+        <w:t>, 41(2), 43-53.</w:t>
       </w:r>
     </w:p>
     <w:p>
@@ -14308,7 +14904,7 @@
           <w:color w:val="000000"/>
           <w:sz w:val="26"/>
         </w:rPr>
-        <w:t xml:space="preserve">[72] Mazzucato M. (2013), </w:t>
+        <w:t xml:space="preserve">[80] Luu Hoang Long (2025b), “Building an innovation ecosystem to support the commercialization of intellectual property at Vietnam National University, Hanoi”, </w:t>
       </w:r>
       <w:r>
         <w:rPr>
@@ -14318,7 +14914,7 @@
           <w:color w:val="000000"/>
           <w:sz w:val="26"/>
         </w:rPr>
-        <w:t>The Entrepreneurial State: Debunking Public vs. Private Sector Myths</w:t>
+        <w:t>VNU Journal of Science: Policy and Management Studies</w:t>
       </w:r>
       <w:r>
         <w:rPr>
@@ -14328,7 +14924,7 @@
           <w:color w:val="000000"/>
           <w:sz w:val="26"/>
         </w:rPr>
-        <w:t>, Anthem Press, London.</w:t>
+        <w:t>, 41(4), 63-73.</w:t>
       </w:r>
     </w:p>
     <w:p>
@@ -14346,7 +14942,7 @@
           <w:color w:val="000000"/>
           <w:sz w:val="26"/>
         </w:rPr>
-        <w:t xml:space="preserve">[73] Merges R.P. (2011), </w:t>
+        <w:t xml:space="preserve">[81] Mann W. (2018), “Creditor rights and innovation: Evidence from patent collateral”, </w:t>
       </w:r>
       <w:r>
         <w:rPr>
@@ -14356,7 +14952,7 @@
           <w:color w:val="000000"/>
           <w:sz w:val="26"/>
         </w:rPr>
-        <w:t>Justifying Intellectual Property</w:t>
+        <w:t>Journal of Financial Economics</w:t>
       </w:r>
       <w:r>
         <w:rPr>
@@ -14366,7 +14962,7 @@
           <w:color w:val="000000"/>
           <w:sz w:val="26"/>
         </w:rPr>
-        <w:t>, Harvard University Press, Cambridge, MA.</w:t>
+        <w:t>, 130(1), 25-47.</w:t>
       </w:r>
     </w:p>
     <w:p>
@@ -14384,7 +14980,7 @@
           <w:color w:val="000000"/>
           <w:sz w:val="26"/>
         </w:rPr>
-        <w:t xml:space="preserve">[74] Mowery D.C., Nelson R.R., Sampat B.N., Ziedonis A.A. (2001), “The growth of patenting and licensing by U.S. universities: An assessment of the effects of the Bayh-Dole Act of 1980”, </w:t>
+        <w:t xml:space="preserve">[82] Mansfield E. (1994), </w:t>
       </w:r>
       <w:r>
         <w:rPr>
@@ -14394,7 +14990,7 @@
           <w:color w:val="000000"/>
           <w:sz w:val="26"/>
         </w:rPr>
-        <w:t>Research Policy</w:t>
+        <w:t>Intellectual Property Protection, Foreign Direct Investment, and Technology Transfer</w:t>
       </w:r>
       <w:r>
         <w:rPr>
@@ -14404,7 +15000,7 @@
           <w:color w:val="000000"/>
           <w:sz w:val="26"/>
         </w:rPr>
-        <w:t>, 30(1), 99-119.</w:t>
+        <w:t>, IFC Discussion Paper No. 19, International Finance Corporation, Washington, DC.</w:t>
       </w:r>
     </w:p>
     <w:p>
@@ -14422,7 +15018,7 @@
           <w:color w:val="000000"/>
           <w:sz w:val="26"/>
         </w:rPr>
-        <w:t xml:space="preserve">[75] Negroponte N. (1995), </w:t>
+        <w:t xml:space="preserve">[83] Maskus K.E. (2000), </w:t>
       </w:r>
       <w:r>
         <w:rPr>
@@ -14432,7 +15028,7 @@
           <w:color w:val="000000"/>
           <w:sz w:val="26"/>
         </w:rPr>
-        <w:t>Being Digital</w:t>
+        <w:t>Intellectual Property Rights in the Global Economy</w:t>
       </w:r>
       <w:r>
         <w:rPr>
@@ -14442,7 +15038,7 @@
           <w:color w:val="000000"/>
           <w:sz w:val="26"/>
         </w:rPr>
-        <w:t>, Alfred A. Knopf, New York.</w:t>
+        <w:t>, Institute for International Economics, Washington, DC.</w:t>
       </w:r>
     </w:p>
     <w:p>
@@ -14460,7 +15056,7 @@
           <w:color w:val="000000"/>
           <w:sz w:val="26"/>
         </w:rPr>
-        <w:t xml:space="preserve">[76] Nelson R.R. (ed.) (1993), </w:t>
+        <w:t xml:space="preserve">[84] Mazzucato M. (2013), </w:t>
       </w:r>
       <w:r>
         <w:rPr>
@@ -14470,7 +15066,7 @@
           <w:color w:val="000000"/>
           <w:sz w:val="26"/>
         </w:rPr>
-        <w:t>National Innovation Systems: A Comparative Analysis</w:t>
+        <w:t>The Entrepreneurial State: Debunking Public vs. Private Sector Myths</w:t>
       </w:r>
       <w:r>
         <w:rPr>
@@ -14480,7 +15076,7 @@
           <w:color w:val="000000"/>
           <w:sz w:val="26"/>
         </w:rPr>
-        <w:t>, Oxford University Press, New York.</w:t>
+        <w:t>, Anthem Press, London.</w:t>
       </w:r>
     </w:p>
     <w:p>
@@ -14498,7 +15094,7 @@
           <w:color w:val="000000"/>
           <w:sz w:val="26"/>
         </w:rPr>
-        <w:t xml:space="preserve">[77] Neves P.C., Afonso O., Silva D., Sochirca E. (2021), “The link between intellectual property rights, innovation, and growth: A meta-analysis”, </w:t>
+        <w:t xml:space="preserve">[85] Merges R.P. (2011), </w:t>
       </w:r>
       <w:r>
         <w:rPr>
@@ -14508,7 +15104,7 @@
           <w:color w:val="000000"/>
           <w:sz w:val="26"/>
         </w:rPr>
-        <w:t>Economic Modelling</w:t>
+        <w:t>Justifying Intellectual Property</w:t>
       </w:r>
       <w:r>
         <w:rPr>
@@ -14518,7 +15114,7 @@
           <w:color w:val="000000"/>
           <w:sz w:val="26"/>
         </w:rPr>
-        <w:t>, 97, 196-209.</w:t>
+        <w:t>, Harvard University Press, Cambridge, MA.</w:t>
       </w:r>
     </w:p>
     <w:p>
@@ -14536,7 +15132,7 @@
           <w:color w:val="000000"/>
           <w:sz w:val="26"/>
         </w:rPr>
-        <w:t xml:space="preserve">[78] Nguyen Huu Xuyen (2024), “Intellectual property management to serve the innovation activities of Vietnam's enterprise”, </w:t>
+        <w:t xml:space="preserve">[86] Mowery D.C., Nelson R.R., Sampat B.N., Ziedonis A.A. (2001), “The growth of patenting and licensing by U.S. universities: An assessment of the effects of the Bayh-Dole Act of 1980”, </w:t>
       </w:r>
       <w:r>
         <w:rPr>
@@ -14546,7 +15142,7 @@
           <w:color w:val="000000"/>
           <w:sz w:val="26"/>
         </w:rPr>
-        <w:t>European Science Review</w:t>
+        <w:t>Research Policy</w:t>
       </w:r>
       <w:r>
         <w:rPr>
@@ -14556,7 +15152,7 @@
           <w:color w:val="000000"/>
           <w:sz w:val="26"/>
         </w:rPr>
-        <w:t>, (5-6), 18-23.</w:t>
+        <w:t>, 30(1), 99-119.</w:t>
       </w:r>
     </w:p>
     <w:p>
@@ -14574,7 +15170,7 @@
           <w:color w:val="000000"/>
           <w:sz w:val="26"/>
         </w:rPr>
-        <w:t xml:space="preserve">[79] Nguyen V.H., Nguyen D.A. (2024), “Managing the digital economy: The case of Vietnam”, </w:t>
+        <w:t xml:space="preserve">[87] Negroponte N. (1995), </w:t>
       </w:r>
       <w:r>
         <w:rPr>
@@ -14584,7 +15180,7 @@
           <w:color w:val="000000"/>
           <w:sz w:val="26"/>
         </w:rPr>
-        <w:t>Forum for Economic and Financial Studies</w:t>
+        <w:t>Being Digital</w:t>
       </w:r>
       <w:r>
         <w:rPr>
@@ -14594,7 +15190,7 @@
           <w:color w:val="000000"/>
           <w:sz w:val="26"/>
         </w:rPr>
-        <w:t>, 2(4), 2132.</w:t>
+        <w:t>, Alfred A. Knopf, New York.</w:t>
       </w:r>
     </w:p>
     <w:p>
@@ -14612,7 +15208,7 @@
           <w:color w:val="000000"/>
           <w:sz w:val="26"/>
         </w:rPr>
-        <w:t xml:space="preserve">[80] OECD, World Bank (2014), </w:t>
+        <w:t xml:space="preserve">[88] Nelson R.R. (ed.) (1993), </w:t>
       </w:r>
       <w:r>
         <w:rPr>
@@ -14622,7 +15218,7 @@
           <w:color w:val="000000"/>
           <w:sz w:val="26"/>
         </w:rPr>
-        <w:t>Science, Technology and Innovation in Viet Nam</w:t>
+        <w:t>National Innovation Systems: A Comparative Analysis</w:t>
       </w:r>
       <w:r>
         <w:rPr>
@@ -14632,7 +15228,7 @@
           <w:color w:val="000000"/>
           <w:sz w:val="26"/>
         </w:rPr>
-        <w:t>, OECD Reviews of Innovation Policy, OECD Publishing, Paris.</w:t>
+        <w:t>, Oxford University Press, New York.</w:t>
       </w:r>
     </w:p>
     <w:p>
@@ -14650,7 +15246,7 @@
           <w:color w:val="000000"/>
           <w:sz w:val="26"/>
         </w:rPr>
-        <w:t xml:space="preserve">[81] OECD (2020), </w:t>
+        <w:t xml:space="preserve">[89] Neves P.C., Afonso O., Silva D., Sochirca E. (2021), “The link between intellectual property rights, innovation, and growth: A meta-analysis”, </w:t>
       </w:r>
       <w:r>
         <w:rPr>
@@ -14660,7 +15256,7 @@
           <w:color w:val="000000"/>
           <w:sz w:val="26"/>
         </w:rPr>
-        <w:t>A Roadmap toward a Common Framework for Measuring the Digital Economy</w:t>
+        <w:t>Economic Modelling</w:t>
       </w:r>
       <w:r>
         <w:rPr>
@@ -14670,7 +15266,7 @@
           <w:color w:val="000000"/>
           <w:sz w:val="26"/>
         </w:rPr>
-        <w:t>, Report for the G20 Digital Economy Task Force, OECD, Paris.</w:t>
+        <w:t>, 97, 196-209.</w:t>
       </w:r>
     </w:p>
     <w:p>
@@ -14688,7 +15284,7 @@
           <w:color w:val="000000"/>
           <w:sz w:val="26"/>
         </w:rPr>
-        <w:t xml:space="preserve">[82] Pan W., Xie T., Wang Z., Ma L. (2022), “Digital economy: An innovation driver for total factor productivity”, </w:t>
+        <w:t xml:space="preserve">[90] Nguyen Huu Xuyen (2024), “Intellectual property management to serve the innovation activities of Vietnam's enterprise”, </w:t>
       </w:r>
       <w:r>
         <w:rPr>
@@ -14698,7 +15294,7 @@
           <w:color w:val="000000"/>
           <w:sz w:val="26"/>
         </w:rPr>
-        <w:t>Journal of Business Research</w:t>
+        <w:t>European Science Review</w:t>
       </w:r>
       <w:r>
         <w:rPr>
@@ -14708,7 +15304,7 @@
           <w:color w:val="000000"/>
           <w:sz w:val="26"/>
         </w:rPr>
-        <w:t>, 139, 303-311.</w:t>
+        <w:t>, (5-6), 18-23.</w:t>
       </w:r>
     </w:p>
     <w:p>
@@ -14726,7 +15322,7 @@
           <w:color w:val="000000"/>
           <w:sz w:val="26"/>
         </w:rPr>
-        <w:t xml:space="preserve">[83] Park W.G. (2008), “International patent protection: 1960-2005”, </w:t>
+        <w:t xml:space="preserve">[91] Nguyen V.H., Nguyen D.A. (2024), “Managing the digital economy: The case of Vietnam”, </w:t>
       </w:r>
       <w:r>
         <w:rPr>
@@ -14736,7 +15332,7 @@
           <w:color w:val="000000"/>
           <w:sz w:val="26"/>
         </w:rPr>
-        <w:t>Research Policy</w:t>
+        <w:t>Forum for Economic and Financial Studies</w:t>
       </w:r>
       <w:r>
         <w:rPr>
@@ -14746,7 +15342,7 @@
           <w:color w:val="000000"/>
           <w:sz w:val="26"/>
         </w:rPr>
-        <w:t>, 37(4), 761-766.</w:t>
+        <w:t>, 2(4), 2132.</w:t>
       </w:r>
     </w:p>
     <w:p>
@@ -14764,7 +15360,7 @@
           <w:color w:val="000000"/>
           <w:sz w:val="26"/>
         </w:rPr>
-        <w:t xml:space="preserve">[84] Shapiro C., Varian H.R. (1999), </w:t>
+        <w:t xml:space="preserve">[92] OECD, World Bank (2014), </w:t>
       </w:r>
       <w:r>
         <w:rPr>
@@ -14774,7 +15370,7 @@
           <w:color w:val="000000"/>
           <w:sz w:val="26"/>
         </w:rPr>
-        <w:t>Information Rules: A Strategic Guide to the Network Economy</w:t>
+        <w:t>Science, Technology and Innovation in Viet Nam</w:t>
       </w:r>
       <w:r>
         <w:rPr>
@@ -14784,7 +15380,7 @@
           <w:color w:val="000000"/>
           <w:sz w:val="26"/>
         </w:rPr>
-        <w:t>, Harvard Business School Press, Boston.</w:t>
+        <w:t>, OECD Reviews of Innovation Policy, OECD Publishing, Paris.</w:t>
       </w:r>
     </w:p>
     <w:p>
@@ -14802,7 +15398,7 @@
           <w:color w:val="000000"/>
           <w:sz w:val="26"/>
         </w:rPr>
-        <w:t xml:space="preserve">[85] Siegel D.S., Waldman D., Link A. (2003), “Assessing the impact of organizational practices on the relative productivity of university technology transfer offices: An exploratory study”, </w:t>
+        <w:t xml:space="preserve">[93] OECD (2014), </w:t>
       </w:r>
       <w:r>
         <w:rPr>
@@ -14812,7 +15408,7 @@
           <w:color w:val="000000"/>
           <w:sz w:val="26"/>
         </w:rPr>
-        <w:t>Research Policy</w:t>
+        <w:t>Measuring the Digital Economy: A New Perspective</w:t>
       </w:r>
       <w:r>
         <w:rPr>
@@ -14822,7 +15418,7 @@
           <w:color w:val="000000"/>
           <w:sz w:val="26"/>
         </w:rPr>
-        <w:t>, 32(1), 27-48.</w:t>
+        <w:t>, OECD Publishing, Paris.</w:t>
       </w:r>
     </w:p>
     <w:p>
@@ -14840,7 +15436,7 @@
           <w:color w:val="000000"/>
           <w:sz w:val="26"/>
         </w:rPr>
-        <w:t xml:space="preserve">[86] Sinnreich A. (2019), </w:t>
+        <w:t xml:space="preserve">[94] OECD (2020), </w:t>
       </w:r>
       <w:r>
         <w:rPr>
@@ -14850,7 +15446,7 @@
           <w:color w:val="000000"/>
           <w:sz w:val="26"/>
         </w:rPr>
-        <w:t>The Essential Guide to Intellectual Property</w:t>
+        <w:t>A Roadmap toward a Common Framework for Measuring the Digital Economy</w:t>
       </w:r>
       <w:r>
         <w:rPr>
@@ -14860,7 +15456,7 @@
           <w:color w:val="000000"/>
           <w:sz w:val="26"/>
         </w:rPr>
-        <w:t>, Yale University Press, New Haven.</w:t>
+        <w:t>, Report for the G20 Digital Economy Task Force, OECD, Paris.</w:t>
       </w:r>
     </w:p>
     <w:p>
@@ -14878,7 +15474,7 @@
           <w:color w:val="000000"/>
           <w:sz w:val="26"/>
         </w:rPr>
-        <w:t xml:space="preserve">[87] Tapscott D. (1996), </w:t>
+        <w:t xml:space="preserve">[95] Pan W., Xie T., Wang Z., Ma L. (2022), “Digital economy: An innovation driver for total factor productivity”, </w:t>
       </w:r>
       <w:r>
         <w:rPr>
@@ -14888,7 +15484,7 @@
           <w:color w:val="000000"/>
           <w:sz w:val="26"/>
         </w:rPr>
-        <w:t>The Digital Economy: Promise and Peril in the Age of Networked Intelligence</w:t>
+        <w:t>Journal of Business Research</w:t>
       </w:r>
       <w:r>
         <w:rPr>
@@ -14898,7 +15494,7 @@
           <w:color w:val="000000"/>
           <w:sz w:val="26"/>
         </w:rPr>
-        <w:t>, McGraw-Hill, New York.</w:t>
+        <w:t>, 139, 303-311.</w:t>
       </w:r>
     </w:p>
     <w:p>
@@ -14916,7 +15512,7 @@
           <w:color w:val="000000"/>
           <w:sz w:val="26"/>
         </w:rPr>
-        <w:t xml:space="preserve">[88] Teece D.J. (1986), “Profiting from technological innovation: Implications for integration, collaboration, licensing and public policy”, </w:t>
+        <w:t xml:space="preserve">[96] Park W.G. (2008), “International patent protection: 1960-2005”, </w:t>
       </w:r>
       <w:r>
         <w:rPr>
@@ -14936,7 +15532,7 @@
           <w:color w:val="000000"/>
           <w:sz w:val="26"/>
         </w:rPr>
-        <w:t>, 15(6), 285-305.</w:t>
+        <w:t>, 37(4), 761-766.</w:t>
       </w:r>
     </w:p>
     <w:p>
@@ -14954,7 +15550,7 @@
           <w:color w:val="000000"/>
           <w:sz w:val="26"/>
         </w:rPr>
-        <w:t xml:space="preserve">[89] Thompson M.A., Rushing F.W. (1996), “An empirical analysis of the impact of patent protection on economic growth”, </w:t>
+        <w:t xml:space="preserve">[97] Shapiro C., Varian H.R. (1999), </w:t>
       </w:r>
       <w:r>
         <w:rPr>
@@ -14964,7 +15560,7 @@
           <w:color w:val="000000"/>
           <w:sz w:val="26"/>
         </w:rPr>
-        <w:t>Journal of Economic Development</w:t>
+        <w:t>Information Rules: A Strategic Guide to the Network Economy</w:t>
       </w:r>
       <w:r>
         <w:rPr>
@@ -14974,7 +15570,7 @@
           <w:color w:val="000000"/>
           <w:sz w:val="26"/>
         </w:rPr>
-        <w:t>, 21(2), 61-79.</w:t>
+        <w:t>, Harvard Business School Press, Boston.</w:t>
       </w:r>
     </w:p>
     <w:p>
@@ -14992,7 +15588,7 @@
           <w:color w:val="000000"/>
           <w:sz w:val="26"/>
         </w:rPr>
-        <w:t xml:space="preserve">[90] Tran Van Hai (2022), “Applying digital competence framework in exploiting information for commercialisation of intellectual property rights purposes”, </w:t>
+        <w:t xml:space="preserve">[98] Siegel D.S., Waldman D., Link A. (2003), “Assessing the impact of organizational practices on the relative productivity of university technology transfer offices: An exploratory study”, </w:t>
       </w:r>
       <w:r>
         <w:rPr>
@@ -15002,7 +15598,7 @@
           <w:color w:val="000000"/>
           <w:sz w:val="26"/>
         </w:rPr>
-        <w:t>VNU Journal of Science: Policy and Management Studies</w:t>
+        <w:t>Research Policy</w:t>
       </w:r>
       <w:r>
         <w:rPr>
@@ -15012,7 +15608,7 @@
           <w:color w:val="000000"/>
           <w:sz w:val="26"/>
         </w:rPr>
-        <w:t>, 38(3), 41-50.</w:t>
+        <w:t>, 32(1), 27-48.</w:t>
       </w:r>
     </w:p>
     <w:p>
@@ -15030,7 +15626,7 @@
           <w:color w:val="000000"/>
           <w:sz w:val="26"/>
         </w:rPr>
-        <w:t xml:space="preserve">[91] UNCTAD (2019), </w:t>
+        <w:t xml:space="preserve">[99] Sinnreich A. (2019), </w:t>
       </w:r>
       <w:r>
         <w:rPr>
@@ -15040,7 +15636,7 @@
           <w:color w:val="000000"/>
           <w:sz w:val="26"/>
         </w:rPr>
-        <w:t>Digital Economy Report 2019: Value Creation and Capture: Implications for Developing Countries</w:t>
+        <w:t>The Essential Guide to Intellectual Property</w:t>
       </w:r>
       <w:r>
         <w:rPr>
@@ -15050,7 +15646,7 @@
           <w:color w:val="000000"/>
           <w:sz w:val="26"/>
         </w:rPr>
-        <w:t>, United Nations, New York and Geneva.</w:t>
+        <w:t>, Yale University Press, New Haven.</w:t>
       </w:r>
     </w:p>
     <w:p>
@@ -15068,7 +15664,7 @@
           <w:color w:val="000000"/>
           <w:sz w:val="26"/>
         </w:rPr>
-        <w:t xml:space="preserve">[92] Williams H.L. (2013), “Intellectual property rights and innovation: Evidence from the human genome”, </w:t>
+        <w:t xml:space="preserve">[100] Tapscott D. (1996), </w:t>
       </w:r>
       <w:r>
         <w:rPr>
@@ -15078,7 +15674,7 @@
           <w:color w:val="000000"/>
           <w:sz w:val="26"/>
         </w:rPr>
-        <w:t>Journal of Political Economy</w:t>
+        <w:t>The Digital Economy: Promise and Peril in the Age of Networked Intelligence</w:t>
       </w:r>
       <w:r>
         <w:rPr>
@@ -15088,7 +15684,7 @@
           <w:color w:val="000000"/>
           <w:sz w:val="26"/>
         </w:rPr>
-        <w:t>, 121(1), 1-27.</w:t>
+        <w:t>, McGraw-Hill, New York.</w:t>
       </w:r>
     </w:p>
     <w:p>
@@ -15106,7 +15702,7 @@
           <w:color w:val="000000"/>
           <w:sz w:val="26"/>
         </w:rPr>
-        <w:t xml:space="preserve">[93] World Intellectual Property Organization (2024), </w:t>
+        <w:t xml:space="preserve">[101] Teece D.J. (1986), “Profiting from technological innovation: Implications for integration, collaboration, licensing and public policy”, </w:t>
       </w:r>
       <w:r>
         <w:rPr>
@@ -15116,7 +15712,7 @@
           <w:color w:val="000000"/>
           <w:sz w:val="26"/>
         </w:rPr>
-        <w:t>World Intellectual Property Report 2024: Making Innovation Policy Work for Development</w:t>
+        <w:t>Research Policy</w:t>
       </w:r>
       <w:r>
         <w:rPr>
@@ -15126,7 +15722,7 @@
           <w:color w:val="000000"/>
           <w:sz w:val="26"/>
         </w:rPr>
-        <w:t>, WIPO, Geneva.</w:t>
+        <w:t>, 15(6), 285-305.</w:t>
       </w:r>
     </w:p>
     <w:p>
@@ -15144,7 +15740,7 @@
           <w:color w:val="000000"/>
           <w:sz w:val="26"/>
         </w:rPr>
-        <w:t xml:space="preserve">[94] World Intellectual Property Organization (2026), </w:t>
+        <w:t xml:space="preserve">[102] Thompson M.A., Rushing F.W. (1996), “An empirical analysis of the impact of patent protection on economic growth”, </w:t>
       </w:r>
       <w:r>
         <w:rPr>
@@ -15154,7 +15750,7 @@
           <w:color w:val="000000"/>
           <w:sz w:val="26"/>
         </w:rPr>
-        <w:t>World Intellectual Property Report 2026: Technology on the Move</w:t>
+        <w:t>Journal of Economic Development</w:t>
       </w:r>
       <w:r>
         <w:rPr>
@@ -15164,7 +15760,7 @@
           <w:color w:val="000000"/>
           <w:sz w:val="26"/>
         </w:rPr>
-        <w:t>, WIPO, Geneva.</w:t>
+        <w:t>, 21(2), 61-79.</w:t>
       </w:r>
     </w:p>
     <w:p>
@@ -15182,7 +15778,7 @@
           <w:color w:val="000000"/>
           <w:sz w:val="26"/>
         </w:rPr>
-        <w:t xml:space="preserve">[95] Yang G., Maskus K.E. (2001), “Intellectual property rights and licensing: An econometric investigation”, </w:t>
+        <w:t xml:space="preserve">[103] Tran Van Hai (2022), “Applying digital competence framework in exploiting information for commercialisation of intellectual property rights purposes”, </w:t>
       </w:r>
       <w:r>
         <w:rPr>
@@ -15192,6 +15788,310 @@
           <w:color w:val="000000"/>
           <w:sz w:val="26"/>
         </w:rPr>
+        <w:t>VNU Journal of Science: Policy and Management Studies</w:t>
+      </w:r>
+      <w:r>
+        <w:rPr>
+          <w:rFonts w:ascii="Times New Roman" w:hAnsi="Times New Roman" w:eastAsia="Times New Roman" w:cs="Times New Roman"/>
+          <w:b w:val="0"/>
+          <w:i w:val="0"/>
+          <w:color w:val="000000"/>
+          <w:sz w:val="26"/>
+        </w:rPr>
+        <w:t>, 38(3), 41-50.</w:t>
+      </w:r>
+    </w:p>
+    <w:p>
+      <w:pPr>
+        <w:keepNext w:val="0"/>
+        <w:spacing w:before="0" w:after="40" w:line="312" w:lineRule="auto"/>
+        <w:ind w:left="567" w:hanging="567"/>
+        <w:jc w:val="both"/>
+      </w:pPr>
+      <w:r>
+        <w:rPr>
+          <w:rFonts w:ascii="Times New Roman" w:hAnsi="Times New Roman" w:eastAsia="Times New Roman" w:cs="Times New Roman"/>
+          <w:b w:val="0"/>
+          <w:i w:val="0"/>
+          <w:color w:val="000000"/>
+          <w:sz w:val="26"/>
+        </w:rPr>
+        <w:t xml:space="preserve">[104] Truong Nam Trung (2020), “Institutional improvements for the development of digital economy in Vietnam”, </w:t>
+      </w:r>
+      <w:r>
+        <w:rPr>
+          <w:rFonts w:ascii="Times New Roman" w:hAnsi="Times New Roman" w:eastAsia="Times New Roman" w:cs="Times New Roman"/>
+          <w:b w:val="0"/>
+          <w:i/>
+          <w:color w:val="000000"/>
+          <w:sz w:val="26"/>
+        </w:rPr>
+        <w:t>Tạp chí Công Thương</w:t>
+      </w:r>
+      <w:r>
+        <w:rPr>
+          <w:rFonts w:ascii="Times New Roman" w:hAnsi="Times New Roman" w:eastAsia="Times New Roman" w:cs="Times New Roman"/>
+          <w:b w:val="0"/>
+          <w:i w:val="0"/>
+          <w:color w:val="000000"/>
+          <w:sz w:val="26"/>
+        </w:rPr>
+        <w:t>, (25), 99-104.</w:t>
+      </w:r>
+    </w:p>
+    <w:p>
+      <w:pPr>
+        <w:keepNext w:val="0"/>
+        <w:spacing w:before="0" w:after="40" w:line="312" w:lineRule="auto"/>
+        <w:ind w:left="567" w:hanging="567"/>
+        <w:jc w:val="both"/>
+      </w:pPr>
+      <w:r>
+        <w:rPr>
+          <w:rFonts w:ascii="Times New Roman" w:hAnsi="Times New Roman" w:eastAsia="Times New Roman" w:cs="Times New Roman"/>
+          <w:b w:val="0"/>
+          <w:i w:val="0"/>
+          <w:color w:val="000000"/>
+          <w:sz w:val="26"/>
+        </w:rPr>
+        <w:t xml:space="preserve">[105] UNCTAD (2017), </w:t>
+      </w:r>
+      <w:r>
+        <w:rPr>
+          <w:rFonts w:ascii="Times New Roman" w:hAnsi="Times New Roman" w:eastAsia="Times New Roman" w:cs="Times New Roman"/>
+          <w:b w:val="0"/>
+          <w:i/>
+          <w:color w:val="000000"/>
+          <w:sz w:val="26"/>
+        </w:rPr>
+        <w:t>The 'New' Digital Economy and Development</w:t>
+      </w:r>
+      <w:r>
+        <w:rPr>
+          <w:rFonts w:ascii="Times New Roman" w:hAnsi="Times New Roman" w:eastAsia="Times New Roman" w:cs="Times New Roman"/>
+          <w:b w:val="0"/>
+          <w:i w:val="0"/>
+          <w:color w:val="000000"/>
+          <w:sz w:val="26"/>
+        </w:rPr>
+        <w:t>, UNCTAD Technical Notes on ICT for Development No. 8, UNCTAD.</w:t>
+      </w:r>
+    </w:p>
+    <w:p>
+      <w:pPr>
+        <w:keepNext w:val="0"/>
+        <w:spacing w:before="0" w:after="40" w:line="312" w:lineRule="auto"/>
+        <w:ind w:left="567" w:hanging="567"/>
+        <w:jc w:val="both"/>
+      </w:pPr>
+      <w:r>
+        <w:rPr>
+          <w:rFonts w:ascii="Times New Roman" w:hAnsi="Times New Roman" w:eastAsia="Times New Roman" w:cs="Times New Roman"/>
+          <w:b w:val="0"/>
+          <w:i w:val="0"/>
+          <w:color w:val="000000"/>
+          <w:sz w:val="26"/>
+        </w:rPr>
+        <w:t xml:space="preserve">[106] UNCTAD (2019), </w:t>
+      </w:r>
+      <w:r>
+        <w:rPr>
+          <w:rFonts w:ascii="Times New Roman" w:hAnsi="Times New Roman" w:eastAsia="Times New Roman" w:cs="Times New Roman"/>
+          <w:b w:val="0"/>
+          <w:i/>
+          <w:color w:val="000000"/>
+          <w:sz w:val="26"/>
+        </w:rPr>
+        <w:t>Digital Economy Report 2019: Value Creation and Capture: Implications for Developing Countries</w:t>
+      </w:r>
+      <w:r>
+        <w:rPr>
+          <w:rFonts w:ascii="Times New Roman" w:hAnsi="Times New Roman" w:eastAsia="Times New Roman" w:cs="Times New Roman"/>
+          <w:b w:val="0"/>
+          <w:i w:val="0"/>
+          <w:color w:val="000000"/>
+          <w:sz w:val="26"/>
+        </w:rPr>
+        <w:t>, United Nations, New York and Geneva.</w:t>
+      </w:r>
+    </w:p>
+    <w:p>
+      <w:pPr>
+        <w:keepNext w:val="0"/>
+        <w:spacing w:before="0" w:after="40" w:line="312" w:lineRule="auto"/>
+        <w:ind w:left="567" w:hanging="567"/>
+        <w:jc w:val="both"/>
+      </w:pPr>
+      <w:r>
+        <w:rPr>
+          <w:rFonts w:ascii="Times New Roman" w:hAnsi="Times New Roman" w:eastAsia="Times New Roman" w:cs="Times New Roman"/>
+          <w:b w:val="0"/>
+          <w:i w:val="0"/>
+          <w:color w:val="000000"/>
+          <w:sz w:val="26"/>
+        </w:rPr>
+        <w:t xml:space="preserve">[107] Williams H.L. (2013), “Intellectual property rights and innovation: Evidence from the human genome”, </w:t>
+      </w:r>
+      <w:r>
+        <w:rPr>
+          <w:rFonts w:ascii="Times New Roman" w:hAnsi="Times New Roman" w:eastAsia="Times New Roman" w:cs="Times New Roman"/>
+          <w:b w:val="0"/>
+          <w:i/>
+          <w:color w:val="000000"/>
+          <w:sz w:val="26"/>
+        </w:rPr>
+        <w:t>Journal of Political Economy</w:t>
+      </w:r>
+      <w:r>
+        <w:rPr>
+          <w:rFonts w:ascii="Times New Roman" w:hAnsi="Times New Roman" w:eastAsia="Times New Roman" w:cs="Times New Roman"/>
+          <w:b w:val="0"/>
+          <w:i w:val="0"/>
+          <w:color w:val="000000"/>
+          <w:sz w:val="26"/>
+        </w:rPr>
+        <w:t>, 121(1), 1-27.</w:t>
+      </w:r>
+    </w:p>
+    <w:p>
+      <w:pPr>
+        <w:keepNext w:val="0"/>
+        <w:spacing w:before="0" w:after="40" w:line="312" w:lineRule="auto"/>
+        <w:ind w:left="567" w:hanging="567"/>
+        <w:jc w:val="both"/>
+      </w:pPr>
+      <w:r>
+        <w:rPr>
+          <w:rFonts w:ascii="Times New Roman" w:hAnsi="Times New Roman" w:eastAsia="Times New Roman" w:cs="Times New Roman"/>
+          <w:b w:val="0"/>
+          <w:i w:val="0"/>
+          <w:color w:val="000000"/>
+          <w:sz w:val="26"/>
+        </w:rPr>
+        <w:t xml:space="preserve">[108] World Intellectual Property Organization (2024), </w:t>
+      </w:r>
+      <w:r>
+        <w:rPr>
+          <w:rFonts w:ascii="Times New Roman" w:hAnsi="Times New Roman" w:eastAsia="Times New Roman" w:cs="Times New Roman"/>
+          <w:b w:val="0"/>
+          <w:i/>
+          <w:color w:val="000000"/>
+          <w:sz w:val="26"/>
+        </w:rPr>
+        <w:t>World Intellectual Property Report 2024: Making Innovation Policy Work for Development</w:t>
+      </w:r>
+      <w:r>
+        <w:rPr>
+          <w:rFonts w:ascii="Times New Roman" w:hAnsi="Times New Roman" w:eastAsia="Times New Roman" w:cs="Times New Roman"/>
+          <w:b w:val="0"/>
+          <w:i w:val="0"/>
+          <w:color w:val="000000"/>
+          <w:sz w:val="26"/>
+        </w:rPr>
+        <w:t>, WIPO, Geneva.</w:t>
+      </w:r>
+    </w:p>
+    <w:p>
+      <w:pPr>
+        <w:keepNext w:val="0"/>
+        <w:spacing w:before="0" w:after="40" w:line="312" w:lineRule="auto"/>
+        <w:ind w:left="567" w:hanging="567"/>
+        <w:jc w:val="both"/>
+      </w:pPr>
+      <w:r>
+        <w:rPr>
+          <w:rFonts w:ascii="Times New Roman" w:hAnsi="Times New Roman" w:eastAsia="Times New Roman" w:cs="Times New Roman"/>
+          <w:b w:val="0"/>
+          <w:i w:val="0"/>
+          <w:color w:val="000000"/>
+          <w:sz w:val="26"/>
+        </w:rPr>
+        <w:t xml:space="preserve">[109] World Intellectual Property Organization, Luiss Business School (2024), </w:t>
+      </w:r>
+      <w:r>
+        <w:rPr>
+          <w:rFonts w:ascii="Times New Roman" w:hAnsi="Times New Roman" w:eastAsia="Times New Roman" w:cs="Times New Roman"/>
+          <w:b w:val="0"/>
+          <w:i/>
+          <w:color w:val="000000"/>
+          <w:sz w:val="26"/>
+        </w:rPr>
+        <w:t>World Intangible Investment Highlights</w:t>
+      </w:r>
+      <w:r>
+        <w:rPr>
+          <w:rFonts w:ascii="Times New Roman" w:hAnsi="Times New Roman" w:eastAsia="Times New Roman" w:cs="Times New Roman"/>
+          <w:b w:val="0"/>
+          <w:i w:val="0"/>
+          <w:color w:val="000000"/>
+          <w:sz w:val="26"/>
+        </w:rPr>
+        <w:t>, WIPO, Geneva.</w:t>
+      </w:r>
+    </w:p>
+    <w:p>
+      <w:pPr>
+        <w:keepNext w:val="0"/>
+        <w:spacing w:before="0" w:after="40" w:line="312" w:lineRule="auto"/>
+        <w:ind w:left="567" w:hanging="567"/>
+        <w:jc w:val="both"/>
+      </w:pPr>
+      <w:r>
+        <w:rPr>
+          <w:rFonts w:ascii="Times New Roman" w:hAnsi="Times New Roman" w:eastAsia="Times New Roman" w:cs="Times New Roman"/>
+          <w:b w:val="0"/>
+          <w:i w:val="0"/>
+          <w:color w:val="000000"/>
+          <w:sz w:val="26"/>
+        </w:rPr>
+        <w:t xml:space="preserve">[110] World Intellectual Property Organization (2026), </w:t>
+      </w:r>
+      <w:r>
+        <w:rPr>
+          <w:rFonts w:ascii="Times New Roman" w:hAnsi="Times New Roman" w:eastAsia="Times New Roman" w:cs="Times New Roman"/>
+          <w:b w:val="0"/>
+          <w:i/>
+          <w:color w:val="000000"/>
+          <w:sz w:val="26"/>
+        </w:rPr>
+        <w:t>World Intellectual Property Report 2026: Technology on the Move</w:t>
+      </w:r>
+      <w:r>
+        <w:rPr>
+          <w:rFonts w:ascii="Times New Roman" w:hAnsi="Times New Roman" w:eastAsia="Times New Roman" w:cs="Times New Roman"/>
+          <w:b w:val="0"/>
+          <w:i w:val="0"/>
+          <w:color w:val="000000"/>
+          <w:sz w:val="26"/>
+        </w:rPr>
+        <w:t>, WIPO, Geneva.</w:t>
+      </w:r>
+    </w:p>
+    <w:p>
+      <w:pPr>
+        <w:keepNext w:val="0"/>
+        <w:spacing w:before="0" w:after="40" w:line="312" w:lineRule="auto"/>
+        <w:ind w:left="567" w:hanging="567"/>
+        <w:jc w:val="both"/>
+      </w:pPr>
+      <w:r>
+        <w:rPr>
+          <w:rFonts w:ascii="Times New Roman" w:hAnsi="Times New Roman" w:eastAsia="Times New Roman" w:cs="Times New Roman"/>
+          <w:b w:val="0"/>
+          <w:i w:val="0"/>
+          <w:color w:val="000000"/>
+          <w:sz w:val="26"/>
+        </w:rPr>
+        <w:t xml:space="preserve">[111] Yang G., Maskus K.E. (2001), “Intellectual property rights and licensing: An econometric investigation”, </w:t>
+      </w:r>
+      <w:r>
+        <w:rPr>
+          <w:rFonts w:ascii="Times New Roman" w:hAnsi="Times New Roman" w:eastAsia="Times New Roman" w:cs="Times New Roman"/>
+          <w:b w:val="0"/>
+          <w:i/>
+          <w:color w:val="000000"/>
+          <w:sz w:val="26"/>
+        </w:rPr>
         <w:t>Weltwirtschaftliches Archiv</w:t>
       </w:r>
       <w:r>
@@ -15203,6 +16103,82 @@
           <w:sz w:val="26"/>
         </w:rPr>
         <w:t>, 137(1), 58-79.</w:t>
+      </w:r>
+    </w:p>
+    <w:p>
+      <w:pPr>
+        <w:keepNext w:val="0"/>
+        <w:spacing w:before="0" w:after="40" w:line="312" w:lineRule="auto"/>
+        <w:ind w:left="567" w:hanging="567"/>
+        <w:jc w:val="both"/>
+      </w:pPr>
+      <w:r>
+        <w:rPr>
+          <w:rFonts w:ascii="Times New Roman" w:hAnsi="Times New Roman" w:eastAsia="Times New Roman" w:cs="Times New Roman"/>
+          <w:b w:val="0"/>
+          <w:i w:val="0"/>
+          <w:color w:val="000000"/>
+          <w:sz w:val="26"/>
+        </w:rPr>
+        <w:t xml:space="preserve">[112] Yuan B., Li W. (2025), “Legal infrastructures for firm innovation: Effects of intellectual property protection in the era of digital economy”, </w:t>
+      </w:r>
+      <w:r>
+        <w:rPr>
+          <w:rFonts w:ascii="Times New Roman" w:hAnsi="Times New Roman" w:eastAsia="Times New Roman" w:cs="Times New Roman"/>
+          <w:b w:val="0"/>
+          <w:i/>
+          <w:color w:val="000000"/>
+          <w:sz w:val="26"/>
+        </w:rPr>
+        <w:t>Finance Research Letters</w:t>
+      </w:r>
+      <w:r>
+        <w:rPr>
+          <w:rFonts w:ascii="Times New Roman" w:hAnsi="Times New Roman" w:eastAsia="Times New Roman" w:cs="Times New Roman"/>
+          <w:b w:val="0"/>
+          <w:i w:val="0"/>
+          <w:color w:val="000000"/>
+          <w:sz w:val="26"/>
+        </w:rPr>
+        <w:t>, 71, 106343.</w:t>
+      </w:r>
+    </w:p>
+    <w:p>
+      <w:pPr>
+        <w:keepNext w:val="0"/>
+        <w:spacing w:before="0" w:after="40" w:line="312" w:lineRule="auto"/>
+        <w:ind w:left="567" w:hanging="567"/>
+        <w:jc w:val="both"/>
+      </w:pPr>
+      <w:r>
+        <w:rPr>
+          <w:rFonts w:ascii="Times New Roman" w:hAnsi="Times New Roman" w:eastAsia="Times New Roman" w:cs="Times New Roman"/>
+          <w:b w:val="0"/>
+          <w:i w:val="0"/>
+          <w:color w:val="000000"/>
+          <w:sz w:val="26"/>
+        </w:rPr>
+        <w:t xml:space="preserve">[113] Zheng P., Li Z., Zhuang Z. (2023), “The impact of judicial protection of intellectual property on digital innovation: Evidence from China”, </w:t>
+      </w:r>
+      <w:r>
+        <w:rPr>
+          <w:rFonts w:ascii="Times New Roman" w:hAnsi="Times New Roman" w:eastAsia="Times New Roman" w:cs="Times New Roman"/>
+          <w:b w:val="0"/>
+          <w:i/>
+          <w:color w:val="000000"/>
+          <w:sz w:val="26"/>
+        </w:rPr>
+        <w:t>Finance Research Letters</w:t>
+      </w:r>
+      <w:r>
+        <w:rPr>
+          <w:rFonts w:ascii="Times New Roman" w:hAnsi="Times New Roman" w:eastAsia="Times New Roman" w:cs="Times New Roman"/>
+          <w:b w:val="0"/>
+          <w:i w:val="0"/>
+          <w:color w:val="000000"/>
+          <w:sz w:val="26"/>
+        </w:rPr>
+        <w:t>, 58, 104257.</w:t>
       </w:r>
     </w:p>
     <w:sectPr>

</xml_diff>